<commit_message>
Kiểm tra và hiệu chỉnh tài liệu tham khảo của tiểu luận
- Đối chiếu 23 tài liệu với PubMed/PMC, Scite, Wiley và thư mục của
  NXB Chính trị quốc gia Sự thật; tất cả đều tồn tại.
- Sửa nội dung trích [5]: xã luận ACS "yêu cầu" (không phải "khuyến
  nghị") chứng minh hoạt tính bằng ít nhất hai phép thử khác nhau.
- Thêm nguồn [7] cho câu về catechol/quinon/enon; bổ sung [5] cho luận
  điểm về SAR và cho dòng nguồn của Bảng 3.1.
- Chuẩn hóa câu trích Lênin theo giáo trình tiếng Việt; thêm DOI cho 19
  tài liệu tiếng Anh; ghi "Merz K.M. Jr." theo PubMed.
- Thêm KIEM_TRA_TLTK.md ghi PMID/DOI và kết quả đối chiếu từng tài liệu.

Co-Authored-By: Claude Opus 5.5 <noreply@anthropic.com>
Claude-Session: https://claude.ai/code/session_015pusVMnFFqyS3YA3niqgir
</commit_message>
<xml_diff>
--- a/tieu-luan/TieuLuan_TrietHoc_NguyenDoanDiemNgoc_25C56077.docx
+++ b/tieu-luan/TieuLuan_TrietHoc_NguyenDoanDiemNgoc_25C56077.docx
@@ -2228,7 +2228,7 @@
         <w:rPr>
           <w:rFonts w:ascii="Times New Roman" w:hAnsi="Times New Roman" w:eastAsia="Times New Roman" w:cs="Times New Roman"/>
         </w:rPr>
-        <w:t>Bản chất và hiện tượng thống nhất với nhau: bản chất bao giờ cũng bộc lộ ra thông qua hiện tượng, còn hiện tượng bao giờ cũng là sự biểu hiện của một bản chất nhất định. Không có bản chất thuần túy tồn tại tách rời hiện tượng, cũng không có hiện tượng hoàn toàn không biểu hiện bản chất. V.I. Lênin viết: “Bản chất hiện ra. Hiện tượng là có tính bản chất” [3]. Sự thống nhất còn thể hiện ở chỗ bản chất và hiện tượng về căn bản phù hợp với nhau: bản chất nào thì hiện tượng ấy; khi bản chất thay đổi thì hiện tượng biểu hiện nó cũng thay đổi theo; khi bản chất mất đi thì hiện tượng tương ứng cũng mất đi [2]. Chính sự thống nhất này là cơ sở khách quan cho khả năng nhận thức bản chất thông qua việc nghiên cứu hiện tượng.</w:t>
+        <w:t>Bản chất và hiện tượng thống nhất với nhau: bản chất bao giờ cũng bộc lộ ra thông qua hiện tượng, còn hiện tượng bao giờ cũng là sự biểu hiện của một bản chất nhất định. Không có bản chất thuần túy tồn tại tách rời hiện tượng, cũng không có hiện tượng hoàn toàn không biểu hiện bản chất. V.I. Lênin viết: “Bản chất hiện ra, hiện tượng là có tính bản chất” [3]. Sự thống nhất còn thể hiện ở chỗ bản chất và hiện tượng về căn bản phù hợp với nhau: bản chất nào thì hiện tượng ấy; khi bản chất thay đổi thì hiện tượng biểu hiện nó cũng thay đổi theo; khi bản chất mất đi thì hiện tượng tương ứng cũng mất đi [2]. Chính sự thống nhất này là cơ sở khách quan cho khả năng nhận thức bản chất thông qua việc nghiên cứu hiện tượng.</w:t>
       </w:r>
     </w:p>
     <w:p>
@@ -2553,7 +2553,7 @@
         <w:rPr>
           <w:rFonts w:ascii="Times New Roman" w:hAnsi="Times New Roman" w:eastAsia="Times New Roman" w:cs="Times New Roman"/>
         </w:rPr>
-        <w:t>Baell và Holloway mô tả các nhóm cấu trúc thường xuyên cho kết quả dương tính trong nhiều phép thử sinh hóa khác nhau và gọi các hợp chất mang chúng là hợp chất gây nhiễu đa phép thử (PAINS) [7]. Những hợp chất này tạo tín hiệu dương tính thông qua phản ứng cộng hóa trị với protein, chu trình oxy hóa – khử, tạo phức với ion kim loại, hấp thụ ánh sáng hoặc phát huỳnh quang, thay vì thông qua gắn kết đặc hiệu với đích [8]. Nhiều khung cấu trúc thuộc nhóm này, như catechol, quinon và các hệ enon liên hợp, lại phổ biến trong hợp chất thiên nhiên.</w:t>
+        <w:t>Baell và Holloway mô tả các nhóm cấu trúc thường xuyên cho kết quả dương tính trong nhiều phép thử sinh hóa khác nhau và gọi các hợp chất mang chúng là hợp chất gây nhiễu đa phép thử (PAINS) [7]. Những hợp chất này tạo tín hiệu dương tính thông qua phản ứng cộng hóa trị với protein, chu trình oxy hóa – khử, tạo phức với ion kim loại, hấp thụ ánh sáng hoặc phát huỳnh quang, thay vì thông qua gắn kết đặc hiệu với đích [8]. Một số nhóm cấu trúc trong danh mục này, như catechol, quinon và một số hệ enon liên hợp [7], lại phổ biến trong hợp chất thiên nhiên.</w:t>
       </w:r>
     </w:p>
     <w:p>
@@ -2698,7 +2698,7 @@
         <w:rPr>
           <w:rFonts w:ascii="Times New Roman" w:hAnsi="Times New Roman" w:eastAsia="Times New Roman" w:cs="Times New Roman"/>
         </w:rPr>
-        <w:t>, với bản chất tác dụng của hợp chất. Thứ hai là không phân biệt hiện tượng với giả tượng do thiếu các thí nghiệm đối chứng cần thiết. Thứ ba là đồng nhất mô hình với đối tượng: coi enzyme nấm men là enzyme đích ở người, hoặc coi điểm số docking là ái lực gắn kết. Cả ba dạng sai lầm đều vi phạm yêu cầu không dừng lại ở hiện tượng đã nêu ở mục 1.4. Áp lực công bố kết quả dương tính làm các sai lầm này khó được phát hiện; biên tập viên nhiều tạp chí của Hiệp hội Hóa học Hoa Kỳ đã ra xã luận chung về vấn đề này, khuyến nghị tác giả cung cấp bằng chứng thực nghiệm phù hợp khi báo cáo hoạt tính [5].</w:t>
+        <w:t>, với bản chất tác dụng của hợp chất. Thứ hai là không phân biệt hiện tượng với giả tượng do thiếu các thí nghiệm đối chứng cần thiết. Thứ ba là đồng nhất mô hình với đối tượng: coi enzyme nấm men là enzyme đích ở người, hoặc coi điểm số docking là ái lực gắn kết. Cả ba dạng sai lầm đều vi phạm yêu cầu không dừng lại ở hiện tượng đã nêu ở mục 1.4. Để hạn chế chúng, biên tập viên nhiều tạp chí của Hiệp hội Hóa học Hoa Kỳ đã ra xã luận chung, yêu cầu tác giả phân tích khả năng gây nhiễu và, với hợp chất có nguy cơ này, chứng minh hoạt tính bằng ít nhất hai phép thử khác nhau [5].</w:t>
       </w:r>
     </w:p>
     <w:p>
@@ -2710,7 +2710,7 @@
         <w:rPr>
           <w:rFonts w:ascii="Times New Roman" w:hAnsi="Times New Roman" w:eastAsia="Times New Roman" w:cs="Times New Roman"/>
         </w:rPr>
-        <w:t>Hệ quả thể hiện ở nhiều cấp độ. Ở cấp độ công trình, nguồn lực bị sử dụng cho những ứng viên không có tác dụng thực. Ở cấp độ tài liệu khoa học, tỷ lệ hợp chất có đặc điểm giống chất kết tập trong tài liệu hóa dược đã tăng khoảng 9 lần kể từ năm 1995 [15]. Ở cấp độ phát triển thuốc, khoảng 90% ứng viên bước vào thử nghiệm lâm sàng không thành công, chủ yếu do thiếu hiệu quả lâm sàng (40–50%), độc tính không kiểm soát được (khoảng 30%) và tính chất giống thuốc kém (10–15%) [22]. Tỷ lệ thiếu hiệu quả cao cho thấy khoảng cách đáng kể giữa những gì đo được ở giai đoạn tiền lâm sàng và tác dụng thực trên người.</w:t>
+        <w:t>Hệ quả là nguồn lực bị dùng cho những ứng viên không có tác dụng thực, và tỷ lệ hợp chất có đặc điểm giống chất kết tập trong tài liệu hóa dược đã tăng khoảng 9 lần kể từ năm 1995 [15]. Ở cấp độ phát triển thuốc, khoảng 90% ứng viên bước vào thử nghiệm lâm sàng không thành công, chủ yếu do thiếu hiệu quả lâm sàng (40–50%), độc tính không kiểm soát được (khoảng 30%) và tính chất giống thuốc kém (10–15%) [22], cho thấy khoảng cách giữa kết quả tiền lâm sàng và tác dụng thực trên người.</w:t>
       </w:r>
     </w:p>
     <w:p>
@@ -3003,7 +3003,7 @@
         <w:rPr>
           <w:rFonts w:ascii="Times New Roman" w:hAnsi="Times New Roman" w:eastAsia="Times New Roman" w:cs="Times New Roman"/>
         </w:rPr>
-        <w:t>Một phương tiện quan trọng để tiếp cận bản chất là quan hệ cấu trúc – hoạt tính (SAR). Khi một dãy hợp chất tương tự, thu được từ phân lập hoặc bán tổng hợp, có hoạt tính biến đổi một cách có thể giải thích theo những thay đổi cấu trúc xác định, đó là bằng chứng cho một tương tác đặc hiệu với vị trí gắn kết. Ngược lại, các hợp chất gây nhiễu thường có SAR “phẳng” hoặc không nhất quán [17], [21]. Ở đây, cái chung của một dãy hiện tượng (xu hướng SAR) cho phép nhận ra bản chất mà từng hiện tượng riêng lẻ (một giá trị IC</w:t>
+        <w:t>Một phương tiện quan trọng để tiếp cận bản chất là quan hệ cấu trúc – hoạt tính (SAR). Khi một dãy hợp chất tương tự, thu được từ phân lập hoặc bán tổng hợp, có hoạt tính biến đổi một cách có thể giải thích theo những thay đổi cấu trúc xác định, đó là bằng chứng cho một tương tác đặc hiệu với vị trí gắn kết. Ngược lại, các hợp chất gây nhiễu thường có SAR “phẳng” hoặc không nhất quán [17], [21]; SAR chặt chẽ được xem là tiêu chí quan trọng nhất để phân biệt hợp chất gây nhiễu với phối tử thực [5]. Ở đây, cái chung của một dãy hiện tượng (xu hướng SAR) cho phép nhận ra bản chất mà từng hiện tượng riêng lẻ (một giá trị IC</w:t>
       </w:r>
       <w:r>
         <w:rPr>
@@ -3770,7 +3770,7 @@
           <w:rFonts w:ascii="Times New Roman" w:hAnsi="Times New Roman" w:eastAsia="Times New Roman" w:cs="Times New Roman"/>
           <w:i/>
         </w:rPr>
-        <w:t>Nguồn: Học viên tổng hợp và đề xuất trên cơ sở [10], [11], [12], [13], [15], [16], [17], [20], [21], [23].</w:t>
+        <w:t>Nguồn: Học viên tổng hợp và đề xuất trên cơ sở [5], [10], [11], [12], [13], [15], [16], [17], [20], [21], [23].</w:t>
       </w:r>
     </w:p>
     <w:p>
@@ -4065,7 +4065,7 @@
         </w:rPr>
         <w:t>[5]</w:t>
         <w:tab/>
-        <w:t xml:space="preserve">Aldrich C., Bertozzi C., Georg G.I., Kiessling L., Lindsley C., Liotta D., Merz K.M., Schepartz A., Wang S. (2017), “The ecstasy and agony of assay interference compounds”, </w:t>
+        <w:t xml:space="preserve">Aldrich C., Bertozzi C., Georg G.I., Kiessling L., Lindsley C., Liotta D., Merz K.M. Jr., Schepartz A., Wang S. (2017), “The ecstasy and agony of assay interference compounds”, </w:t>
       </w:r>
       <w:r>
         <w:rPr>
@@ -4078,7 +4078,7 @@
         <w:rPr>
           <w:rFonts w:ascii="Times New Roman" w:hAnsi="Times New Roman" w:eastAsia="Times New Roman" w:cs="Times New Roman"/>
         </w:rPr>
-        <w:t>, 60(6), pp. 2165–2168.</w:t>
+        <w:t>, 60(6), pp. 2165–2168. DOI: 10.1021/acs.jmedchem.7b00229.</w:t>
       </w:r>
     </w:p>
     <w:p>
@@ -4109,7 +4109,7 @@
         <w:rPr>
           <w:rFonts w:ascii="Times New Roman" w:hAnsi="Times New Roman" w:eastAsia="Times New Roman" w:cs="Times New Roman"/>
         </w:rPr>
-        <w:t>, 20(3), pp. 200–216.</w:t>
+        <w:t>, 20(3), pp. 200–216. DOI: 10.1038/s41573-020-00114-z.</w:t>
       </w:r>
     </w:p>
     <w:p>
@@ -4140,7 +4140,7 @@
         <w:rPr>
           <w:rFonts w:ascii="Times New Roman" w:hAnsi="Times New Roman" w:eastAsia="Times New Roman" w:cs="Times New Roman"/>
         </w:rPr>
-        <w:t>, 53(7), pp. 2719–2740.</w:t>
+        <w:t>, 53(7), pp. 2719–2740. DOI: 10.1021/jm901137j.</w:t>
       </w:r>
     </w:p>
     <w:p>
@@ -4171,7 +4171,7 @@
         <w:rPr>
           <w:rFonts w:ascii="Times New Roman" w:hAnsi="Times New Roman" w:eastAsia="Times New Roman" w:cs="Times New Roman"/>
         </w:rPr>
-        <w:t>, 513(7519), pp. 481–483.</w:t>
+        <w:t>, 513(7519), pp. 481–483. DOI: 10.1038/513481a.</w:t>
       </w:r>
     </w:p>
     <w:p>
@@ -4202,7 +4202,7 @@
         <w:rPr>
           <w:rFonts w:ascii="Times New Roman" w:hAnsi="Times New Roman" w:eastAsia="Times New Roman" w:cs="Times New Roman"/>
         </w:rPr>
-        <w:t>, 59(5), pp. 1671–1690.</w:t>
+        <w:t>, 59(5), pp. 1671–1690. DOI: 10.1021/acs.jmedchem.5b01009.</w:t>
       </w:r>
     </w:p>
     <w:p>
@@ -4233,7 +4233,7 @@
         <w:rPr>
           <w:rFonts w:ascii="Times New Roman" w:hAnsi="Times New Roman" w:eastAsia="Times New Roman" w:cs="Times New Roman"/>
         </w:rPr>
-        <w:t>, 57(3), pp. 417–427.</w:t>
+        <w:t>, 57(3), pp. 417–427. DOI: 10.1021/acs.jcim.6b00465.</w:t>
       </w:r>
     </w:p>
     <w:p>
@@ -4290,7 +4290,7 @@
         <w:rPr>
           <w:rFonts w:ascii="Times New Roman" w:hAnsi="Times New Roman" w:eastAsia="Times New Roman" w:cs="Times New Roman"/>
         </w:rPr>
-        <w:t>, 22(23), pp. 3099–3108.</w:t>
+        <w:t>, 22(23), pp. 3099–3108. DOI: 10.1016/0006-2952(73)90196-2.</w:t>
       </w:r>
     </w:p>
     <w:p>
@@ -4321,7 +4321,7 @@
         <w:rPr>
           <w:rFonts w:ascii="Times New Roman" w:hAnsi="Times New Roman" w:eastAsia="Times New Roman" w:cs="Times New Roman"/>
         </w:rPr>
-        <w:t>, 2nd ed., John Wiley &amp; Sons, Hoboken, NJ.</w:t>
+        <w:t>, 2nd ed., John Wiley &amp; Sons, Hoboken, NJ. DOI: 10.1002/9781118540398.</w:t>
       </w:r>
     </w:p>
     <w:p>
@@ -4352,7 +4352,7 @@
         <w:rPr>
           <w:rFonts w:ascii="Times New Roman" w:hAnsi="Times New Roman" w:eastAsia="Times New Roman" w:cs="Times New Roman"/>
         </w:rPr>
-        <w:t>, 1(2), pp. 550–553.</w:t>
+        <w:t>, 1(2), pp. 550–553. DOI: 10.1038/nprot.2006.77.</w:t>
       </w:r>
     </w:p>
     <w:p>
@@ -4383,7 +4383,7 @@
         <w:rPr>
           <w:rFonts w:ascii="Times New Roman" w:hAnsi="Times New Roman" w:eastAsia="Times New Roman" w:cs="Times New Roman"/>
         </w:rPr>
-        <w:t>, 50(10), pp. 2385–2390.</w:t>
+        <w:t>, 50(10), pp. 2385–2390. DOI: 10.1021/jm061317y.</w:t>
       </w:r>
     </w:p>
     <w:p>
@@ -4414,7 +4414,7 @@
         <w:rPr>
           <w:rFonts w:ascii="Times New Roman" w:hAnsi="Times New Roman" w:eastAsia="Times New Roman" w:cs="Times New Roman"/>
         </w:rPr>
-        <w:t>, 58(17), pp. 7076–7087.</w:t>
+        <w:t>, 58(17), pp. 7076–7087. DOI: 10.1021/acs.jmedchem.5b01105.</w:t>
       </w:r>
     </w:p>
     <w:p>
@@ -4445,7 +4445,7 @@
         <w:rPr>
           <w:rFonts w:ascii="Times New Roman" w:hAnsi="Times New Roman" w:eastAsia="Times New Roman" w:cs="Times New Roman"/>
         </w:rPr>
-        <w:t>, 9(9), pp. 2100–2122.</w:t>
+        <w:t>, 9(9), pp. 2100–2122. DOI: 10.1038/nprot.2014.138.</w:t>
       </w:r>
     </w:p>
     <w:p>
@@ -4476,7 +4476,7 @@
         <w:rPr>
           <w:rFonts w:ascii="Times New Roman" w:hAnsi="Times New Roman" w:eastAsia="Times New Roman" w:cs="Times New Roman"/>
         </w:rPr>
-        <w:t>, 45(8), pp. 1712–1722.</w:t>
+        <w:t>, 45(8), pp. 1712–1722. DOI: 10.1021/jm010533y.</w:t>
       </w:r>
     </w:p>
     <w:p>
@@ -4507,7 +4507,7 @@
         <w:rPr>
           <w:rFonts w:ascii="Times New Roman" w:hAnsi="Times New Roman" w:eastAsia="Times New Roman" w:cs="Times New Roman"/>
         </w:rPr>
-        <w:t>, 60(5), pp. 1620–1637.</w:t>
+        <w:t>, 60(5), pp. 1620–1637. DOI: 10.1021/acs.jmedchem.6b00975.</w:t>
       </w:r>
     </w:p>
     <w:p>
@@ -4538,7 +4538,7 @@
         <w:rPr>
           <w:rFonts w:ascii="Times New Roman" w:hAnsi="Times New Roman" w:eastAsia="Times New Roman" w:cs="Times New Roman"/>
         </w:rPr>
-        <w:t>, 83(3), pp. 770–803.</w:t>
+        <w:t>, 83(3), pp. 770–803. DOI: 10.1021/acs.jnatprod.9b01285.</w:t>
       </w:r>
     </w:p>
     <w:p>
@@ -4569,7 +4569,7 @@
         <w:rPr>
           <w:rFonts w:ascii="Times New Roman" w:hAnsi="Times New Roman" w:eastAsia="Times New Roman" w:cs="Times New Roman"/>
         </w:rPr>
-        <w:t>, 47(2), pp. 550–553.</w:t>
+        <w:t>, 47(2), pp. 550–553. DOI: 10.1021/jf980788t.</w:t>
       </w:r>
     </w:p>
     <w:p>
@@ -4600,7 +4600,7 @@
         <w:rPr>
           <w:rFonts w:ascii="Times New Roman" w:hAnsi="Times New Roman" w:eastAsia="Times New Roman" w:cs="Times New Roman"/>
         </w:rPr>
-        <w:t>, 11(13–14), pp. 607–615.</w:t>
+        <w:t>, 11(13–14), pp. 607–615. DOI: 10.1016/j.drudis.2006.05.014.</w:t>
       </w:r>
     </w:p>
     <w:p>
@@ -4631,7 +4631,7 @@
         <w:rPr>
           <w:rFonts w:ascii="Times New Roman" w:hAnsi="Times New Roman" w:eastAsia="Times New Roman" w:cs="Times New Roman"/>
         </w:rPr>
-        <w:t>, 12(7), pp. 3049–3062.</w:t>
+        <w:t>, 12(7), pp. 3049–3062. DOI: 10.1016/j.apsb.2022.02.002.</w:t>
       </w:r>
     </w:p>
     <w:p>
@@ -4662,7 +4662,7 @@
         <w:rPr>
           <w:rFonts w:ascii="Times New Roman" w:hAnsi="Times New Roman" w:eastAsia="Times New Roman" w:cs="Times New Roman"/>
         </w:rPr>
-        <w:t>, 49(20), pp. 5912–5931.</w:t>
+        <w:t>, 49(20), pp. 5912–5931. DOI: 10.1021/jm050362n.</w:t>
       </w:r>
     </w:p>
     <w:sectPr>

</xml_diff>

<commit_message>
Soát lại toàn bộ tài liệu tham khảo (46 mục)
- So sánh tự động 35 bài PubMed (tác giả đầu, năm, tập/số, trang, DOI):
  35/35 khớp; 6 tài liệu ngoài PubMed đối chiếu với nhà xuất bản.
- Xác nhận các trích dẫn kinh điển qua bản tiếng Anh (Lenin CW 14, 38;
  Capital III ch. 48) và năm in Toàn tập Mác – Ăngghen t.25 phần II (1994).
- Sửa: ghi đầy đủ tên tạp chí của Koshland, Moseley, Vargesson; làm rõ dòng
  nguồn của Bảng 3.2.
- Cập nhật KIEM_TRA_TLTK.md.

Co-Authored-By: Claude Opus 5.5 <noreply@anthropic.com>
Claude-Session: https://claude.ai/code/session_015pusVMnFFqyS3YA3niqgir
</commit_message>
<xml_diff>
--- a/tieu-luan/TieuLuan_TrietHoc_NguyenDoanDiemNgoc_25C56077.docx
+++ b/tieu-luan/TieuLuan_TrietHoc_NguyenDoanDiemNgoc_25C56077.docx
@@ -7862,7 +7862,7 @@
           <w:rFonts w:ascii="Times New Roman" w:hAnsi="Times New Roman" w:eastAsia="Times New Roman" w:cs="Times New Roman"/>
           <w:i/>
         </w:rPr>
-        <w:t>Nguồn: Học viên tổng hợp từ [9], [19], [32], [33], [37].</w:t>
+        <w:t>Nguồn: Học viên tổng hợp; nguyên lý phép thử acetylcholinesterase theo [19]; sự khác biệt giữa enzyme mô hình và enzyme đích theo [32], [37]; nguy cơ kết tập và gây nhiễu theo [9], [33].</w:t>
       </w:r>
     </w:p>
     <w:p>
@@ -11513,7 +11513,7 @@
           <w:rFonts w:ascii="Times New Roman" w:hAnsi="Times New Roman" w:eastAsia="Times New Roman" w:cs="Times New Roman"/>
           <w:i/>
         </w:rPr>
-        <w:t>Proceedings of the National Academy of Sciences of the USA</w:t>
+        <w:t>Proceedings of the National Academy of Sciences of the United States of America</w:t>
       </w:r>
       <w:r>
         <w:rPr>
@@ -11668,7 +11668,7 @@
           <w:rFonts w:ascii="Times New Roman" w:hAnsi="Times New Roman" w:eastAsia="Times New Roman" w:cs="Times New Roman"/>
           <w:i/>
         </w:rPr>
-        <w:t>Philosophical Magazine</w:t>
+        <w:t>The London, Edinburgh, and Dublin Philosophical Magazine and Journal of Science</w:t>
       </w:r>
       <w:r>
         <w:rPr>
@@ -11960,7 +11960,7 @@
           <w:rFonts w:ascii="Times New Roman" w:hAnsi="Times New Roman" w:eastAsia="Times New Roman" w:cs="Times New Roman"/>
           <w:i/>
         </w:rPr>
-        <w:t>Birth Defects Research Part C: Embryo Today</w:t>
+        <w:t>Birth Defects Research Part C: Embryo Today: Reviews</w:t>
       </w:r>
       <w:r>
         <w:rPr>

</xml_diff>

<commit_message>
Rà soát văn phong triết học toàn bài
- Chuẩn hóa thuật ngữ theo giáo trình: quan điểm toàn diện / lịch sử – cụ thể /
  phát triển; bệnh kinh nghiệm / bệnh giáo điều; suy lý; tính chất thứ nhất /
  thứ hai (Lốccơ).
- Hiệu chỉnh luận điểm: phủ định biện chứng và phủ định của phủ định, quy luật
  lượng – chất, giả tượng, chân lý tuyệt đối (Lênin, t.18), thống nhất lôgíc –
  lịch sử, cái chung – cái riêng, bất khả tri luận (Hium, Cantơ).
- Loại bỏ ẩn dụ và từ ngữ cảm xúc; giảm lặp "Xét dưới góc độ triết học".
- Thêm đoạn mở chương cho Chương 1 và 3; viết lại Tiểu kết Chương 3.
- Bỏ ACE, AChE, CRBN khỏi danh mục chữ viết tắt (không dùng trong văn bản).
- Giữ phần thân Mở đầu – Kết luận đúng 40 trang; thêm KIEM_TRA_VAN_PHONG.md.

Co-Authored-By: Claude Opus 5.5 <noreply@anthropic.com>
Claude-Session: https://claude.ai/code/session_015pusVMnFFqyS3YA3niqgir
</commit_message>
<xml_diff>
--- a/tieu-luan/TieuLuan_TrietHoc_NguyenDoanDiemNgoc_25C56077.docx
+++ b/tieu-luan/TieuLuan_TrietHoc_NguyenDoanDiemNgoc_25C56077.docx
@@ -763,7 +763,7 @@
           <w:sz w:val="26"/>
         </w:rPr>
         <w:tab/>
-        <w:t>5</w:t>
+        <w:t>6</w:t>
       </w:r>
     </w:p>
     <w:p>
@@ -875,7 +875,7 @@
           <w:sz w:val="26"/>
         </w:rPr>
         <w:tab/>
-        <w:t>7</w:t>
+        <w:t>8</w:t>
       </w:r>
     </w:p>
     <w:p>
@@ -903,7 +903,7 @@
           <w:sz w:val="26"/>
         </w:rPr>
         <w:tab/>
-        <w:t>7</w:t>
+        <w:t>8</w:t>
       </w:r>
     </w:p>
     <w:p>
@@ -959,7 +959,7 @@
           <w:sz w:val="26"/>
         </w:rPr>
         <w:tab/>
-        <w:t>8</w:t>
+        <w:t>9</w:t>
       </w:r>
     </w:p>
     <w:p>
@@ -1071,7 +1071,7 @@
           <w:sz w:val="26"/>
         </w:rPr>
         <w:tab/>
-        <w:t>9</w:t>
+        <w:t>10</w:t>
       </w:r>
     </w:p>
     <w:p>
@@ -1239,7 +1239,7 @@
           <w:sz w:val="26"/>
         </w:rPr>
         <w:tab/>
-        <w:t>12</w:t>
+        <w:t>13</w:t>
       </w:r>
     </w:p>
     <w:p>
@@ -1435,7 +1435,7 @@
           <w:sz w:val="26"/>
         </w:rPr>
         <w:tab/>
-        <w:t>17</w:t>
+        <w:t>18</w:t>
       </w:r>
     </w:p>
     <w:p>
@@ -1771,7 +1771,7 @@
           <w:sz w:val="26"/>
         </w:rPr>
         <w:tab/>
-        <w:t>26</w:t>
+        <w:t>25</w:t>
       </w:r>
     </w:p>
     <w:p>
@@ -2135,7 +2135,7 @@
           <w:sz w:val="26"/>
         </w:rPr>
         <w:tab/>
-        <w:t>32</w:t>
+        <w:t>33</w:t>
       </w:r>
     </w:p>
     <w:p>
@@ -2336,7 +2336,7 @@
           <w:b/>
           <w:sz w:val="26"/>
         </w:rPr>
-        <w:t>ACE</w:t>
+        <w:t>CETSA</w:t>
       </w:r>
       <w:r>
         <w:rPr>
@@ -2344,7 +2344,7 @@
           <w:sz w:val="26"/>
         </w:rPr>
         <w:tab/>
-        <w:t>Enzyme chuyển angiotensin (Angiotensin-converting enzyme)</w:t>
+        <w:t>Phép thử dịch chuyển nhiệt trong tế bào (Cellular thermal shift assay)</w:t>
       </w:r>
     </w:p>
     <w:p>
@@ -2362,7 +2362,7 @@
           <w:b/>
           <w:sz w:val="26"/>
         </w:rPr>
-        <w:t>AChE</w:t>
+        <w:t>DLS</w:t>
       </w:r>
       <w:r>
         <w:rPr>
@@ -2370,7 +2370,7 @@
           <w:sz w:val="26"/>
         </w:rPr>
         <w:tab/>
-        <w:t>Acetylcholinesterase</w:t>
+        <w:t>Tán xạ ánh sáng động (Dynamic light scattering)</w:t>
       </w:r>
     </w:p>
     <w:p>
@@ -2388,7 +2388,7 @@
           <w:b/>
           <w:sz w:val="26"/>
         </w:rPr>
-        <w:t>CETSA</w:t>
+        <w:t>DMSO</w:t>
       </w:r>
       <w:r>
         <w:rPr>
@@ -2396,7 +2396,7 @@
           <w:sz w:val="26"/>
         </w:rPr>
         <w:tab/>
-        <w:t>Phép thử dịch chuyển nhiệt trong tế bào (Cellular thermal shift assay)</w:t>
+        <w:t>Dimethyl sulfoxid</w:t>
       </w:r>
     </w:p>
     <w:p>
@@ -2414,7 +2414,7 @@
           <w:b/>
           <w:sz w:val="26"/>
         </w:rPr>
-        <w:t>CRBN</w:t>
+        <w:t>DTNB</w:t>
       </w:r>
       <w:r>
         <w:rPr>
@@ -2422,7 +2422,7 @@
           <w:sz w:val="26"/>
         </w:rPr>
         <w:tab/>
-        <w:t>Cereblon</w:t>
+        <w:t>Acid 5,5'-dithiobis(2-nitrobenzoic) (thuốc thử Ellman)</w:t>
       </w:r>
     </w:p>
     <w:p>
@@ -2440,7 +2440,7 @@
           <w:b/>
           <w:sz w:val="26"/>
         </w:rPr>
-        <w:t>DLS</w:t>
+        <w:t>FDA</w:t>
       </w:r>
       <w:r>
         <w:rPr>
@@ -2448,7 +2448,7 @@
           <w:sz w:val="26"/>
         </w:rPr>
         <w:tab/>
-        <w:t>Tán xạ ánh sáng động (Dynamic light scattering)</w:t>
+        <w:t>Cơ quan Quản lý Thực phẩm và Dược phẩm Hoa Kỳ (Food and Drug Administration)</w:t>
       </w:r>
     </w:p>
     <w:p>
@@ -2466,7 +2466,7 @@
           <w:b/>
           <w:sz w:val="26"/>
         </w:rPr>
-        <w:t>DMSO</w:t>
+        <w:t>HMG-CoA</w:t>
       </w:r>
       <w:r>
         <w:rPr>
@@ -2474,7 +2474,7 @@
           <w:sz w:val="26"/>
         </w:rPr>
         <w:tab/>
-        <w:t>Dimethyl sulfoxid</w:t>
+        <w:t>3-Hydroxy-3-methylglutaryl-coenzyme A</w:t>
       </w:r>
     </w:p>
     <w:p>
@@ -2492,7 +2492,7 @@
           <w:b/>
           <w:sz w:val="26"/>
         </w:rPr>
-        <w:t>DTNB</w:t>
+        <w:t>HPLC</w:t>
       </w:r>
       <w:r>
         <w:rPr>
@@ -2500,7 +2500,7 @@
           <w:sz w:val="26"/>
         </w:rPr>
         <w:tab/>
-        <w:t>Acid 5,5'-dithiobis(2-nitrobenzoic) (thuốc thử Ellman)</w:t>
+        <w:t>Sắc ký lỏng hiệu năng cao (High-performance liquid chromatography)</w:t>
       </w:r>
     </w:p>
     <w:p>
@@ -2518,15 +2518,24 @@
           <w:b/>
           <w:sz w:val="26"/>
         </w:rPr>
-        <w:t>FDA</w:t>
-      </w:r>
-      <w:r>
-        <w:rPr>
-          <w:rFonts w:ascii="Times New Roman" w:hAnsi="Times New Roman" w:eastAsia="Times New Roman" w:cs="Times New Roman"/>
+        <w:t>IC</w:t>
+      </w:r>
+      <w:r>
+        <w:rPr>
+          <w:rFonts w:ascii="Times New Roman" w:hAnsi="Times New Roman" w:eastAsia="Times New Roman" w:cs="Times New Roman"/>
+          <w:b/>
           <w:sz w:val="26"/>
+          <w:vertAlign w:val="subscript"/>
+        </w:rPr>
+        <w:t>50</w:t>
+      </w:r>
+      <w:r>
+        <w:rPr>
+          <w:rFonts w:ascii="Times New Roman" w:hAnsi="Times New Roman" w:eastAsia="Times New Roman" w:cs="Times New Roman"/>
+          <w:sz w:val="26"/>
         </w:rPr>
         <w:tab/>
-        <w:t>Cơ quan Quản lý Thực phẩm và Dược phẩm Hoa Kỳ (Food and Drug Administration)</w:t>
+        <w:t>Nồng độ ức chế 50% hoạt tính (Half-maximal inhibitory concentration)</w:t>
       </w:r>
     </w:p>
     <w:p>
@@ -2544,7 +2553,7 @@
           <w:b/>
           <w:sz w:val="26"/>
         </w:rPr>
-        <w:t>HMG-CoA</w:t>
+        <w:t>IMPs</w:t>
       </w:r>
       <w:r>
         <w:rPr>
@@ -2552,7 +2561,7 @@
           <w:sz w:val="26"/>
         </w:rPr>
         <w:tab/>
-        <w:t>3-Hydroxy-3-methylglutaryl-coenzyme A</w:t>
+        <w:t>Thuốc vạn năng chuyển hóa không hợp lệ (Invalid metabolic panaceas)</w:t>
       </w:r>
     </w:p>
     <w:p>
@@ -2570,7 +2579,7 @@
           <w:b/>
           <w:sz w:val="26"/>
         </w:rPr>
-        <w:t>HPLC</w:t>
+        <w:t>ITC</w:t>
       </w:r>
       <w:r>
         <w:rPr>
@@ -2578,7 +2587,7 @@
           <w:sz w:val="26"/>
         </w:rPr>
         <w:tab/>
-        <w:t>Sắc ký lỏng hiệu năng cao (High-performance liquid chromatography)</w:t>
+        <w:t>Nhiệt lượng kế chuẩn độ đẳng nhiệt (Isothermal titration calorimetry)</w:t>
       </w:r>
     </w:p>
     <w:p>
@@ -2596,7 +2605,7 @@
           <w:b/>
           <w:sz w:val="26"/>
         </w:rPr>
-        <w:t>IC</w:t>
+        <w:t>K</w:t>
       </w:r>
       <w:r>
         <w:rPr>
@@ -2605,7 +2614,7 @@
           <w:sz w:val="26"/>
           <w:vertAlign w:val="subscript"/>
         </w:rPr>
-        <w:t>50</w:t>
+        <w:t>i</w:t>
       </w:r>
       <w:r>
         <w:rPr>
@@ -2613,7 +2622,7 @@
           <w:sz w:val="26"/>
         </w:rPr>
         <w:tab/>
-        <w:t>Nồng độ ức chế 50% hoạt tính (Half-maximal inhibitory concentration)</w:t>
+        <w:t>Hằng số ức chế (Inhibition constant)</w:t>
       </w:r>
     </w:p>
     <w:p>
@@ -2631,15 +2640,24 @@
           <w:b/>
           <w:sz w:val="26"/>
         </w:rPr>
-        <w:t>IMPs</w:t>
-      </w:r>
-      <w:r>
-        <w:rPr>
-          <w:rFonts w:ascii="Times New Roman" w:hAnsi="Times New Roman" w:eastAsia="Times New Roman" w:cs="Times New Roman"/>
+        <w:t>K</w:t>
+      </w:r>
+      <w:r>
+        <w:rPr>
+          <w:rFonts w:ascii="Times New Roman" w:hAnsi="Times New Roman" w:eastAsia="Times New Roman" w:cs="Times New Roman"/>
+          <w:b/>
           <w:sz w:val="26"/>
+          <w:vertAlign w:val="subscript"/>
+        </w:rPr>
+        <w:t>m</w:t>
+      </w:r>
+      <w:r>
+        <w:rPr>
+          <w:rFonts w:ascii="Times New Roman" w:hAnsi="Times New Roman" w:eastAsia="Times New Roman" w:cs="Times New Roman"/>
+          <w:sz w:val="26"/>
         </w:rPr>
         <w:tab/>
-        <w:t>Thuốc vạn năng chuyển hóa không hợp lệ (Invalid metabolic panaceas)</w:t>
+        <w:t>Hằng số Michaelis</w:t>
       </w:r>
     </w:p>
     <w:p>
@@ -2657,7 +2675,7 @@
           <w:b/>
           <w:sz w:val="26"/>
         </w:rPr>
-        <w:t>ITC</w:t>
+        <w:t>MIABE</w:t>
       </w:r>
       <w:r>
         <w:rPr>
@@ -2665,7 +2683,7 @@
           <w:sz w:val="26"/>
         </w:rPr>
         <w:tab/>
-        <w:t>Nhiệt lượng kế chuẩn độ đẳng nhiệt (Isothermal titration calorimetry)</w:t>
+        <w:t>Thông tin tối thiểu về một thực thể có hoạt tính sinh học (Minimum information about a bioactive entity)</w:t>
       </w:r>
     </w:p>
     <w:p>
@@ -2683,24 +2701,15 @@
           <w:b/>
           <w:sz w:val="26"/>
         </w:rPr>
-        <w:t>K</w:t>
-      </w:r>
-      <w:r>
-        <w:rPr>
-          <w:rFonts w:ascii="Times New Roman" w:hAnsi="Times New Roman" w:eastAsia="Times New Roman" w:cs="Times New Roman"/>
-          <w:b/>
+        <w:t>NMR</w:t>
+      </w:r>
+      <w:r>
+        <w:rPr>
+          <w:rFonts w:ascii="Times New Roman" w:hAnsi="Times New Roman" w:eastAsia="Times New Roman" w:cs="Times New Roman"/>
           <w:sz w:val="26"/>
-          <w:vertAlign w:val="subscript"/>
-        </w:rPr>
-        <w:t>i</w:t>
-      </w:r>
-      <w:r>
-        <w:rPr>
-          <w:rFonts w:ascii="Times New Roman" w:hAnsi="Times New Roman" w:eastAsia="Times New Roman" w:cs="Times New Roman"/>
-          <w:sz w:val="26"/>
         </w:rPr>
         <w:tab/>
-        <w:t>Hằng số ức chế (Inhibition constant)</w:t>
+        <w:t>Cộng hưởng từ hạt nhân (Nuclear magnetic resonance)</w:t>
       </w:r>
     </w:p>
     <w:p>
@@ -2718,24 +2727,15 @@
           <w:b/>
           <w:sz w:val="26"/>
         </w:rPr>
-        <w:t>K</w:t>
-      </w:r>
-      <w:r>
-        <w:rPr>
-          <w:rFonts w:ascii="Times New Roman" w:hAnsi="Times New Roman" w:eastAsia="Times New Roman" w:cs="Times New Roman"/>
-          <w:b/>
+        <w:t>PAINS</w:t>
+      </w:r>
+      <w:r>
+        <w:rPr>
+          <w:rFonts w:ascii="Times New Roman" w:hAnsi="Times New Roman" w:eastAsia="Times New Roman" w:cs="Times New Roman"/>
           <w:sz w:val="26"/>
-          <w:vertAlign w:val="subscript"/>
-        </w:rPr>
-        <w:t>m</w:t>
-      </w:r>
-      <w:r>
-        <w:rPr>
-          <w:rFonts w:ascii="Times New Roman" w:hAnsi="Times New Roman" w:eastAsia="Times New Roman" w:cs="Times New Roman"/>
-          <w:sz w:val="26"/>
         </w:rPr>
         <w:tab/>
-        <w:t>Hằng số Michaelis</w:t>
+        <w:t>Hợp chất gây nhiễu đa phép thử (Pan-assay interference compounds)</w:t>
       </w:r>
     </w:p>
     <w:p>
@@ -2753,7 +2753,7 @@
           <w:b/>
           <w:sz w:val="26"/>
         </w:rPr>
-        <w:t>MIABE</w:t>
+        <w:t>pNPG</w:t>
       </w:r>
       <w:r>
         <w:rPr>
@@ -2761,7 +2761,21 @@
           <w:sz w:val="26"/>
         </w:rPr>
         <w:tab/>
-        <w:t>Thông tin tối thiểu về một thực thể có hoạt tính sinh học (Minimum information about a bioactive entity)</w:t>
+      </w:r>
+      <w:r>
+        <w:rPr>
+          <w:rFonts w:ascii="Times New Roman" w:hAnsi="Times New Roman" w:eastAsia="Times New Roman" w:cs="Times New Roman"/>
+          <w:i/>
+          <w:sz w:val="26"/>
+        </w:rPr>
+        <w:t>p</w:t>
+      </w:r>
+      <w:r>
+        <w:rPr>
+          <w:rFonts w:ascii="Times New Roman" w:hAnsi="Times New Roman" w:eastAsia="Times New Roman" w:cs="Times New Roman"/>
+          <w:sz w:val="26"/>
+        </w:rPr>
+        <w:t>-Nitrophenyl-α-D-glucopyranosid</w:t>
       </w:r>
     </w:p>
     <w:p>
@@ -2779,7 +2793,7 @@
           <w:b/>
           <w:sz w:val="26"/>
         </w:rPr>
-        <w:t>NMR</w:t>
+        <w:t>qNMR</w:t>
       </w:r>
       <w:r>
         <w:rPr>
@@ -2787,7 +2801,7 @@
           <w:sz w:val="26"/>
         </w:rPr>
         <w:tab/>
-        <w:t>Cộng hưởng từ hạt nhân (Nuclear magnetic resonance)</w:t>
+        <w:t>Cộng hưởng từ hạt nhân định lượng (Quantitative NMR)</w:t>
       </w:r>
     </w:p>
     <w:p>
@@ -2805,7 +2819,7 @@
           <w:b/>
           <w:sz w:val="26"/>
         </w:rPr>
-        <w:t>PAINS</w:t>
+        <w:t>SAR</w:t>
       </w:r>
       <w:r>
         <w:rPr>
@@ -2813,7 +2827,7 @@
           <w:sz w:val="26"/>
         </w:rPr>
         <w:tab/>
-        <w:t>Hợp chất gây nhiễu đa phép thử (Pan-assay interference compounds)</w:t>
+        <w:t>Quan hệ cấu trúc – hoạt tính (Structure–activity relationship)</w:t>
       </w:r>
     </w:p>
     <w:p>
@@ -2831,7 +2845,7 @@
           <w:b/>
           <w:sz w:val="26"/>
         </w:rPr>
-        <w:t>pNPG</w:t>
+        <w:t>SPR</w:t>
       </w:r>
       <w:r>
         <w:rPr>
@@ -2839,21 +2853,7 @@
           <w:sz w:val="26"/>
         </w:rPr>
         <w:tab/>
-      </w:r>
-      <w:r>
-        <w:rPr>
-          <w:rFonts w:ascii="Times New Roman" w:hAnsi="Times New Roman" w:eastAsia="Times New Roman" w:cs="Times New Roman"/>
-          <w:i/>
-          <w:sz w:val="26"/>
-        </w:rPr>
-        <w:t>p</w:t>
-      </w:r>
-      <w:r>
-        <w:rPr>
-          <w:rFonts w:ascii="Times New Roman" w:hAnsi="Times New Roman" w:eastAsia="Times New Roman" w:cs="Times New Roman"/>
-          <w:sz w:val="26"/>
-        </w:rPr>
-        <w:t>-Nitrophenyl-α-D-glucopyranosid</w:t>
+        <w:t>Cộng hưởng plasmon bề mặt (Surface plasmon resonance)</w:t>
       </w:r>
     </w:p>
     <w:p>
@@ -2871,7 +2871,7 @@
           <w:b/>
           <w:sz w:val="26"/>
         </w:rPr>
-        <w:t>qNMR</w:t>
+        <w:t>STAR</w:t>
       </w:r>
       <w:r>
         <w:rPr>
@@ -2879,7 +2879,7 @@
           <w:sz w:val="26"/>
         </w:rPr>
         <w:tab/>
-        <w:t>Cộng hưởng từ hạt nhân định lượng (Quantitative NMR)</w:t>
+        <w:t>Quan hệ cấu trúc – phơi nhiễm mô/chọn lọc – hoạt tính (Structure–tissue exposure/selectivity–activity relationship)</w:t>
       </w:r>
     </w:p>
     <w:p>
@@ -2897,7 +2897,7 @@
           <w:b/>
           <w:sz w:val="26"/>
         </w:rPr>
-        <w:t>SAR</w:t>
+        <w:t>STD-NMR</w:t>
       </w:r>
       <w:r>
         <w:rPr>
@@ -2905,7 +2905,7 @@
           <w:sz w:val="26"/>
         </w:rPr>
         <w:tab/>
-        <w:t>Quan hệ cấu trúc – hoạt tính (Structure–activity relationship)</w:t>
+        <w:t>NMR chênh lệch truyền bão hòa (Saturation transfer difference NMR)</w:t>
       </w:r>
     </w:p>
     <w:p>
@@ -2923,84 +2923,6 @@
           <w:b/>
           <w:sz w:val="26"/>
         </w:rPr>
-        <w:t>SPR</w:t>
-      </w:r>
-      <w:r>
-        <w:rPr>
-          <w:rFonts w:ascii="Times New Roman" w:hAnsi="Times New Roman" w:eastAsia="Times New Roman" w:cs="Times New Roman"/>
-          <w:sz w:val="26"/>
-        </w:rPr>
-        <w:tab/>
-        <w:t>Cộng hưởng plasmon bề mặt (Surface plasmon resonance)</w:t>
-      </w:r>
-    </w:p>
-    <w:p>
-      <w:pPr>
-        <w:tabs>
-          <w:tab w:pos="1531" w:val="left"/>
-        </w:tabs>
-        <w:spacing w:after="0" w:line="276" w:lineRule="auto"/>
-        <w:ind w:hanging="1531" w:left="1531"/>
-        <w:jc w:val="left"/>
-      </w:pPr>
-      <w:r>
-        <w:rPr>
-          <w:rFonts w:ascii="Times New Roman" w:hAnsi="Times New Roman" w:eastAsia="Times New Roman" w:cs="Times New Roman"/>
-          <w:b/>
-          <w:sz w:val="26"/>
-        </w:rPr>
-        <w:t>STAR</w:t>
-      </w:r>
-      <w:r>
-        <w:rPr>
-          <w:rFonts w:ascii="Times New Roman" w:hAnsi="Times New Roman" w:eastAsia="Times New Roman" w:cs="Times New Roman"/>
-          <w:sz w:val="26"/>
-        </w:rPr>
-        <w:tab/>
-        <w:t>Quan hệ cấu trúc – phơi nhiễm mô/chọn lọc – hoạt tính (Structure–tissue exposure/selectivity–activity relationship)</w:t>
-      </w:r>
-    </w:p>
-    <w:p>
-      <w:pPr>
-        <w:tabs>
-          <w:tab w:pos="1531" w:val="left"/>
-        </w:tabs>
-        <w:spacing w:after="0" w:line="276" w:lineRule="auto"/>
-        <w:ind w:hanging="1531" w:left="1531"/>
-        <w:jc w:val="left"/>
-      </w:pPr>
-      <w:r>
-        <w:rPr>
-          <w:rFonts w:ascii="Times New Roman" w:hAnsi="Times New Roman" w:eastAsia="Times New Roman" w:cs="Times New Roman"/>
-          <w:b/>
-          <w:sz w:val="26"/>
-        </w:rPr>
-        <w:t>STD-NMR</w:t>
-      </w:r>
-      <w:r>
-        <w:rPr>
-          <w:rFonts w:ascii="Times New Roman" w:hAnsi="Times New Roman" w:eastAsia="Times New Roman" w:cs="Times New Roman"/>
-          <w:sz w:val="26"/>
-        </w:rPr>
-        <w:tab/>
-        <w:t>NMR chênh lệch truyền bão hòa (Saturation transfer difference NMR)</w:t>
-      </w:r>
-    </w:p>
-    <w:p>
-      <w:pPr>
-        <w:tabs>
-          <w:tab w:pos="1531" w:val="left"/>
-        </w:tabs>
-        <w:spacing w:after="0" w:line="276" w:lineRule="auto"/>
-        <w:ind w:hanging="1531" w:left="1531"/>
-        <w:jc w:val="left"/>
-      </w:pPr>
-      <w:r>
-        <w:rPr>
-          <w:rFonts w:ascii="Times New Roman" w:hAnsi="Times New Roman" w:eastAsia="Times New Roman" w:cs="Times New Roman"/>
-          <w:b/>
-          <w:sz w:val="26"/>
-        </w:rPr>
         <w:t>TPEN</w:t>
       </w:r>
       <w:r>
@@ -3054,7 +2976,7 @@
           <w:sz w:val="26"/>
         </w:rPr>
         <w:tab/>
-        <w:t>10</w:t>
+        <w:t>11</w:t>
       </w:r>
     </w:p>
     <w:p>
@@ -3352,7 +3274,7 @@
         <w:rPr>
           <w:rFonts w:ascii="Times New Roman" w:hAnsi="Times New Roman" w:eastAsia="Times New Roman" w:cs="Times New Roman"/>
         </w:rPr>
-        <w:t xml:space="preserve"> chỉ là kết quả đo, trong những điều kiện xác định, của tương tác giữa phân tử và hệ thử. Kết quả đó có thể phản ánh đúng một cơ chế ức chế đặc hiệu, nhưng cũng có thể bắt nguồn từ sự kết tập keo của phân tử, từ phản ứng không đặc hiệu với protein, từ nhiễu quang học hoặc từ sự không tương đồng giữa enzyme mô hình và đích sinh học ở người [8], [33], [37]. Việc đồng nhất tín hiệu đo được với cơ chế tác dụng là một trong những yếu tố góp phần vào tỷ lệ thất bại khoảng 90% của các ứng viên thuốc khi bước vào thử nghiệm lâm sàng [42]. Các khảo sát trong công nghiệp dược phẩm cũng cho thấy phần lớn kết quả tiền lâm sàng được công bố không được lặp lại khi kiểm chứng độc lập [10], [40]. Những dữ kiện này đặt ra một vấn đề không chỉ có tính kỹ thuật mà có tính nhận thức luận: ranh giới giữa hiện tượng và bản chất, giữa hiện tượng và giả tượng, đã bị xóa nhòa trong nhận thức và trong thực tiễn nghiên cứu.</w:t>
+        <w:t xml:space="preserve"> chỉ là kết quả đo, trong những điều kiện xác định, của tương tác giữa phân tử và hệ thử. Kết quả đó có thể phản ánh đúng một cơ chế ức chế đặc hiệu, nhưng cũng có thể bắt nguồn từ sự kết tập keo của phân tử, từ phản ứng không đặc hiệu với protein, từ nhiễu quang học hoặc từ sự không tương đồng giữa enzyme mô hình và đích sinh học ở người [8], [33], [37]. Việc đồng nhất tín hiệu đo được với cơ chế tác dụng là một trong những yếu tố góp phần vào tỷ lệ thất bại khoảng 90% của các ứng viên thuốc khi bước vào thử nghiệm lâm sàng [42]. Các khảo sát trong công nghiệp dược phẩm cũng cho thấy phần lớn kết quả tiền lâm sàng được công bố không được lặp lại khi kiểm chứng độc lập [10], [40]. Những dữ kiện này đặt ra một vấn đề không chỉ có tính kỹ thuật mà có tính nhận thức luận: ranh giới giữa hiện tượng và bản chất, giữa hiện tượng và giả tượng, chưa được phân biệt rõ trong thực tiễn nghiên cứu.</w:t>
       </w:r>
     </w:p>
     <w:p>
@@ -3442,7 +3364,7 @@
         <w:rPr>
           <w:rFonts w:ascii="Times New Roman" w:hAnsi="Times New Roman" w:eastAsia="Times New Roman" w:cs="Times New Roman"/>
         </w:rPr>
-        <w:t>Về phương diện khoa học chuyên ngành, từ đầu thập niên 2000 đã hình thành một hướng nghiên cứu về những kết quả hoạt tính không phản ánh tương tác đặc hiệu: hiện tượng ức chế do kết tập keo [22], [33], [41], các hợp chất gây nhiễu đa phép thử [8], [9], các “thuốc vạn năng” không hợp lệ trong hóa học hợp chất thiên nhiên [11], [35], cùng những phê phán đối với việc áp dụng máy móc các bộ lọc cấu trúc [15]. Các công trình này tiếp cận vấn đề chủ yếu dưới góc độ kỹ thuật và thống kê. Việc khái quát chúng dưới góc độ triết học, nhằm chỉ ra cơ sở phương pháp luận chung của các biện pháp kỹ thuật riêng lẻ, là khoảng trống mà tiểu luận này hướng tới.</w:t>
+        <w:t>Về phương diện khoa học chuyên ngành, từ đầu thập niên 2000 đã hình thành một hướng nghiên cứu về những kết quả hoạt tính không phản ánh tương tác đặc hiệu: hiện tượng ức chế do kết tập keo [22], [33], [41], các hợp chất gây nhiễu đa phép thử [8], [9], các “thuốc vạn năng” không hợp lệ trong hóa học hợp chất thiên nhiên [11], [35], cùng những phê phán đối với việc áp dụng máy móc các bộ lọc cấu trúc [15]. Các công trình này tiếp cận vấn đề chủ yếu dưới góc độ kỹ thuật và thống kê. Việc khái quát chúng dưới góc độ triết học, nhằm chỉ ra cơ sở phương pháp luận chung của các biện pháp kỹ thuật riêng lẻ, là khoảng trống mà tiểu luận hướng tới.</w:t>
       </w:r>
     </w:p>
     <w:p>
@@ -3469,7 +3391,7 @@
         <w:rPr>
           <w:rFonts w:ascii="Times New Roman" w:hAnsi="Times New Roman" w:eastAsia="Times New Roman" w:cs="Times New Roman"/>
         </w:rPr>
-        <w:t>Mục tiêu của tiểu luận là làm rõ nội dung và ý nghĩa phương pháp luận của cặp phạm trù bản chất và hiện tượng, trên cơ sở đó đề xuất các nguyên tắc tiếp cận nhằm nâng cao tính khách quan và độ tin cậy của các kết luận về hoạt tính ức chế enzyme của hợp chất thiên nhiên. Để đạt mục tiêu đó, tiểu luận thực hiện bốn nhiệm vụ: (i) hệ thống hóa lịch sử vấn đề và quan niệm duy vật biện chứng về bản chất, hiện tượng và mối quan hệ giữa chúng; (ii) phân tích sự vận động của nhận thức từ hiện tượng đến bản chất qua một số trường hợp tiêu biểu trong lịch sử hóa học; (iii) phân tích thực trạng và nguyên cội nhận thức luận của sự sai lệch giữa kết quả thử nghiệm và cơ chế tác dụng trong nghiên cứu hợp chất thiên nhiên; (iv) đề xuất các nguyên tắc và một quy trình đánh giá theo các cấp độ tiếp cận bản chất.</w:t>
+        <w:t>Mục tiêu của tiểu luận là làm rõ nội dung và ý nghĩa phương pháp luận của cặp phạm trù bản chất và hiện tượng, trên cơ sở đó đề xuất các nguyên tắc tiếp cận nhằm nâng cao tính khách quan và độ tin cậy của các kết luận về hoạt tính ức chế enzyme của hợp chất thiên nhiên. Để đạt mục tiêu đó, tiểu luận thực hiện bốn nhiệm vụ: (i) hệ thống hóa lịch sử vấn đề và quan niệm duy vật biện chứng về bản chất, hiện tượng và mối quan hệ giữa chúng; (ii) phân tích sự vận động của nhận thức từ hiện tượng đến bản chất qua một số trường hợp tiêu biểu trong lịch sử hóa học; (iii) phân tích thực trạng và nguồn gốc nhận thức luận của sự sai lệch giữa kết quả thử nghiệm và cơ chế tác dụng trong nghiên cứu hợp chất thiên nhiên; (iv) đề xuất các nguyên tắc và một quy trình đánh giá theo các cấp độ tiếp cận bản chất.</w:t>
       </w:r>
     </w:p>
     <w:p>
@@ -3590,7 +3512,7 @@
         <w:rPr>
           <w:rFonts w:ascii="Times New Roman" w:hAnsi="Times New Roman" w:eastAsia="Times New Roman" w:cs="Times New Roman"/>
         </w:rPr>
-        <w:t>Ngoài Phần mở đầu, Kết luận và Danh mục tài liệu tham khảo, tiểu luận gồm bốn chương. Chương 1 trình bày cơ sở lý luận về cặp phạm trù bản chất và hiện tượng. Chương 2 phân tích sự vận động của nhận thức từ hiện tượng đến bản chất trong lịch sử hóa học. Chương 3 phân tích thực trạng đánh giá hoạt tính ức chế enzyme của hợp chất thiên nhiên dưới góc độ của cặp phạm trù này. Chương 4 đề xuất các nguyên tắc và quy trình vận dụng.</w:t>
+        <w:t>Ngoài Phần mở đầu, Kết luận và Danh mục tài liệu tham khảo, tiểu luận gồm bốn chương: Chương 1 – cơ sở lý luận về cặp phạm trù bản chất và hiện tượng; Chương 2 – sự vận động của nhận thức từ hiện tượng đến bản chất trong lịch sử hóa học; Chương 3 – thực trạng đánh giá hoạt tính ức chế enzyme của hợp chất thiên nhiên; Chương 4 – các nguyên tắc và quy trình vận dụng.</w:t>
       </w:r>
     </w:p>
     <w:p>
@@ -3616,28 +3538,6 @@
     </w:p>
     <w:p>
       <w:pPr>
-        <w:pStyle w:val="Heading2"/>
-      </w:pPr>
-      <w:r>
-        <w:rPr>
-          <w:rFonts w:ascii="Times New Roman" w:hAnsi="Times New Roman" w:eastAsia="Times New Roman" w:cs="Times New Roman"/>
-        </w:rPr>
-        <w:t>1.1. Phạm trù và hệ thống phạm trù của phép biện chứng duy vật</w:t>
-      </w:r>
-    </w:p>
-    <w:p>
-      <w:pPr>
-        <w:pStyle w:val="Heading3"/>
-      </w:pPr>
-      <w:r>
-        <w:rPr>
-          <w:rFonts w:ascii="Times New Roman" w:hAnsi="Times New Roman" w:eastAsia="Times New Roman" w:cs="Times New Roman"/>
-        </w:rPr>
-        <w:t>1.1.1. Khái niệm phạm trù</w:t>
-      </w:r>
-    </w:p>
-    <w:p>
-      <w:pPr>
         <w:ind w:firstLine="567"/>
         <w:jc w:val="both"/>
       </w:pPr>
@@ -3645,7 +3545,29 @@
         <w:rPr>
           <w:rFonts w:ascii="Times New Roman" w:hAnsi="Times New Roman" w:eastAsia="Times New Roman" w:cs="Times New Roman"/>
         </w:rPr>
-        <w:t>Phạm trù là những khái niệm rộng nhất, phản ánh những mặt, những thuộc tính, những mối liên hệ chung, cơ bản nhất của các sự vật và hiện tượng thuộc một lĩnh vực nhất định [2]. Mỗi khoa học cụ thể có hệ thống phạm trù riêng; chẳng hạn, “liên kết hóa học”, “cơ chế phản ứng”, “ái lực gắn kết” là các phạm trù của hóa học và hóa sinh, phản ánh các mối liên hệ trong một lĩnh vực hiện thực xác định. Phạm trù của phép biện chứng duy vật có phạm vi rộng hơn: chúng phản ánh những mối liên hệ phổ biến nhất, có mặt trong tự nhiên, xã hội và tư duy. Vì vậy, phạm trù triết học không thay thế phạm trù của khoa học cụ thể, mà đóng vai trò định hướng phương pháp luận cho việc hình thành và sử dụng các phạm trù ấy [1], [2].</w:t>
+        <w:t>Chương này trình bày cơ sở lý luận của tiểu luận theo trình tự đi từ cái chung đến cái riêng: từ khái niệm phạm trù và hệ thống phạm trù của phép biện chứng duy vật, qua lịch sử vấn đề bản chất và hiện tượng trong triết học, đến quan niệm duy vật biện chứng về cặp phạm trù này, vị trí của nó trong hệ thống phép biện chứng và trong tiến trình nhận thức. Trên cơ sở đó, chương rút ra những yêu cầu phương pháp luận được dùng làm công cụ phân tích ở các chương sau.</w:t>
+      </w:r>
+    </w:p>
+    <w:p>
+      <w:pPr>
+        <w:pStyle w:val="Heading2"/>
+      </w:pPr>
+      <w:r>
+        <w:rPr>
+          <w:rFonts w:ascii="Times New Roman" w:hAnsi="Times New Roman" w:eastAsia="Times New Roman" w:cs="Times New Roman"/>
+        </w:rPr>
+        <w:t>1.1. Phạm trù và hệ thống phạm trù của phép biện chứng duy vật</w:t>
+      </w:r>
+    </w:p>
+    <w:p>
+      <w:pPr>
+        <w:pStyle w:val="Heading3"/>
+      </w:pPr>
+      <w:r>
+        <w:rPr>
+          <w:rFonts w:ascii="Times New Roman" w:hAnsi="Times New Roman" w:eastAsia="Times New Roman" w:cs="Times New Roman"/>
+        </w:rPr>
+        <w:t>1.1.1. Khái niệm phạm trù</w:t>
       </w:r>
     </w:p>
     <w:p>
@@ -3657,18 +3579,7 @@
         <w:rPr>
           <w:rFonts w:ascii="Times New Roman" w:hAnsi="Times New Roman" w:eastAsia="Times New Roman" w:cs="Times New Roman"/>
         </w:rPr>
-        <w:t>Trong lịch sử triết học, vấn đề phạm trù được giải quyết theo những lập trường khác nhau. Arixtốt là người đầu tiên xây dựng một hệ thống phạm trù tương đối hoàn chỉnh, xem phạm trù là những thể loại chung nhất của tồn tại và của phát ngôn về tồn tại. I. Cantơ coi phạm trù là những hình thức tiên nghiệm của giác tính, vốn có trong chủ thể và được áp đặt lên kinh nghiệm cảm tính. G.W.F. Hêghen đã trình bày các phạm trù trong sự vận động, chuyển hóa lẫn nhau, song coi đó là những nấc thang tự phát triển của “ý niệm tuyệt đối” [2]. Chủ nghĩa duy vật biện chứng khắc phục cả quan niệm duy tâm chủ quan lẫn duy tâm khách quan: phạm trù là kết quả của quá trình nhận thức và thực tiễn, là sự phản ánh những mối liên hệ tồn tại khách quan vào trong ý thức con người. V.I. Lênin coi các phạm trù là những bậc thang của sự nhận thức thế giới, những điểm nút trong mạng lưới các hiện tượng tự nhiên, giúp con người nhận thức và làm chủ mạng lưới đó [4].</w:t>
-      </w:r>
-    </w:p>
-    <w:p>
-      <w:pPr>
-        <w:pStyle w:val="Heading3"/>
-      </w:pPr>
-      <w:r>
-        <w:rPr>
-          <w:rFonts w:ascii="Times New Roman" w:hAnsi="Times New Roman" w:eastAsia="Times New Roman" w:cs="Times New Roman"/>
-        </w:rPr>
-        <w:t>1.1.2. Tính chất của phạm trù</w:t>
+        <w:t>Phạm trù là những khái niệm rộng nhất, phản ánh những mặt, những thuộc tính, những mối liên hệ chung, cơ bản nhất của các sự vật và hiện tượng thuộc một lĩnh vực nhất định [2]. Mỗi khoa học cụ thể có hệ thống phạm trù riêng; chẳng hạn, “liên kết hóa học”, “cơ chế phản ứng”, “ái lực gắn kết” là các phạm trù của hóa học và hóa sinh, phản ánh các mối liên hệ trong một lĩnh vực hiện thực xác định. Phạm trù của phép biện chứng duy vật có phạm vi rộng hơn: chúng phản ánh những mối liên hệ phổ biến nhất, có mặt trong tự nhiên, xã hội và tư duy. Vì vậy, phạm trù triết học không thay thế phạm trù của khoa học cụ thể, mà đóng vai trò định hướng phương pháp luận cho việc hình thành và sử dụng các phạm trù ấy [1], [2].</w:t>
       </w:r>
     </w:p>
     <w:p>
@@ -3680,59 +3591,18 @@
         <w:rPr>
           <w:rFonts w:ascii="Times New Roman" w:hAnsi="Times New Roman" w:eastAsia="Times New Roman" w:cs="Times New Roman"/>
         </w:rPr>
-        <w:t xml:space="preserve">Theo quan niệm duy vật biện chứng, phạm trù có những tính chất cơ bản sau [2]. </w:t>
-      </w:r>
-      <w:r>
-        <w:rPr>
-          <w:rFonts w:ascii="Times New Roman" w:hAnsi="Times New Roman" w:eastAsia="Times New Roman" w:cs="Times New Roman"/>
-          <w:i/>
-        </w:rPr>
-        <w:t>Thứ nhất</w:t>
-      </w:r>
-      <w:r>
-        <w:rPr>
-          <w:rFonts w:ascii="Times New Roman" w:hAnsi="Times New Roman" w:eastAsia="Times New Roman" w:cs="Times New Roman"/>
-        </w:rPr>
-        <w:t xml:space="preserve">, phạm trù có tính khách quan về nội dung, vì nội dung của nó là sự phản ánh những mối liên hệ tồn tại độc lập với ý thức; đồng thời có tính chủ quan về hình thức, vì nó là sản phẩm của tư duy trừu tượng. </w:t>
-      </w:r>
-      <w:r>
-        <w:rPr>
-          <w:rFonts w:ascii="Times New Roman" w:hAnsi="Times New Roman" w:eastAsia="Times New Roman" w:cs="Times New Roman"/>
-          <w:i/>
-        </w:rPr>
-        <w:t>Thứ hai</w:t>
-      </w:r>
-      <w:r>
-        <w:rPr>
-          <w:rFonts w:ascii="Times New Roman" w:hAnsi="Times New Roman" w:eastAsia="Times New Roman" w:cs="Times New Roman"/>
-        </w:rPr>
-        <w:t xml:space="preserve">, phạm trù có tính phổ biến, vì những mặt, những mối liên hệ mà nó phản ánh có mặt trong mọi sự vật, hiện tượng. </w:t>
-      </w:r>
-      <w:r>
-        <w:rPr>
-          <w:rFonts w:ascii="Times New Roman" w:hAnsi="Times New Roman" w:eastAsia="Times New Roman" w:cs="Times New Roman"/>
-          <w:i/>
-        </w:rPr>
-        <w:t>Thứ ba</w:t>
-      </w:r>
-      <w:r>
-        <w:rPr>
-          <w:rFonts w:ascii="Times New Roman" w:hAnsi="Times New Roman" w:eastAsia="Times New Roman" w:cs="Times New Roman"/>
-        </w:rPr>
-        <w:t xml:space="preserve">, phạm trù có tính biện chứng: các phạm trù liên hệ và chuyển hóa lẫn nhau, và nội dung của chúng không đứng im mà vận động theo sự vận động của hiện thực. </w:t>
-      </w:r>
-      <w:r>
-        <w:rPr>
-          <w:rFonts w:ascii="Times New Roman" w:hAnsi="Times New Roman" w:eastAsia="Times New Roman" w:cs="Times New Roman"/>
-          <w:i/>
-        </w:rPr>
-        <w:t>Thứ tư</w:t>
-      </w:r>
-      <w:r>
-        <w:rPr>
-          <w:rFonts w:ascii="Times New Roman" w:hAnsi="Times New Roman" w:eastAsia="Times New Roman" w:cs="Times New Roman"/>
-        </w:rPr>
-        <w:t>, phạm trù có tính lịch sử: hệ thống phạm trù không khép kín mà được bổ sung, điều chỉnh cùng với sự phát triển của thực tiễn và của nhận thức khoa học.</w:t>
+        <w:t>Trong lịch sử triết học, vấn đề phạm trù được giải quyết theo những lập trường khác nhau. Arixtốt là người đầu tiên xây dựng một hệ thống phạm trù tương đối hoàn chỉnh, xem phạm trù là những thể loại chung nhất của tồn tại và của phát ngôn về tồn tại. I. Cantơ coi phạm trù là những hình thức tiên nghiệm của giác tính, vốn có trong chủ thể và được áp đặt lên kinh nghiệm cảm tính. G.W.F. Hêghen đã trình bày các phạm trù trong sự vận động, chuyển hóa lẫn nhau, song coi đó là những nấc thang tự phát triển của “ý niệm tuyệt đối” [2]. Chủ nghĩa duy vật biện chứng khắc phục cả quan niệm duy tâm chủ quan lẫn duy tâm khách quan: phạm trù là kết quả của quá trình nhận thức và thực tiễn, là sự phản ánh những mối liên hệ tồn tại khách quan vào trong ý thức con người. V.I. Lênin coi các phạm trù là những bậc thang của sự nhận thức thế giới, những điểm nút trong mạng lưới các hiện tượng tự nhiên, giúp con người nhận thức và làm chủ mạng lưới đó [4].</w:t>
+      </w:r>
+    </w:p>
+    <w:p>
+      <w:pPr>
+        <w:pStyle w:val="Heading3"/>
+      </w:pPr>
+      <w:r>
+        <w:rPr>
+          <w:rFonts w:ascii="Times New Roman" w:hAnsi="Times New Roman" w:eastAsia="Times New Roman" w:cs="Times New Roman"/>
+        </w:rPr>
+        <w:t>1.1.2. Tính chất của phạm trù</w:t>
       </w:r>
     </w:p>
     <w:p>
@@ -3744,18 +3614,59 @@
         <w:rPr>
           <w:rFonts w:ascii="Times New Roman" w:hAnsi="Times New Roman" w:eastAsia="Times New Roman" w:cs="Times New Roman"/>
         </w:rPr>
-        <w:t>Các tính chất này có ý nghĩa trực tiếp đối với người nghiên cứu khoa học tự nhiên. Tính khách quan của phạm trù đòi hỏi các khái niệm khoa học phải được kiểm chứng trong đối tượng thực, chứ không được coi là những định nghĩa quy ước tùy tiện. Tính lịch sử của phạm trù cho thấy rằng ngay cả những khái niệm tưởng như ổn định của hóa học, như “acid”, “nguyên tố”, “hoạt tính ức chế”, cũng đã và đang thay đổi nội dung theo tiến trình của nhận thức, như sẽ được phân tích ở Chương 2.</w:t>
-      </w:r>
-    </w:p>
-    <w:p>
-      <w:pPr>
-        <w:pStyle w:val="Heading3"/>
-      </w:pPr>
-      <w:r>
-        <w:rPr>
-          <w:rFonts w:ascii="Times New Roman" w:hAnsi="Times New Roman" w:eastAsia="Times New Roman" w:cs="Times New Roman"/>
-        </w:rPr>
-        <w:t>1.1.3. Hệ thống các cặp phạm trù cơ bản và vị trí của cặp phạm trù bản chất – hiện tượng</w:t>
+        <w:t xml:space="preserve">Theo quan niệm duy vật biện chứng, phạm trù có những tính chất cơ bản sau [2]. </w:t>
+      </w:r>
+      <w:r>
+        <w:rPr>
+          <w:rFonts w:ascii="Times New Roman" w:hAnsi="Times New Roman" w:eastAsia="Times New Roman" w:cs="Times New Roman"/>
+          <w:i/>
+        </w:rPr>
+        <w:t>Thứ nhất</w:t>
+      </w:r>
+      <w:r>
+        <w:rPr>
+          <w:rFonts w:ascii="Times New Roman" w:hAnsi="Times New Roman" w:eastAsia="Times New Roman" w:cs="Times New Roman"/>
+        </w:rPr>
+        <w:t xml:space="preserve">, phạm trù có tính khách quan về nội dung, vì nội dung của nó là sự phản ánh những mối liên hệ tồn tại độc lập với ý thức; đồng thời có tính chủ quan về hình thức, vì nó là sản phẩm của tư duy trừu tượng. </w:t>
+      </w:r>
+      <w:r>
+        <w:rPr>
+          <w:rFonts w:ascii="Times New Roman" w:hAnsi="Times New Roman" w:eastAsia="Times New Roman" w:cs="Times New Roman"/>
+          <w:i/>
+        </w:rPr>
+        <w:t>Thứ hai</w:t>
+      </w:r>
+      <w:r>
+        <w:rPr>
+          <w:rFonts w:ascii="Times New Roman" w:hAnsi="Times New Roman" w:eastAsia="Times New Roman" w:cs="Times New Roman"/>
+        </w:rPr>
+        <w:t xml:space="preserve">, phạm trù có tính phổ biến, vì những mặt, những mối liên hệ mà nó phản ánh có mặt trong mọi sự vật, hiện tượng. </w:t>
+      </w:r>
+      <w:r>
+        <w:rPr>
+          <w:rFonts w:ascii="Times New Roman" w:hAnsi="Times New Roman" w:eastAsia="Times New Roman" w:cs="Times New Roman"/>
+          <w:i/>
+        </w:rPr>
+        <w:t>Thứ ba</w:t>
+      </w:r>
+      <w:r>
+        <w:rPr>
+          <w:rFonts w:ascii="Times New Roman" w:hAnsi="Times New Roman" w:eastAsia="Times New Roman" w:cs="Times New Roman"/>
+        </w:rPr>
+        <w:t xml:space="preserve">, phạm trù có tính biện chứng: các phạm trù liên hệ và chuyển hóa lẫn nhau, và nội dung của chúng không đứng im mà vận động theo sự vận động của hiện thực. </w:t>
+      </w:r>
+      <w:r>
+        <w:rPr>
+          <w:rFonts w:ascii="Times New Roman" w:hAnsi="Times New Roman" w:eastAsia="Times New Roman" w:cs="Times New Roman"/>
+          <w:i/>
+        </w:rPr>
+        <w:t>Thứ tư</w:t>
+      </w:r>
+      <w:r>
+        <w:rPr>
+          <w:rFonts w:ascii="Times New Roman" w:hAnsi="Times New Roman" w:eastAsia="Times New Roman" w:cs="Times New Roman"/>
+        </w:rPr>
+        <w:t>, phạm trù có tính lịch sử: hệ thống phạm trù không khép kín mà được bổ sung, điều chỉnh cùng với sự phát triển của thực tiễn và của nhận thức khoa học.</w:t>
       </w:r>
     </w:p>
     <w:p>
@@ -3767,18 +3678,18 @@
         <w:rPr>
           <w:rFonts w:ascii="Times New Roman" w:hAnsi="Times New Roman" w:eastAsia="Times New Roman" w:cs="Times New Roman"/>
         </w:rPr>
-        <w:t>Phép biện chứng duy vật khái quát sáu cặp phạm trù cơ bản: cái riêng và cái chung; nguyên nhân và kết quả; tất nhiên và ngẫu nhiên; nội dung và hình thức; bản chất và hiện tượng; khả năng và hiện thực. Các cặp phạm trù này cụ thể hóa hai nguyên lý cơ bản (nguyên lý về mối liên hệ phổ biến và nguyên lý về sự phát triển) và bổ sung cho ba quy luật cơ bản của phép biện chứng, song mỗi cặp phản ánh một phương diện riêng của các mối liên hệ [2]. Cặp phạm trù bản chất và hiện tượng phản ánh quan hệ giữa mặt bên trong, tương đối ổn định, quy định sự vận động của sự vật với mặt bên ngoài, biến đổi, có thể quan sát trực tiếp. Do liên quan trực tiếp đến sự chuyển hóa từ nhận thức cảm tính lên nhận thức lý tính, cặp phạm trù này có ý nghĩa đặc biệt đối với lý luận nhận thức và đối với phương pháp luận của các khoa học thực nghiệm.</w:t>
-      </w:r>
-    </w:p>
-    <w:p>
-      <w:pPr>
-        <w:pStyle w:val="Heading2"/>
-      </w:pPr>
-      <w:r>
-        <w:rPr>
-          <w:rFonts w:ascii="Times New Roman" w:hAnsi="Times New Roman" w:eastAsia="Times New Roman" w:cs="Times New Roman"/>
-        </w:rPr>
-        <w:t>1.2. Lịch sử vấn đề bản chất và hiện tượng trong triết học</w:t>
+        <w:t>Các tính chất này có ý nghĩa trực tiếp đối với người nghiên cứu khoa học tự nhiên. Tính khách quan của phạm trù đòi hỏi các khái niệm khoa học phải được kiểm chứng trong đối tượng thực, chứ không được coi là những định nghĩa quy ước tùy tiện. Tính lịch sử của phạm trù cho thấy rằng ngay cả những khái niệm tưởng như ổn định của hóa học, như “acid”, “nguyên tố”, “hoạt tính ức chế”, cũng đã và đang thay đổi nội dung theo tiến trình của nhận thức, như sẽ được phân tích ở Chương 2.</w:t>
+      </w:r>
+    </w:p>
+    <w:p>
+      <w:pPr>
+        <w:pStyle w:val="Heading3"/>
+      </w:pPr>
+      <w:r>
+        <w:rPr>
+          <w:rFonts w:ascii="Times New Roman" w:hAnsi="Times New Roman" w:eastAsia="Times New Roman" w:cs="Times New Roman"/>
+        </w:rPr>
+        <w:t>1.1.3. Hệ thống các cặp phạm trù cơ bản và vị trí của cặp phạm trù bản chất – hiện tượng</w:t>
       </w:r>
     </w:p>
     <w:p>
@@ -3790,18 +3701,18 @@
         <w:rPr>
           <w:rFonts w:ascii="Times New Roman" w:hAnsi="Times New Roman" w:eastAsia="Times New Roman" w:cs="Times New Roman"/>
         </w:rPr>
-        <w:t>Quan hệ giữa bản chất và hiện tượng gắn liền với mặt thứ hai trong vấn đề cơ bản của triết học: con người có khả năng nhận thức được thế giới hay không. Những câu trả lời khác nhau cho câu hỏi này đã hình thành khả tri luận và bất khả tri luận, và qua đó hình thành những quan niệm khác nhau về bản chất và hiện tượng [1], [2].</w:t>
-      </w:r>
-    </w:p>
-    <w:p>
-      <w:pPr>
-        <w:pStyle w:val="Heading3"/>
-      </w:pPr>
-      <w:r>
-        <w:rPr>
-          <w:rFonts w:ascii="Times New Roman" w:hAnsi="Times New Roman" w:eastAsia="Times New Roman" w:cs="Times New Roman"/>
-        </w:rPr>
-        <w:t>1.2.1. Triết học Hy Lạp cổ đại</w:t>
+        <w:t>Phép biện chứng duy vật khái quát sáu cặp phạm trù cơ bản: cái riêng và cái chung; nguyên nhân và kết quả; tất nhiên và ngẫu nhiên; nội dung và hình thức; bản chất và hiện tượng; khả năng và hiện thực. Các cặp phạm trù này cụ thể hóa hai nguyên lý cơ bản (nguyên lý về mối liên hệ phổ biến và nguyên lý về sự phát triển) và bổ sung cho ba quy luật cơ bản của phép biện chứng, song mỗi cặp phản ánh một phương diện riêng của các mối liên hệ [2]. Cặp phạm trù bản chất và hiện tượng phản ánh quan hệ giữa mặt bên trong, tương đối ổn định, quy định sự vận động của sự vật với mặt bên ngoài, biến đổi, có thể quan sát trực tiếp. Do liên quan trực tiếp đến sự chuyển hóa từ nhận thức cảm tính lên nhận thức lý tính, cặp phạm trù này có ý nghĩa đặc biệt đối với lý luận nhận thức và đối với phương pháp luận của các khoa học thực nghiệm.</w:t>
+      </w:r>
+    </w:p>
+    <w:p>
+      <w:pPr>
+        <w:pStyle w:val="Heading2"/>
+      </w:pPr>
+      <w:r>
+        <w:rPr>
+          <w:rFonts w:ascii="Times New Roman" w:hAnsi="Times New Roman" w:eastAsia="Times New Roman" w:cs="Times New Roman"/>
+        </w:rPr>
+        <w:t>1.2. Lịch sử vấn đề bản chất và hiện tượng trong triết học</w:t>
       </w:r>
     </w:p>
     <w:p>
@@ -3813,7 +3724,7 @@
         <w:rPr>
           <w:rFonts w:ascii="Times New Roman" w:hAnsi="Times New Roman" w:eastAsia="Times New Roman" w:cs="Times New Roman"/>
         </w:rPr>
-        <w:t>Ngay từ triết học Hy Lạp cổ đại, sự phân biệt giữa cái hiện ra trước giác quan và cái tồn tại thực sự đã được đặt ra. Đêmôcrít cho rằng các tính chất như ngọt, đắng, nóng, lạnh, màu sắc chỉ tồn tại theo “ước lệ”, còn trong thực tại chỉ có nguyên tử và khoảng trống; qua đó, ông đã phân biệt thế giới cảm tính với cấu trúc vật chất ẩn giấu ở bên dưới, dù ở trình độ trực quan, phỏng đoán. Platôn đi theo hướng duy tâm khách quan: bản chất chân thực là thế giới ý niệm, còn các sự vật cảm tính chỉ là cái bóng, bản sao không hoàn hảo của ý niệm. Arixtốt phê phán Platôn, khẳng định bản chất không tồn tại tách rời mà ở ngay trong các sự vật riêng lẻ, song quan niệm của ông còn dao động giữa chủ nghĩa duy vật và chủ nghĩa duy tâm [1].</w:t>
+        <w:t>Quan hệ giữa bản chất và hiện tượng gắn liền với mặt thứ hai trong vấn đề cơ bản của triết học: con người có khả năng nhận thức được thế giới hay không. Những câu trả lời khác nhau cho câu hỏi này đã hình thành khả tri luận và bất khả tri luận, và qua đó hình thành những quan niệm khác nhau về bản chất và hiện tượng [1], [2].</w:t>
       </w:r>
     </w:p>
     <w:p>
@@ -3824,7 +3735,7 @@
         <w:rPr>
           <w:rFonts w:ascii="Times New Roman" w:hAnsi="Times New Roman" w:eastAsia="Times New Roman" w:cs="Times New Roman"/>
         </w:rPr>
-        <w:t>1.2.2. Triết học Tây Âu cận đại và triết học cổ điển Đức</w:t>
+        <w:t>1.2.1. Triết học Hy Lạp cổ đại</w:t>
       </w:r>
     </w:p>
     <w:p>
@@ -3836,7 +3747,18 @@
         <w:rPr>
           <w:rFonts w:ascii="Times New Roman" w:hAnsi="Times New Roman" w:eastAsia="Times New Roman" w:cs="Times New Roman"/>
         </w:rPr>
-        <w:t>Trong triết học cận đại, J. Lốccơ phân biệt “chất có đầu tiên” (quảng tính, hình dạng, vận động) tồn tại trong bản thân vật thể với “chất có thứ hai” (màu sắc, mùi vị, âm thanh) chỉ tồn tại trong cảm giác của chủ thể. G. Béccơli đi đến chủ nghĩa duy tâm chủ quan khi cho rằng tồn tại có nghĩa là được tri giác. Đ. Hium cho rằng con người chỉ biết được các ấn tượng cảm tính của mình và không thể biết có gì tồn tại ở phía sau chúng [1]. I. Cantơ thừa nhận sự tồn tại khách quan của “vật tự nó”, nhưng khẳng định con người chỉ nhận thức được “hiện tượng”, tức là vật như nó hiện ra đối với chủ thể thông qua các hình thức tiên nghiệm của cảm tính và giác tính; còn “vật tự nó” là không thể nhận thức. Như vậy, ở Cantơ, bản chất và hiện tượng bị tách rời bằng một ranh giới về nguyên tắc.</w:t>
+        <w:t>Ngay từ triết học Hy Lạp cổ đại, sự phân biệt giữa cái hiện ra trước giác quan và cái tồn tại thực sự đã được đặt ra. Đêmôcrít cho rằng các tính chất như ngọt, đắng, nóng, lạnh, màu sắc chỉ tồn tại theo “ước lệ”, còn trong thực tại chỉ có nguyên tử và khoảng trống; qua đó, ông đã phân biệt thế giới cảm tính với cấu trúc vật chất ẩn giấu ở bên dưới, dù ở trình độ trực quan, phỏng đoán. Platôn đi theo hướng duy tâm khách quan: bản chất chân thực là thế giới ý niệm, còn các sự vật cảm tính chỉ là cái bóng, bản sao không hoàn hảo của ý niệm. Arixtốt phê phán Platôn, khẳng định bản chất không tồn tại tách rời mà ở ngay trong các sự vật riêng lẻ, song quan niệm của ông còn dao động giữa chủ nghĩa duy vật và chủ nghĩa duy tâm [1].</w:t>
+      </w:r>
+    </w:p>
+    <w:p>
+      <w:pPr>
+        <w:pStyle w:val="Heading3"/>
+      </w:pPr>
+      <w:r>
+        <w:rPr>
+          <w:rFonts w:ascii="Times New Roman" w:hAnsi="Times New Roman" w:eastAsia="Times New Roman" w:cs="Times New Roman"/>
+        </w:rPr>
+        <w:t>1.2.2. Triết học Tây Âu cận đại và triết học cổ điển Đức</w:t>
       </w:r>
     </w:p>
     <w:p>
@@ -3848,44 +3770,7 @@
         <w:rPr>
           <w:rFonts w:ascii="Times New Roman" w:hAnsi="Times New Roman" w:eastAsia="Times New Roman" w:cs="Times New Roman"/>
         </w:rPr>
-        <w:t xml:space="preserve">G.W.F. Hêghen phê phán sự tách rời đó. Trong học thuyết về bản chất thuộc </w:t>
-      </w:r>
-      <w:r>
-        <w:rPr>
-          <w:rFonts w:ascii="Times New Roman" w:hAnsi="Times New Roman" w:eastAsia="Times New Roman" w:cs="Times New Roman"/>
-          <w:i/>
-        </w:rPr>
-        <w:t>Khoa học lôgíc</w:t>
-      </w:r>
-      <w:r>
-        <w:rPr>
-          <w:rFonts w:ascii="Times New Roman" w:hAnsi="Times New Roman" w:eastAsia="Times New Roman" w:cs="Times New Roman"/>
-        </w:rPr>
-        <w:t xml:space="preserve">, ông khẳng định bản chất phải hiện ra, và hiện tượng không phải là cái gì ngoài bản chất mà chính là sự biểu hiện của bản chất. Đây là đóng góp biện chứng quan trọng, được V.I. Lênin đánh giá cao và kế thừa trong </w:t>
-      </w:r>
-      <w:r>
-        <w:rPr>
-          <w:rFonts w:ascii="Times New Roman" w:hAnsi="Times New Roman" w:eastAsia="Times New Roman" w:cs="Times New Roman"/>
-          <w:i/>
-        </w:rPr>
-        <w:t>Bút ký triết học</w:t>
-      </w:r>
-      <w:r>
-        <w:rPr>
-          <w:rFonts w:ascii="Times New Roman" w:hAnsi="Times New Roman" w:eastAsia="Times New Roman" w:cs="Times New Roman"/>
-        </w:rPr>
-        <w:t xml:space="preserve"> [4]. Tuy nhiên, Hêghen quy cả bản chất lẫn hiện tượng về các nấc thang vận động của “ý niệm tuyệt đối”, nên biện chứng của ông là biện chứng duy tâm [1], [2].</w:t>
-      </w:r>
-    </w:p>
-    <w:p>
-      <w:pPr>
-        <w:pStyle w:val="Heading3"/>
-      </w:pPr>
-      <w:r>
-        <w:rPr>
-          <w:rFonts w:ascii="Times New Roman" w:hAnsi="Times New Roman" w:eastAsia="Times New Roman" w:cs="Times New Roman"/>
-        </w:rPr>
-        <w:t>1.2.3. Quan niệm của C. Mác và Ph. Ăngghen</w:t>
+        <w:t>Trong triết học cận đại, J. Lốccơ phân biệt những “tính chất thứ nhất” (quảng tính, hình dạng, vận động) tồn tại trong bản thân vật thể với những “tính chất thứ hai” (màu sắc, mùi vị, âm thanh) chỉ tồn tại trong cảm giác của chủ thể. G. Béccơli đi đến chủ nghĩa duy tâm chủ quan khi cho rằng tồn tại có nghĩa là được tri giác. Đ. Hium cho rằng con người chỉ biết được các ấn tượng cảm tính của mình và không thể biết có gì tồn tại ở phía sau chúng, qua đó đi đến hoài nghi luận và bất khả tri luận [1]. I. Cantơ thừa nhận sự tồn tại khách quan của “vật tự nó”, nhưng khẳng định con người chỉ nhận thức được “hiện tượng”, tức là vật như nó hiện ra đối với chủ thể thông qua các hình thức tiên nghiệm của cảm tính và giác tính; còn “vật tự nó” là không thể nhận thức. Như vậy, ở Cantơ, bản chất và hiện tượng bị tách rời bằng một ranh giới về nguyên tắc; đây là một hình thức của bất khả tri luận.</w:t>
       </w:r>
     </w:p>
     <w:p>
@@ -3897,20 +3782,44 @@
         <w:rPr>
           <w:rFonts w:ascii="Times New Roman" w:hAnsi="Times New Roman" w:eastAsia="Times New Roman" w:cs="Times New Roman"/>
         </w:rPr>
-        <w:t xml:space="preserve">C. Mác và Ph. Ăngghen đã cải tạo phép biện chứng của Hêghen trên cơ sở duy vật, qua đó đặt vấn đề bản chất và hiện tượng trên một nền tảng mới: bản chất là những mối liên hệ tất nhiên của bản thân hiện thực vật chất, chứ không phải của ý niệm, và nhận thức bản chất là quá trình phản ánh những mối liên hệ đó dựa trên thực tiễn [1], [2]. Trong </w:t>
+        <w:t xml:space="preserve">G.W.F. Hêghen phê phán sự tách rời đó. Trong học thuyết về bản chất thuộc </w:t>
       </w:r>
       <w:r>
         <w:rPr>
           <w:rFonts w:ascii="Times New Roman" w:hAnsi="Times New Roman" w:eastAsia="Times New Roman" w:cs="Times New Roman"/>
           <w:i/>
         </w:rPr>
-        <w:t>Tư bản</w:t>
-      </w:r>
-      <w:r>
-        <w:rPr>
-          <w:rFonts w:ascii="Times New Roman" w:hAnsi="Times New Roman" w:eastAsia="Times New Roman" w:cs="Times New Roman"/>
-        </w:rPr>
-        <w:t>, Mác không chỉ nêu nguyên tắc này mà còn vận dụng nó như một phương pháp nghiên cứu. Ở chương cuối của quyển III, khi phân tích cái gọi là “công thức ba ngôi” (tư bản – lợi nhuận, ruộng đất – địa tô, lao động – tiền công), Mác phê phán kinh tế chính trị tầm thường vì nó chỉ hệ thống hóa những hình thái biểu hiện bề ngoài của các quan hệ kinh tế như chúng hiện ra trong ý thức của những người tham gia, mà không đi vào những mối liên hệ bên trong. Chính trong bối cảnh này, Mác nêu nhận định rằng nếu hình thái biểu hiện và bản chất của sự vật trực tiếp trùng khớp với nhau thì mọi khoa học đều trở nên thừa [5].</w:t>
+        <w:t>Khoa học lôgíc</w:t>
+      </w:r>
+      <w:r>
+        <w:rPr>
+          <w:rFonts w:ascii="Times New Roman" w:hAnsi="Times New Roman" w:eastAsia="Times New Roman" w:cs="Times New Roman"/>
+        </w:rPr>
+        <w:t xml:space="preserve">, ông khẳng định bản chất phải hiện ra, và hiện tượng không phải là cái gì ngoài bản chất mà chính là sự biểu hiện của bản chất. Đây là đóng góp biện chứng quan trọng, được V.I. Lênin đánh giá cao và kế thừa trong </w:t>
+      </w:r>
+      <w:r>
+        <w:rPr>
+          <w:rFonts w:ascii="Times New Roman" w:hAnsi="Times New Roman" w:eastAsia="Times New Roman" w:cs="Times New Roman"/>
+          <w:i/>
+        </w:rPr>
+        <w:t>Bút ký triết học</w:t>
+      </w:r>
+      <w:r>
+        <w:rPr>
+          <w:rFonts w:ascii="Times New Roman" w:hAnsi="Times New Roman" w:eastAsia="Times New Roman" w:cs="Times New Roman"/>
+        </w:rPr>
+        <w:t xml:space="preserve"> [4]. Tuy nhiên, Hêghen quy cả bản chất lẫn hiện tượng về các nấc thang vận động của “ý niệm tuyệt đối”, nên biện chứng của ông là biện chứng duy tâm [1], [2].</w:t>
+      </w:r>
+    </w:p>
+    <w:p>
+      <w:pPr>
+        <w:pStyle w:val="Heading3"/>
+      </w:pPr>
+      <w:r>
+        <w:rPr>
+          <w:rFonts w:ascii="Times New Roman" w:hAnsi="Times New Roman" w:eastAsia="Times New Roman" w:cs="Times New Roman"/>
+        </w:rPr>
+        <w:t>1.2.3. Quan niệm của C. Mác và Ph. Ăngghen</w:t>
       </w:r>
     </w:p>
     <w:p>
@@ -3922,44 +3831,20 @@
         <w:rPr>
           <w:rFonts w:ascii="Times New Roman" w:hAnsi="Times New Roman" w:eastAsia="Times New Roman" w:cs="Times New Roman"/>
         </w:rPr>
-        <w:t xml:space="preserve">Từ phân tích của Mác có thể rút ra hai điểm có ý nghĩa phương pháp luận chung. </w:t>
+        <w:t xml:space="preserve">C. Mác và Ph. Ăngghen đã cải tạo phép biện chứng của Hêghen trên cơ sở duy vật, qua đó đặt vấn đề bản chất và hiện tượng trên một nền tảng mới: bản chất là những mối liên hệ tất nhiên của bản thân hiện thực vật chất, chứ không phải của ý niệm, và nhận thức bản chất là quá trình phản ánh những mối liên hệ đó dựa trên thực tiễn [1], [2]. Trong </w:t>
       </w:r>
       <w:r>
         <w:rPr>
           <w:rFonts w:ascii="Times New Roman" w:hAnsi="Times New Roman" w:eastAsia="Times New Roman" w:cs="Times New Roman"/>
           <w:i/>
         </w:rPr>
-        <w:t>Thứ nhất</w:t>
-      </w:r>
-      <w:r>
-        <w:rPr>
-          <w:rFonts w:ascii="Times New Roman" w:hAnsi="Times New Roman" w:eastAsia="Times New Roman" w:cs="Times New Roman"/>
-        </w:rPr>
-        <w:t xml:space="preserve">, hình thái biểu hiện bề ngoài không phải là ảo ảnh chủ quan mà là cách thức khách quan mà các quan hệ bản chất hiện ra trong những điều kiện nhất định; vì thế, nó có thể được hệ thống hóa một cách chặt chẽ, và chính sự chặt chẽ ấy dễ khiến người ta lầm tưởng đã đạt tới bản chất. </w:t>
-      </w:r>
-      <w:r>
-        <w:rPr>
-          <w:rFonts w:ascii="Times New Roman" w:hAnsi="Times New Roman" w:eastAsia="Times New Roman" w:cs="Times New Roman"/>
-          <w:i/>
-        </w:rPr>
-        <w:t>Thứ hai</w:t>
-      </w:r>
-      <w:r>
-        <w:rPr>
-          <w:rFonts w:ascii="Times New Roman" w:hAnsi="Times New Roman" w:eastAsia="Times New Roman" w:cs="Times New Roman"/>
-        </w:rPr>
-        <w:t>, khoa học chân chính không bác bỏ hình thái biểu hiện mà giải thích vì sao bản chất lại biểu hiện ra dưới hình thái ấy. Hai điểm này có giá trị vượt ra ngoài kinh tế chính trị: trong khoa học tự nhiên, một hệ thống số liệu được xử lý chặt chẽ về mặt thống kê vẫn có thể chỉ là sự hệ thống hóa hiện tượng, và nhiệm vụ của nhà nghiên cứu là giải thích vì sao hiện tượng lại xuất hiện như vậy.</w:t>
-      </w:r>
-    </w:p>
-    <w:p>
-      <w:pPr>
-        <w:pStyle w:val="Heading3"/>
-      </w:pPr>
-      <w:r>
-        <w:rPr>
-          <w:rFonts w:ascii="Times New Roman" w:hAnsi="Times New Roman" w:eastAsia="Times New Roman" w:cs="Times New Roman"/>
-        </w:rPr>
-        <w:t>1.2.4. Chủ nghĩa thực chứng, chủ nghĩa Makhơ và sự phê phán của V.I. Lênin</w:t>
+        <w:t>Tư bản</w:t>
+      </w:r>
+      <w:r>
+        <w:rPr>
+          <w:rFonts w:ascii="Times New Roman" w:hAnsi="Times New Roman" w:eastAsia="Times New Roman" w:cs="Times New Roman"/>
+        </w:rPr>
+        <w:t>, Mác không chỉ nêu nguyên tắc này mà còn vận dụng nó như một phương pháp nghiên cứu. Ở chương cuối của quyển III, khi phân tích cái gọi là “công thức ba ngôi” (tư bản – lợi nhuận, ruộng đất – địa tô, lao động – tiền công), Mác phê phán kinh tế chính trị tầm thường vì nó chỉ hệ thống hóa những hình thái biểu hiện bề ngoài của các quan hệ kinh tế như chúng hiện ra trong ý thức của những người tham gia, mà không đi vào những mối liên hệ bên trong. Chính trong bối cảnh này, Mác nêu nhận định rằng nếu hình thái biểu hiện và bản chất của sự vật trực tiếp trùng khớp với nhau thì mọi khoa học đều trở nên thừa [5].</w:t>
       </w:r>
     </w:p>
     <w:p>
@@ -3971,20 +3856,44 @@
         <w:rPr>
           <w:rFonts w:ascii="Times New Roman" w:hAnsi="Times New Roman" w:eastAsia="Times New Roman" w:cs="Times New Roman"/>
         </w:rPr>
-        <w:t xml:space="preserve">Từ thế kỷ XIX, chủ nghĩa thực chứng chủ trương khoa học chỉ cần mô tả các hiện tượng và những mối liên hệ đều đặn giữa chúng, không cần và không thể truy tìm bản chất. Chủ nghĩa kinh nghiệm phê phán của E. Makhơ và R. Avênariút đi xa hơn khi coi sự vật là “phức hợp những cảm giác”. Trong tác phẩm </w:t>
+        <w:t xml:space="preserve">Từ phân tích của Mác có thể rút ra hai điểm có ý nghĩa phương pháp luận chung. </w:t>
       </w:r>
       <w:r>
         <w:rPr>
           <w:rFonts w:ascii="Times New Roman" w:hAnsi="Times New Roman" w:eastAsia="Times New Roman" w:cs="Times New Roman"/>
           <w:i/>
         </w:rPr>
-        <w:t>Chủ nghĩa duy vật và chủ nghĩa kinh nghiệm phê phán</w:t>
-      </w:r>
-      <w:r>
-        <w:rPr>
-          <w:rFonts w:ascii="Times New Roman" w:hAnsi="Times New Roman" w:eastAsia="Times New Roman" w:cs="Times New Roman"/>
-        </w:rPr>
-        <w:t>, V.I. Lênin đã phê phán các quan điểm này và khẳng định không có và không thể có sự khác nhau về nguyên tắc giữa hiện tượng và vật tự nó; chỉ có sự khác nhau giữa cái đã được nhận thức và cái chưa được nhận thức [3]. Để làm rõ luận điểm này, Lênin dẫn lại lập luận của Ph. Ăngghen về alizarin: chất màu trong rễ cây thiến thảo đã là “vật tự nó” chừng nào con người chưa biết đến cấu tạo của nó; khi hóa học hữu cơ tổng hợp được alizarin từ nhựa than đá, “vật tự nó” đã trở thành “vật cho ta” [3]. Như vậy, ranh giới giữa bản chất và hiện tượng không phải là ranh giới giữa cái có thể biết và cái không thể biết, mà là ranh giới lịch sử, có thể dịch chuyển, giữa cái đã biết và cái chưa biết; thực tiễn, trước hết là thực tiễn thí nghiệm và sản xuất, là phương tiện để dịch chuyển ranh giới đó.</w:t>
+        <w:t>Thứ nhất</w:t>
+      </w:r>
+      <w:r>
+        <w:rPr>
+          <w:rFonts w:ascii="Times New Roman" w:hAnsi="Times New Roman" w:eastAsia="Times New Roman" w:cs="Times New Roman"/>
+        </w:rPr>
+        <w:t xml:space="preserve">, hình thái biểu hiện bề ngoài không phải là ảo ảnh chủ quan mà là cách thức khách quan mà các quan hệ bản chất hiện ra trong những điều kiện nhất định; vì thế, nó có thể được hệ thống hóa một cách chặt chẽ, và chính sự chặt chẽ ấy dễ khiến người ta lầm tưởng đã đạt tới bản chất. </w:t>
+      </w:r>
+      <w:r>
+        <w:rPr>
+          <w:rFonts w:ascii="Times New Roman" w:hAnsi="Times New Roman" w:eastAsia="Times New Roman" w:cs="Times New Roman"/>
+          <w:i/>
+        </w:rPr>
+        <w:t>Thứ hai</w:t>
+      </w:r>
+      <w:r>
+        <w:rPr>
+          <w:rFonts w:ascii="Times New Roman" w:hAnsi="Times New Roman" w:eastAsia="Times New Roman" w:cs="Times New Roman"/>
+        </w:rPr>
+        <w:t>, khoa học chân chính không bác bỏ hình thái biểu hiện mà giải thích vì sao bản chất lại biểu hiện ra dưới hình thái ấy. Hai điểm này có giá trị vượt ra ngoài kinh tế chính trị: trong khoa học tự nhiên, một hệ thống số liệu được xử lý chặt chẽ về mặt thống kê vẫn có thể chỉ là sự hệ thống hóa hiện tượng, và nhiệm vụ của nhà nghiên cứu là giải thích vì sao hiện tượng lại xuất hiện như vậy.</w:t>
+      </w:r>
+    </w:p>
+    <w:p>
+      <w:pPr>
+        <w:pStyle w:val="Heading3"/>
+      </w:pPr>
+      <w:r>
+        <w:rPr>
+          <w:rFonts w:ascii="Times New Roman" w:hAnsi="Times New Roman" w:eastAsia="Times New Roman" w:cs="Times New Roman"/>
+        </w:rPr>
+        <w:t>1.2.4. Chủ nghĩa thực chứng, chủ nghĩa Makhơ và sự phê phán của V.I. Lênin</w:t>
       </w:r>
     </w:p>
     <w:p>
@@ -3996,29 +3905,20 @@
         <w:rPr>
           <w:rFonts w:ascii="Times New Roman" w:hAnsi="Times New Roman" w:eastAsia="Times New Roman" w:cs="Times New Roman"/>
         </w:rPr>
-        <w:t>Lập luận về alizarin có ý nghĩa đặc biệt đối với người nghiên cứu hóa học. Nó cho thấy bản chất của một chất không phải là cái bí ẩn vĩnh viễn nằm sau các thuộc tính cảm tính, mà là cấu trúc và các mối liên hệ có thể được xác lập bằng phân tích, được kiểm chứng bằng tổng hợp và được sử dụng trong sản xuất. Khả năng tái tạo sự vật một cách có chủ đích là bằng chứng thực tiễn cao nhất cho tính đúng đắn của tri thức về bản chất của nó.</w:t>
-      </w:r>
-    </w:p>
-    <w:p>
-      <w:pPr>
-        <w:pStyle w:val="Heading2"/>
-      </w:pPr>
-      <w:r>
-        <w:rPr>
-          <w:rFonts w:ascii="Times New Roman" w:hAnsi="Times New Roman" w:eastAsia="Times New Roman" w:cs="Times New Roman"/>
-        </w:rPr>
-        <w:t>1.3. Quan niệm duy vật biện chứng về bản chất, hiện tượng và giả tượng</w:t>
-      </w:r>
-    </w:p>
-    <w:p>
-      <w:pPr>
-        <w:pStyle w:val="Heading3"/>
-      </w:pPr>
-      <w:r>
-        <w:rPr>
-          <w:rFonts w:ascii="Times New Roman" w:hAnsi="Times New Roman" w:eastAsia="Times New Roman" w:cs="Times New Roman"/>
-        </w:rPr>
-        <w:t>1.3.1. Khái niệm bản chất và hiện tượng</w:t>
+        <w:t xml:space="preserve">Từ thế kỷ XIX, chủ nghĩa thực chứng chủ trương khoa học chỉ cần mô tả các hiện tượng và những mối liên hệ đều đặn giữa chúng, không cần và không thể truy tìm bản chất. Chủ nghĩa kinh nghiệm phê phán của E. Makhơ và R. Avênariút đi xa hơn khi coi sự vật là “phức hợp những cảm giác”. Trong tác phẩm </w:t>
+      </w:r>
+      <w:r>
+        <w:rPr>
+          <w:rFonts w:ascii="Times New Roman" w:hAnsi="Times New Roman" w:eastAsia="Times New Roman" w:cs="Times New Roman"/>
+          <w:i/>
+        </w:rPr>
+        <w:t>Chủ nghĩa duy vật và chủ nghĩa kinh nghiệm phê phán</w:t>
+      </w:r>
+      <w:r>
+        <w:rPr>
+          <w:rFonts w:ascii="Times New Roman" w:hAnsi="Times New Roman" w:eastAsia="Times New Roman" w:cs="Times New Roman"/>
+        </w:rPr>
+        <w:t>, V.I. Lênin đã phê phán các quan điểm này và khẳng định không có và không thể có sự khác nhau về nguyên tắc giữa hiện tượng và vật tự nó; chỉ có sự khác nhau giữa cái đã được nhận thức và cái chưa được nhận thức [3]. Để làm rõ luận điểm này, Lênin dẫn lại lập luận của Ph. Ăngghen về alizarin: chất màu trong rễ cây thiến thảo đã là “vật tự nó” chừng nào con người chưa biết đến cấu tạo của nó; khi hóa học hữu cơ tổng hợp được alizarin từ nhựa than đá, “vật tự nó” đã trở thành “vật cho ta” [3]. Như vậy, ranh giới giữa bản chất và hiện tượng không phải là ranh giới giữa cái có thể biết và cái không thể biết, mà là ranh giới lịch sử, có thể dịch chuyển, giữa cái đã biết và cái chưa biết; thực tiễn, trước hết là thực tiễn thí nghiệm và sản xuất, là phương tiện để dịch chuyển ranh giới đó.</w:t>
       </w:r>
     </w:p>
     <w:p>
@@ -4030,33 +3930,29 @@
         <w:rPr>
           <w:rFonts w:ascii="Times New Roman" w:hAnsi="Times New Roman" w:eastAsia="Times New Roman" w:cs="Times New Roman"/>
         </w:rPr>
-        <w:t xml:space="preserve">Trên lập trường duy vật biện chứng, </w:t>
-      </w:r>
-      <w:r>
-        <w:rPr>
-          <w:rFonts w:ascii="Times New Roman" w:hAnsi="Times New Roman" w:eastAsia="Times New Roman" w:cs="Times New Roman"/>
-          <w:b/>
-        </w:rPr>
-        <w:t>bản chất</w:t>
-      </w:r>
-      <w:r>
-        <w:rPr>
-          <w:rFonts w:ascii="Times New Roman" w:hAnsi="Times New Roman" w:eastAsia="Times New Roman" w:cs="Times New Roman"/>
-        </w:rPr>
-        <w:t xml:space="preserve"> là tổng thể các mặt, các mối liên hệ tất nhiên, tương đối ổn định ở bên trong sự vật, quy định sự vận động và phát triển của sự vật đó; </w:t>
-      </w:r>
-      <w:r>
-        <w:rPr>
-          <w:rFonts w:ascii="Times New Roman" w:hAnsi="Times New Roman" w:eastAsia="Times New Roman" w:cs="Times New Roman"/>
-          <w:b/>
-        </w:rPr>
-        <w:t>hiện tượng</w:t>
-      </w:r>
-      <w:r>
-        <w:rPr>
-          <w:rFonts w:ascii="Times New Roman" w:hAnsi="Times New Roman" w:eastAsia="Times New Roman" w:cs="Times New Roman"/>
-        </w:rPr>
-        <w:t xml:space="preserve"> là sự biểu hiện ra bên ngoài của những mặt, những mối liên hệ ấy trong những điều kiện xác định [2]. Cả bản chất và hiện tượng đều tồn tại khách quan, không phụ thuộc vào ý thức của con người. Hiện tượng không phải là cảm giác của chủ thể, mà là mặt của bản thân sự vật được đem lại cho con người trong cảm giác; bản chất không phải là một thực thể thứ hai đứng sau sự vật, mà là chính sự vật xét trong những mối liên hệ tất nhiên, bên trong của nó.</w:t>
+        <w:t>Lập luận về alizarin có ý nghĩa đặc biệt đối với người nghiên cứu hóa học. Nó cho thấy bản chất của một chất không phải là cái bí ẩn vĩnh viễn nằm sau các thuộc tính cảm tính, mà là cấu trúc và các mối liên hệ có thể được xác lập bằng phân tích, được kiểm chứng bằng tổng hợp và được sử dụng trong sản xuất. Khả năng tái tạo sự vật một cách có chủ đích là một trong những hình thức kiểm nghiệm thực tiễn có sức thuyết phục nhất đối với tri thức về bản chất của sự vật đó.</w:t>
+      </w:r>
+    </w:p>
+    <w:p>
+      <w:pPr>
+        <w:pStyle w:val="Heading2"/>
+      </w:pPr>
+      <w:r>
+        <w:rPr>
+          <w:rFonts w:ascii="Times New Roman" w:hAnsi="Times New Roman" w:eastAsia="Times New Roman" w:cs="Times New Roman"/>
+        </w:rPr>
+        <w:t>1.3. Quan niệm duy vật biện chứng về bản chất, hiện tượng và giả tượng</w:t>
+      </w:r>
+    </w:p>
+    <w:p>
+      <w:pPr>
+        <w:pStyle w:val="Heading3"/>
+      </w:pPr>
+      <w:r>
+        <w:rPr>
+          <w:rFonts w:ascii="Times New Roman" w:hAnsi="Times New Roman" w:eastAsia="Times New Roman" w:cs="Times New Roman"/>
+        </w:rPr>
+        <w:t>1.3.1. Khái niệm bản chất và hiện tượng</w:t>
       </w:r>
     </w:p>
     <w:p>
@@ -4068,18 +3964,33 @@
         <w:rPr>
           <w:rFonts w:ascii="Times New Roman" w:hAnsi="Times New Roman" w:eastAsia="Times New Roman" w:cs="Times New Roman"/>
         </w:rPr>
-        <w:t>Bản chất gắn liền với cái chung và cùng trình độ với quy luật: nói đến bản chất là nói đến cái tất nhiên, lặp lại trong những điều kiện nhất định. Tuy vậy, bản chất và quy luật không hoàn toàn đồng nhất. Quy luật là một mối liên hệ bản chất, tất nhiên, phổ biến và lặp lại giữa các mặt của sự vật; còn bản chất là tổng hợp nhiều mối liên hệ như vậy. Vì thế, bản chất là phạm trù rộng hơn và phong phú hơn quy luật [1], [2]. Trong hóa học, định luật tuần hoàn là một quy luật; còn bản chất của nguyên tố hóa học là tổng thể các mối liên hệ giữa điện tích hạt nhân, cấu hình electron và các tính chất lý – hóa mà quy luật tuần hoàn chỉ biểu đạt một phương diện.</w:t>
-      </w:r>
-    </w:p>
-    <w:p>
-      <w:pPr>
-        <w:pStyle w:val="Heading3"/>
-      </w:pPr>
-      <w:r>
-        <w:rPr>
-          <w:rFonts w:ascii="Times New Roman" w:hAnsi="Times New Roman" w:eastAsia="Times New Roman" w:cs="Times New Roman"/>
-        </w:rPr>
-        <w:t>1.3.2. Giả tượng</w:t>
+        <w:t xml:space="preserve">Trên lập trường duy vật biện chứng, </w:t>
+      </w:r>
+      <w:r>
+        <w:rPr>
+          <w:rFonts w:ascii="Times New Roman" w:hAnsi="Times New Roman" w:eastAsia="Times New Roman" w:cs="Times New Roman"/>
+          <w:b/>
+        </w:rPr>
+        <w:t>bản chất</w:t>
+      </w:r>
+      <w:r>
+        <w:rPr>
+          <w:rFonts w:ascii="Times New Roman" w:hAnsi="Times New Roman" w:eastAsia="Times New Roman" w:cs="Times New Roman"/>
+        </w:rPr>
+        <w:t xml:space="preserve"> là tổng thể các mặt, các mối liên hệ tất nhiên, tương đối ổn định ở bên trong sự vật, quy định sự vận động và phát triển của sự vật đó; </w:t>
+      </w:r>
+      <w:r>
+        <w:rPr>
+          <w:rFonts w:ascii="Times New Roman" w:hAnsi="Times New Roman" w:eastAsia="Times New Roman" w:cs="Times New Roman"/>
+          <w:b/>
+        </w:rPr>
+        <w:t>hiện tượng</w:t>
+      </w:r>
+      <w:r>
+        <w:rPr>
+          <w:rFonts w:ascii="Times New Roman" w:hAnsi="Times New Roman" w:eastAsia="Times New Roman" w:cs="Times New Roman"/>
+        </w:rPr>
+        <w:t xml:space="preserve"> là sự biểu hiện ra bên ngoài của những mặt, những mối liên hệ ấy trong những điều kiện xác định [2]. Cả bản chất và hiện tượng đều tồn tại khách quan, không phụ thuộc vào ý thức của con người. Hiện tượng không phải là cảm giác của chủ thể, mà là mặt của bản thân sự vật được đem lại cho con người trong cảm giác; bản chất không phải là một thực thể thứ hai đứng sau sự vật, mà là chính sự vật xét trong những mối liên hệ tất nhiên, bên trong của nó.</w:t>
       </w:r>
     </w:p>
     <w:p>
@@ -4091,20 +4002,18 @@
         <w:rPr>
           <w:rFonts w:ascii="Times New Roman" w:hAnsi="Times New Roman" w:eastAsia="Times New Roman" w:cs="Times New Roman"/>
         </w:rPr>
-        <w:t xml:space="preserve">Cần phân biệt hiện tượng với </w:t>
-      </w:r>
-      <w:r>
-        <w:rPr>
-          <w:rFonts w:ascii="Times New Roman" w:hAnsi="Times New Roman" w:eastAsia="Times New Roman" w:cs="Times New Roman"/>
-          <w:b/>
-        </w:rPr>
-        <w:t>giả tượng</w:t>
-      </w:r>
-      <w:r>
-        <w:rPr>
-          <w:rFonts w:ascii="Times New Roman" w:hAnsi="Times New Roman" w:eastAsia="Times New Roman" w:cs="Times New Roman"/>
-        </w:rPr>
-        <w:t>. Giả tượng cũng là hiện tượng khách quan, nhưng biểu hiện bản chất dưới dạng xuyên tạc, khiến người quan sát, nếu dừng lại ở bề mặt, gán cho sự vật một bản chất mà nó không có [1], [2]. Giả tượng khác với ảo giác chủ quan ở chỗ nó phát sinh từ chính các điều kiện khách quan trong đó bản chất được biểu hiện; do đó, không thể loại bỏ giả tượng bằng cách phủ nhận dữ kiện, mà chỉ có thể vượt qua nó bằng cách làm rõ những điều kiện đã sinh ra nó. Ví dụ quen thuộc là hiện tượng Mặt Trời “quay quanh” Trái Đất: đó là một biểu hiện có thật, được quan sát bởi mọi người, nhưng biểu hiện một bản chất ngược lại.</w:t>
+        <w:t>Bản chất gắn liền với cái chung và cùng trình độ với quy luật: nói đến bản chất là nói đến cái tất nhiên, lặp lại trong những điều kiện nhất định. Tuy vậy, bản chất và quy luật không hoàn toàn đồng nhất. Quy luật là một mối liên hệ bản chất, tất nhiên, phổ biến và lặp lại giữa các mặt của sự vật; còn bản chất là tổng hợp nhiều mối liên hệ như vậy. Vì thế, bản chất là phạm trù rộng hơn và phong phú hơn quy luật [1], [2]. Trong hóa học, định luật tuần hoàn là một quy luật; còn bản chất của nguyên tố hóa học là tổng thể các mối liên hệ giữa điện tích hạt nhân, cấu hình electron và các tính chất lý – hóa mà quy luật tuần hoàn chỉ biểu đạt một phương diện.</w:t>
+      </w:r>
+    </w:p>
+    <w:p>
+      <w:pPr>
+        <w:pStyle w:val="Heading3"/>
+      </w:pPr>
+      <w:r>
+        <w:rPr>
+          <w:rFonts w:ascii="Times New Roman" w:hAnsi="Times New Roman" w:eastAsia="Times New Roman" w:cs="Times New Roman"/>
+        </w:rPr>
+        <w:t>1.3.2. Giả tượng</w:t>
       </w:r>
     </w:p>
     <w:p>
@@ -4116,18 +4025,20 @@
         <w:rPr>
           <w:rFonts w:ascii="Times New Roman" w:hAnsi="Times New Roman" w:eastAsia="Times New Roman" w:cs="Times New Roman"/>
         </w:rPr>
-        <w:t>Trong thực nghiệm khoa học, giả tượng thường xuất hiện khi điều kiện đo không được kiểm soát đầy đủ hoặc khi phương tiện đo tạo ra tín hiệu của chính nó. Như sẽ phân tích ở Chương 3, nhiều “hoạt tính” được ghi nhận trong thử nghiệm sinh học thuộc loại giả tượng: tín hiệu đo là có thật, nhưng nguyên nhân của nó không phải là cơ chế mà người nghiên cứu gán cho hợp chất.</w:t>
-      </w:r>
-    </w:p>
-    <w:p>
-      <w:pPr>
-        <w:pStyle w:val="Heading3"/>
-      </w:pPr>
-      <w:r>
-        <w:rPr>
-          <w:rFonts w:ascii="Times New Roman" w:hAnsi="Times New Roman" w:eastAsia="Times New Roman" w:cs="Times New Roman"/>
-        </w:rPr>
-        <w:t>1.3.3. Một minh họa hóa học</w:t>
+        <w:t xml:space="preserve">Hiện tượng không phải bao giờ cũng biểu hiện bản chất một cách đầy đủ và trực tiếp; có những hiện tượng biểu hiện bản chất dưới dạng xuyên tạc, được gọi là </w:t>
+      </w:r>
+      <w:r>
+        <w:rPr>
+          <w:rFonts w:ascii="Times New Roman" w:hAnsi="Times New Roman" w:eastAsia="Times New Roman" w:cs="Times New Roman"/>
+          <w:b/>
+        </w:rPr>
+        <w:t>giả tượng</w:t>
+      </w:r>
+      <w:r>
+        <w:rPr>
+          <w:rFonts w:ascii="Times New Roman" w:hAnsi="Times New Roman" w:eastAsia="Times New Roman" w:cs="Times New Roman"/>
+        </w:rPr>
+        <w:t>. Giả tượng cũng là hiện tượng khách quan, nhưng nếu dừng lại ở biểu hiện bên ngoài, người quan sát sẽ gán cho sự vật một bản chất mà nó không có [1], [2]. Giả tượng khác với ảo giác chủ quan ở chỗ nó phát sinh từ chính các điều kiện khách quan trong đó bản chất được biểu hiện; do đó, không thể loại bỏ giả tượng bằng cách phủ nhận dữ kiện, mà chỉ có thể vượt qua nó bằng cách làm rõ những điều kiện đã sinh ra nó. Ví dụ quen thuộc là hiện tượng Mặt Trời “quay quanh” Trái Đất: đó là một biểu hiện có thật, được quan sát bởi mọi người, nhưng biểu hiện một bản chất ngược lại.</w:t>
       </w:r>
     </w:p>
     <w:p>
@@ -4139,31 +4050,7 @@
         <w:rPr>
           <w:rFonts w:ascii="Times New Roman" w:hAnsi="Times New Roman" w:eastAsia="Times New Roman" w:cs="Times New Roman"/>
         </w:rPr>
-        <w:t>Quan hệ giữa bản chất và hiện tượng có thể được minh họa bằng tính acid của dung dịch. Tính acid biểu hiện ra qua giá trị pH đo được, màu của chất chỉ thị hay tốc độ phản ứng với kim loại; đó là những hiện tượng. Bản chất của tính acid là khả năng cho proton, được quy định bởi cấu trúc electron và độ bền của base liên hợp, thể hiện định lượng qua hằng số pK</w:t>
-      </w:r>
-      <w:r>
-        <w:rPr>
-          <w:rFonts w:ascii="Times New Roman" w:hAnsi="Times New Roman" w:eastAsia="Times New Roman" w:cs="Times New Roman"/>
-          <w:vertAlign w:val="subscript"/>
-        </w:rPr>
-        <w:t>a</w:t>
-      </w:r>
-      <w:r>
-        <w:rPr>
-          <w:rFonts w:ascii="Times New Roman" w:hAnsi="Times New Roman" w:eastAsia="Times New Roman" w:cs="Times New Roman"/>
-        </w:rPr>
-        <w:t>. Cùng một bản chất có thể biểu hiện thành những hiện tượng khác nhau tùy dung môi, nồng độ và nhiệt độ; ngược lại, cùng một hiện tượng (một giá trị pH) có thể xuất phát từ những bản chất khác nhau, chẳng hạn một acid mạnh ở nồng độ thấp và một acid yếu ở nồng độ cao. Minh họa này cho thấy không thể suy trực tiếp từ một hiện tượng riêng lẻ ra bản chất, mà phải xem xét hiện tượng trong hệ thống các điều kiện sinh ra nó.</w:t>
-      </w:r>
-    </w:p>
-    <w:p>
-      <w:pPr>
-        <w:pStyle w:val="Heading2"/>
-      </w:pPr>
-      <w:r>
-        <w:rPr>
-          <w:rFonts w:ascii="Times New Roman" w:hAnsi="Times New Roman" w:eastAsia="Times New Roman" w:cs="Times New Roman"/>
-        </w:rPr>
-        <w:t>1.4. Mối quan hệ biện chứng giữa bản chất và hiện tượng</w:t>
+        <w:t>Trong thực nghiệm khoa học, giả tượng thường xuất hiện khi điều kiện đo không được kiểm soát đầy đủ hoặc khi phương tiện đo tạo ra tín hiệu của chính nó. Như sẽ phân tích ở Chương 3, nhiều “hoạt tính” được ghi nhận trong thử nghiệm sinh học thuộc loại giả tượng: tín hiệu đo là có thật, nhưng nguyên nhân của nó không phải là cơ chế mà người nghiên cứu gán cho hợp chất.</w:t>
       </w:r>
     </w:p>
     <w:p>
@@ -4174,7 +4061,7 @@
         <w:rPr>
           <w:rFonts w:ascii="Times New Roman" w:hAnsi="Times New Roman" w:eastAsia="Times New Roman" w:cs="Times New Roman"/>
         </w:rPr>
-        <w:t>1.4.1. Sự thống nhất giữa bản chất và hiện tượng</w:t>
+        <w:t>1.3.3. Một minh họa hóa học</w:t>
       </w:r>
     </w:p>
     <w:p>
@@ -4186,7 +4073,31 @@
         <w:rPr>
           <w:rFonts w:ascii="Times New Roman" w:hAnsi="Times New Roman" w:eastAsia="Times New Roman" w:cs="Times New Roman"/>
         </w:rPr>
-        <w:t>Bản chất và hiện tượng thống nhất với nhau: bản chất bao giờ cũng bộc lộ ra thông qua hiện tượng, còn hiện tượng bao giờ cũng là sự biểu hiện của một bản chất nhất định. Không có bản chất thuần túy tồn tại tách rời hiện tượng, cũng không có hiện tượng hoàn toàn không biểu hiện bản chất. V.I. Lênin viết: “Bản chất hiện ra, hiện tượng là có tính bản chất” [4]. Sự thống nhất còn thể hiện ở chỗ bản chất và hiện tượng về căn bản phù hợp với nhau: bản chất nào thì hiện tượng ấy; khi bản chất thay đổi thì hiện tượng biểu hiện nó cũng thay đổi theo; khi bản chất mất đi thì hiện tượng tương ứng cũng mất đi [2]. Chính sự thống nhất này là cơ sở khách quan cho khả năng nhận thức bản chất thông qua việc nghiên cứu hiện tượng, và là cơ sở để bác bỏ bất khả tri luận.</w:t>
+        <w:t>Quan hệ giữa bản chất và hiện tượng có thể được minh họa bằng tính acid của dung dịch. Tính acid biểu hiện ra qua giá trị pH đo được, màu của chất chỉ thị hay tốc độ phản ứng với kim loại; đó là những hiện tượng. Bản chất của tính acid là khả năng cho proton, được quy định bởi cấu trúc electron và độ bền của base liên hợp, thể hiện định lượng qua hằng số pK</w:t>
+      </w:r>
+      <w:r>
+        <w:rPr>
+          <w:rFonts w:ascii="Times New Roman" w:hAnsi="Times New Roman" w:eastAsia="Times New Roman" w:cs="Times New Roman"/>
+          <w:vertAlign w:val="subscript"/>
+        </w:rPr>
+        <w:t>a</w:t>
+      </w:r>
+      <w:r>
+        <w:rPr>
+          <w:rFonts w:ascii="Times New Roman" w:hAnsi="Times New Roman" w:eastAsia="Times New Roman" w:cs="Times New Roman"/>
+        </w:rPr>
+        <w:t>. Cùng một bản chất có thể biểu hiện thành những hiện tượng khác nhau tùy dung môi, nồng độ và nhiệt độ; ngược lại, cùng một hiện tượng (một giá trị pH) có thể xuất phát từ những bản chất khác nhau, chẳng hạn một acid mạnh ở nồng độ thấp và một acid yếu ở nồng độ cao. Minh họa này cho thấy không thể suy trực tiếp từ một hiện tượng riêng lẻ ra bản chất, mà phải xem xét hiện tượng trong hệ thống các điều kiện sinh ra nó.</w:t>
+      </w:r>
+    </w:p>
+    <w:p>
+      <w:pPr>
+        <w:pStyle w:val="Heading2"/>
+      </w:pPr>
+      <w:r>
+        <w:rPr>
+          <w:rFonts w:ascii="Times New Roman" w:hAnsi="Times New Roman" w:eastAsia="Times New Roman" w:cs="Times New Roman"/>
+        </w:rPr>
+        <w:t>1.4. Mối quan hệ biện chứng giữa bản chất và hiện tượng</w:t>
       </w:r>
     </w:p>
     <w:p>
@@ -4197,7 +4108,7 @@
         <w:rPr>
           <w:rFonts w:ascii="Times New Roman" w:hAnsi="Times New Roman" w:eastAsia="Times New Roman" w:cs="Times New Roman"/>
         </w:rPr>
-        <w:t>1.4.2. Sự đối lập giữa bản chất và hiện tượng</w:t>
+        <w:t>1.4.1. Sự thống nhất giữa bản chất và hiện tượng</w:t>
       </w:r>
     </w:p>
     <w:p>
@@ -4209,46 +4120,18 @@
         <w:rPr>
           <w:rFonts w:ascii="Times New Roman" w:hAnsi="Times New Roman" w:eastAsia="Times New Roman" w:cs="Times New Roman"/>
         </w:rPr>
-        <w:t xml:space="preserve">Sự thống nhất giữa bản chất và hiện tượng là sự thống nhất của các mặt đối lập. </w:t>
-      </w:r>
-      <w:r>
-        <w:rPr>
-          <w:rFonts w:ascii="Times New Roman" w:hAnsi="Times New Roman" w:eastAsia="Times New Roman" w:cs="Times New Roman"/>
-          <w:i/>
-        </w:rPr>
-        <w:t>Thứ nhất</w:t>
-      </w:r>
-      <w:r>
-        <w:rPr>
-          <w:rFonts w:ascii="Times New Roman" w:hAnsi="Times New Roman" w:eastAsia="Times New Roman" w:cs="Times New Roman"/>
-        </w:rPr>
-        <w:t xml:space="preserve">, bản chất phản ánh cái chung, cái tất nhiên, quyết định sự tồn tại của sự vật, còn hiện tượng phản ánh cái riêng, cái cá biệt. Cùng một bản chất có thể biểu hiện ra thành nhiều hiện tượng khác nhau tùy theo điều kiện; chẳng hạn, sự chuyển electron trong phản ứng oxy hóa – khử có thể biểu hiện thành sự đổi màu của dung dịch, sự thoát khí, sự tỏa nhiệt hoặc dòng điện trong pin điện hóa. </w:t>
-      </w:r>
-      <w:r>
-        <w:rPr>
-          <w:rFonts w:ascii="Times New Roman" w:hAnsi="Times New Roman" w:eastAsia="Times New Roman" w:cs="Times New Roman"/>
-          <w:i/>
-        </w:rPr>
-        <w:t>Thứ hai</w:t>
-      </w:r>
-      <w:r>
-        <w:rPr>
-          <w:rFonts w:ascii="Times New Roman" w:hAnsi="Times New Roman" w:eastAsia="Times New Roman" w:cs="Times New Roman"/>
-        </w:rPr>
-        <w:t xml:space="preserve">, bản chất là mặt bên trong, không thể nhận biết trực tiếp bằng giác quan; hiện tượng là mặt bên ngoài, có thể quan sát, đo đạc trực tiếp. </w:t>
-      </w:r>
-      <w:r>
-        <w:rPr>
-          <w:rFonts w:ascii="Times New Roman" w:hAnsi="Times New Roman" w:eastAsia="Times New Roman" w:cs="Times New Roman"/>
-          <w:i/>
-        </w:rPr>
-        <w:t>Thứ ba</w:t>
-      </w:r>
-      <w:r>
-        <w:rPr>
-          <w:rFonts w:ascii="Times New Roman" w:hAnsi="Times New Roman" w:eastAsia="Times New Roman" w:cs="Times New Roman"/>
-        </w:rPr>
-        <w:t>, bản chất tương đối ổn định, còn hiện tượng thường xuyên biến đổi. Vì vậy, hiện tượng phong phú hơn bản chất, còn bản chất sâu sắc hơn hiện tượng [1], [2].</w:t>
+        <w:t>Bản chất và hiện tượng thống nhất với nhau: bản chất bao giờ cũng bộc lộ ra thông qua hiện tượng, còn hiện tượng bao giờ cũng là sự biểu hiện của một bản chất nhất định. Không có bản chất thuần túy tồn tại tách rời hiện tượng, cũng không có hiện tượng hoàn toàn không biểu hiện bản chất. V.I. Lênin viết: “Bản chất hiện ra, hiện tượng là có tính bản chất” [4]. Sự thống nhất còn thể hiện ở chỗ bản chất và hiện tượng về căn bản phù hợp với nhau: bản chất nào thì hiện tượng ấy; khi bản chất thay đổi thì hiện tượng biểu hiện nó cũng thay đổi theo; khi bản chất mất đi thì hiện tượng tương ứng cũng mất đi [2]. Chính sự thống nhất này là cơ sở khách quan cho khả năng nhận thức bản chất thông qua việc nghiên cứu hiện tượng, và là cơ sở để bác bỏ bất khả tri luận.</w:t>
+      </w:r>
+    </w:p>
+    <w:p>
+      <w:pPr>
+        <w:pStyle w:val="Heading3"/>
+      </w:pPr>
+      <w:r>
+        <w:rPr>
+          <w:rFonts w:ascii="Times New Roman" w:hAnsi="Times New Roman" w:eastAsia="Times New Roman" w:cs="Times New Roman"/>
+        </w:rPr>
+        <w:t>1.4.2. Sự đối lập giữa bản chất và hiện tượng</w:t>
       </w:r>
     </w:p>
     <w:p>
@@ -4260,18 +4143,46 @@
         <w:rPr>
           <w:rFonts w:ascii="Times New Roman" w:hAnsi="Times New Roman" w:eastAsia="Times New Roman" w:cs="Times New Roman"/>
         </w:rPr>
-        <w:t>Sự đối lập này không tuyệt đối. Tính “bên trong” của bản chất là tương đối với trình độ của phương tiện nhận thức: cấu trúc phân tử từng là cái ẩn giấu đối với hóa học thế kỷ XIX, nhưng ngày nay có thể được “quan sát” gián tiếp bằng phổ cộng hưởng từ hạt nhân hay nhiễu xạ tia X. Khi phương tiện nhận thức phát triển, một phần của bản chất trước đây chuyển thành cái có thể đo đạc, tức là trở thành hiện tượng ở một trình độ mới, và nhận thức lại tiếp tục đi sâu hơn.</w:t>
-      </w:r>
-    </w:p>
-    <w:p>
-      <w:pPr>
-        <w:pStyle w:val="Heading3"/>
-      </w:pPr>
-      <w:r>
-        <w:rPr>
-          <w:rFonts w:ascii="Times New Roman" w:hAnsi="Times New Roman" w:eastAsia="Times New Roman" w:cs="Times New Roman"/>
-        </w:rPr>
-        <w:t>1.4.3. Tính nhiều cấp độ của bản chất</w:t>
+        <w:t xml:space="preserve">Sự thống nhất giữa bản chất và hiện tượng là sự thống nhất của các mặt đối lập. </w:t>
+      </w:r>
+      <w:r>
+        <w:rPr>
+          <w:rFonts w:ascii="Times New Roman" w:hAnsi="Times New Roman" w:eastAsia="Times New Roman" w:cs="Times New Roman"/>
+          <w:i/>
+        </w:rPr>
+        <w:t>Thứ nhất</w:t>
+      </w:r>
+      <w:r>
+        <w:rPr>
+          <w:rFonts w:ascii="Times New Roman" w:hAnsi="Times New Roman" w:eastAsia="Times New Roman" w:cs="Times New Roman"/>
+        </w:rPr>
+        <w:t xml:space="preserve">, bản chất phản ánh cái chung, cái tất nhiên, quyết định sự tồn tại của sự vật, còn hiện tượng phản ánh cái riêng, cái cá biệt. Cùng một bản chất có thể biểu hiện ra thành nhiều hiện tượng khác nhau tùy theo điều kiện; chẳng hạn, sự chuyển electron trong phản ứng oxy hóa – khử có thể biểu hiện thành sự đổi màu của dung dịch, sự thoát khí, sự tỏa nhiệt hoặc dòng điện trong pin điện hóa. </w:t>
+      </w:r>
+      <w:r>
+        <w:rPr>
+          <w:rFonts w:ascii="Times New Roman" w:hAnsi="Times New Roman" w:eastAsia="Times New Roman" w:cs="Times New Roman"/>
+          <w:i/>
+        </w:rPr>
+        <w:t>Thứ hai</w:t>
+      </w:r>
+      <w:r>
+        <w:rPr>
+          <w:rFonts w:ascii="Times New Roman" w:hAnsi="Times New Roman" w:eastAsia="Times New Roman" w:cs="Times New Roman"/>
+        </w:rPr>
+        <w:t xml:space="preserve">, bản chất là mặt bên trong, không thể nhận biết trực tiếp bằng giác quan; hiện tượng là mặt bên ngoài, có thể quan sát, đo đạc trực tiếp. </w:t>
+      </w:r>
+      <w:r>
+        <w:rPr>
+          <w:rFonts w:ascii="Times New Roman" w:hAnsi="Times New Roman" w:eastAsia="Times New Roman" w:cs="Times New Roman"/>
+          <w:i/>
+        </w:rPr>
+        <w:t>Thứ ba</w:t>
+      </w:r>
+      <w:r>
+        <w:rPr>
+          <w:rFonts w:ascii="Times New Roman" w:hAnsi="Times New Roman" w:eastAsia="Times New Roman" w:cs="Times New Roman"/>
+        </w:rPr>
+        <w:t>, bản chất tương đối ổn định, còn hiện tượng thường xuyên biến đổi. Vì vậy, hiện tượng phong phú hơn bản chất, còn bản chất sâu sắc hơn hiện tượng [1], [2].</w:t>
       </w:r>
     </w:p>
     <w:p>
@@ -4283,6 +4194,29 @@
         <w:rPr>
           <w:rFonts w:ascii="Times New Roman" w:hAnsi="Times New Roman" w:eastAsia="Times New Roman" w:cs="Times New Roman"/>
         </w:rPr>
+        <w:t>Sự đối lập này không tuyệt đối. Tính “bên trong” của bản chất là tương đối với trình độ của phương tiện nhận thức: cấu trúc phân tử từng là cái ẩn giấu đối với hóa học thế kỷ XIX, nhưng ngày nay có thể được “quan sát” gián tiếp bằng phổ cộng hưởng từ hạt nhân hay nhiễu xạ tia X. Khi phương tiện nhận thức phát triển, một phần của bản chất trước đây chuyển thành cái có thể đo đạc, tức là trở thành hiện tượng ở một trình độ mới, và nhận thức lại tiếp tục đi sâu hơn.</w:t>
+      </w:r>
+    </w:p>
+    <w:p>
+      <w:pPr>
+        <w:pStyle w:val="Heading3"/>
+      </w:pPr>
+      <w:r>
+        <w:rPr>
+          <w:rFonts w:ascii="Times New Roman" w:hAnsi="Times New Roman" w:eastAsia="Times New Roman" w:cs="Times New Roman"/>
+        </w:rPr>
+        <w:t>1.4.3. Tính nhiều cấp độ của bản chất</w:t>
+      </w:r>
+    </w:p>
+    <w:p>
+      <w:pPr>
+        <w:ind w:firstLine="567"/>
+        <w:jc w:val="both"/>
+      </w:pPr>
+      <w:r>
+        <w:rPr>
+          <w:rFonts w:ascii="Times New Roman" w:hAnsi="Times New Roman" w:eastAsia="Times New Roman" w:cs="Times New Roman"/>
+        </w:rPr>
         <w:t xml:space="preserve">Bản chất có nhiều cấp độ. V.I. Lênin chỉ ra rằng tư tưởng của con người không ngừng đi sâu từ hiện tượng đến bản chất, từ bản chất cấp một đến bản chất cấp hai và cứ thế tiếp tục [4]. Luận điểm này có ba hệ quả phương pháp luận. </w:t>
       </w:r>
       <w:r>
@@ -4309,7 +4243,7 @@
         <w:rPr>
           <w:rFonts w:ascii="Times New Roman" w:hAnsi="Times New Roman" w:eastAsia="Times New Roman" w:cs="Times New Roman"/>
         </w:rPr>
-        <w:t xml:space="preserve">, bản chất ở cấp độ sâu hơn không xóa bỏ mà bao hàm và giải thích bản chất ở cấp độ nông hơn, tức là quan hệ giữa các cấp độ bản chất tuân theo quy luật phủ định biện chứng, có kế thừa. </w:t>
+        <w:t xml:space="preserve">, bản chất ở cấp độ sâu hơn không xóa bỏ mà bao hàm và giải thích bản chất ở cấp độ thấp hơn; quan hệ giữa các cấp độ bản chất vì vậy mang tính chất của phủ định biện chứng, tức là có kế thừa và có tính tiến lên. </w:t>
       </w:r>
       <w:r>
         <w:rPr>
@@ -5038,7 +4972,7 @@
         <w:rPr>
           <w:rFonts w:ascii="Times New Roman" w:hAnsi="Times New Roman" w:eastAsia="Times New Roman" w:cs="Times New Roman"/>
         </w:rPr>
-        <w:t>Theo lý luận phản ánh của chủ nghĩa duy vật biện chứng, nhận thức là quá trình phản ánh tích cực, sáng tạo hiện thực khách quan vào bộ óc con người trên cơ sở thực tiễn. V.I. Lênin đã khái quát: “Từ trực quan sinh động đến tư duy trừu tượng, và từ tư duy trừu tượng đến thực tiễn – đó là con đường biện chứng của sự nhận thức chân lý, của sự nhận thức thực tại khách quan” [4]. Ở giai đoạn nhận thức cảm tính, thông qua cảm giác, tri giác và biểu tượng, con người tiếp nhận hiện tượng. Ở giai đoạn nhận thức lý tính, thông qua khái niệm, phán đoán và suy luận, con người trừu tượng hóa khỏi những yếu tố ngẫu nhiên, cá biệt để nắm bắt cái chung, cái tất nhiên, tức là bản chất [2].</w:t>
+        <w:t>Theo lý luận phản ánh của chủ nghĩa duy vật biện chứng, nhận thức là quá trình phản ánh tích cực, sáng tạo hiện thực khách quan vào bộ óc con người trên cơ sở thực tiễn. V.I. Lênin đã khái quát: “Từ trực quan sinh động đến tư duy trừu tượng, và từ tư duy trừu tượng đến thực tiễn – đó là con đường biện chứng của sự nhận thức chân lý, của sự nhận thức thực tại khách quan” [4]. Ở giai đoạn nhận thức cảm tính, thông qua cảm giác, tri giác và biểu tượng, con người tiếp nhận hiện tượng. Ở giai đoạn nhận thức lý tính, thông qua khái niệm, phán đoán và suy lý, con người trừu tượng hóa khỏi những yếu tố ngẫu nhiên, cá biệt để nắm bắt cái chung, cái tất nhiên, tức là bản chất [2].</w:t>
       </w:r>
     </w:p>
     <w:p>
@@ -5050,7 +4984,7 @@
         <w:rPr>
           <w:rFonts w:ascii="Times New Roman" w:hAnsi="Times New Roman" w:eastAsia="Times New Roman" w:cs="Times New Roman"/>
         </w:rPr>
-        <w:t>Hai giai đoạn này thống nhất với nhau. Nhận thức lý tính phải dựa trên tài liệu do nhận thức cảm tính cung cấp; tách khỏi hiện tượng, tư duy trừu tượng dễ rơi vào tư biện. Ngược lại, nhận thức cảm tính chỉ đem lại hiện tượng; dừng lại ở đó, nhận thức rơi vào chủ nghĩa kinh nghiệm hẹp hòi. Trong khoa học thực nghiệm hiện đại, nhận thức cảm tính được mở rộng bằng các thiết bị đo; do đó, “hiện tượng” mà nhà khoa học tiếp nhận không còn là cảm giác trực tiếp, mà là tín hiệu đã được thiết bị và các giả định lý thuyết trung gian. Điều này làm tăng khả năng tiếp cận bản chất, nhưng cũng làm xuất hiện những dạng giả tượng mới gắn với chính phương tiện đo.</w:t>
+        <w:t>Hai giai đoạn này thống nhất với nhau. Nhận thức lý tính phải dựa trên tài liệu do nhận thức cảm tính cung cấp; tuyệt đối hóa vai trò của tư duy trừu tượng, tách nó khỏi hiện tượng, là lập trường của chủ nghĩa duy lý và dẫn đến lối tư duy tư biện. Ngược lại, nhận thức cảm tính chỉ đem lại hiện tượng; tuyệt đối hóa nó, coi hiện tượng là toàn bộ đối tượng của nhận thức, là lập trường của chủ nghĩa kinh nghiệm. Trong khoa học thực nghiệm hiện đại, nhận thức cảm tính được mở rộng bằng các thiết bị đo; do đó, “hiện tượng” mà nhà khoa học tiếp nhận không còn là cảm giác trực tiếp, mà là tín hiệu được tạo ra thông qua thiết bị đo và phụ thuộc vào các giả định lý thuyết của phép đo. Điều này làm tăng khả năng tiếp cận bản chất, nhưng cũng làm xuất hiện những dạng giả tượng mới gắn với chính phương tiện đo.</w:t>
       </w:r>
     </w:p>
     <w:p>
@@ -5062,7 +4996,7 @@
         <w:rPr>
           <w:rFonts w:ascii="Times New Roman" w:hAnsi="Times New Roman" w:eastAsia="Times New Roman" w:cs="Times New Roman"/>
         </w:rPr>
-        <w:t xml:space="preserve">Điều này không làm mất đi tính khách quan của hiện tượng khoa học. Theo quan điểm duy vật biện chứng, phản ánh là một quá trình tích cực, được trung gian bởi hoạt động thực tiễn; thiết bị đo là sản phẩm của thực tiễn và là sự vật chất hóa của những tri thức đã được kiểm nghiệm. Kết quả đo vì vậy là một hiện tượng khách quan, nhưng là hiện tượng của một </w:t>
+        <w:t xml:space="preserve">Điều này không làm mất đi tính khách quan của hiện tượng khoa học. Theo quan điểm duy vật biện chứng, phản ánh là một quá trình tích cực, diễn ra trên cơ sở và thông qua hoạt động thực tiễn; thiết bị đo là sản phẩm của thực tiễn và là sự vật chất hóa của những tri thức đã được kiểm nghiệm. Kết quả đo vì vậy là một hiện tượng khách quan, nhưng là hiện tượng của một </w:t>
       </w:r>
       <w:r>
         <w:rPr>
@@ -5110,7 +5044,7 @@
         <w:rPr>
           <w:rFonts w:ascii="Times New Roman" w:hAnsi="Times New Roman" w:eastAsia="Times New Roman" w:cs="Times New Roman"/>
         </w:rPr>
-        <w:t>Chân lý là tri thức phù hợp với hiện thực khách quan và được thực tiễn kiểm nghiệm. Chân lý có tính khách quan, tính tương đối và tính tuyệt đối, và tính cụ thể. Mọi tri thức về bản chất đạt được ở một thời điểm đều là chân lý tương đối, đúng trong những điều kiện xác định; tổng số các chân lý tương đối hợp thành chân lý tuyệt đối. Không có chân lý trừu tượng; chân lý luôn luôn là cụ thể, gắn với những điều kiện lịch sử – cụ thể của đối tượng được phản ánh [2].</w:t>
+        <w:t>Chân lý là tri thức phù hợp với hiện thực khách quan và được thực tiễn kiểm nghiệm. Chân lý có các tính chất: tính khách quan, tính tương đối và tính tuyệt đối, tính cụ thể. Mọi tri thức về bản chất đạt được ở một thời điểm đều là chân lý tương đối, đúng trong những điều kiện xác định; theo V.I. Lênin, chân lý tuyệt đối được cấu thành từ tổng số những chân lý tương đối đang phát triển [3]. Không có chân lý trừu tượng; chân lý luôn luôn là cụ thể, gắn với những điều kiện lịch sử – cụ thể của đối tượng được phản ánh [2].</w:t>
       </w:r>
     </w:p>
     <w:p>
@@ -5207,7 +5141,7 @@
         <w:rPr>
           <w:rFonts w:ascii="Times New Roman" w:hAnsi="Times New Roman" w:eastAsia="Times New Roman" w:cs="Times New Roman"/>
         </w:rPr>
-        <w:t>, muốn nhận thức bản chất phải xuất phát từ hiện tượng, vì bản chất chỉ bộc lộ qua hiện tượng. Hơn nữa, cần nghiên cứu nhiều hiện tượng trong nhiều điều kiện khác nhau, vì một hiện tượng riêng lẻ chỉ phản ánh một phương diện của bản chất. Yêu cầu này là sự cụ thể hóa nguyên tắc khách quan và nguyên tắc toàn diện.</w:t>
+        <w:t>, muốn nhận thức bản chất phải xuất phát từ hiện tượng, vì bản chất chỉ bộc lộ qua hiện tượng. Hơn nữa, cần nghiên cứu nhiều hiện tượng trong nhiều điều kiện khác nhau, vì một hiện tượng riêng lẻ chỉ phản ánh một phương diện của bản chất. Yêu cầu này là sự cụ thể hóa nguyên tắc khách quan và quan điểm toàn diện.</w:t>
       </w:r>
     </w:p>
     <w:p>
@@ -5245,7 +5179,7 @@
         <w:rPr>
           <w:rFonts w:ascii="Times New Roman" w:hAnsi="Times New Roman" w:eastAsia="Times New Roman" w:cs="Times New Roman"/>
         </w:rPr>
-        <w:t>, nhận thức bản chất là quá trình đi từ bản chất cấp thấp đến bản chất cấp cao hơn, gắn với những điều kiện lịch sử – cụ thể; thực tiễn là tiêu chuẩn để kiểm nghiệm mức độ đúng đắn của tri thức về bản chất. Yêu cầu này là sự cụ thể hóa nguyên tắc lịch sử – cụ thể, nguyên tắc phát triển và nguyên tắc thống nhất giữa lý luận và thực tiễn.</w:t>
+        <w:t>, nhận thức bản chất là quá trình đi từ bản chất cấp thấp đến bản chất cấp cao hơn, gắn với những điều kiện lịch sử – cụ thể; thực tiễn là tiêu chuẩn để kiểm nghiệm mức độ đúng đắn của tri thức về bản chất. Yêu cầu này là sự cụ thể hóa quan điểm lịch sử – cụ thể, quan điểm phát triển và nguyên tắc thống nhất giữa lý luận và thực tiễn.</w:t>
       </w:r>
     </w:p>
     <w:p>
@@ -5257,7 +5191,7 @@
         <w:rPr>
           <w:rFonts w:ascii="Times New Roman" w:hAnsi="Times New Roman" w:eastAsia="Times New Roman" w:cs="Times New Roman"/>
         </w:rPr>
-        <w:t>Vi phạm các yêu cầu trên dẫn đến hai khuynh hướng sai lầm đối lập nhau. Khuynh hướng thứ nhất là chủ nghĩa kinh nghiệm hẹp hòi: tuyệt đối hóa hiện tượng, coi dữ kiện quan sát được là bản chất, coi số liệu đo được là kết luận. Khuynh hướng thứ hai là chủ nghĩa giáo điều: xuất phát từ những khuôn mẫu, mô hình hoặc quy tắc có sẵn để phán xét sự vật mà không qua phân tích hiện tượng cụ thể. Cả hai khuynh hướng đều là biểu hiện của phương pháp tư duy siêu hình, tách rời bản chất khỏi hiện tượng.</w:t>
+        <w:t>Vi phạm các yêu cầu trên dẫn đến hai khuynh hướng sai lầm đối lập nhau, đều trái với nguyên tắc thống nhất giữa lý luận và thực tiễn. Khuynh hướng thứ nhất là bệnh kinh nghiệm: tuyệt đối hóa kinh nghiệm và hiện tượng, coi dữ kiện quan sát được là bản chất, coi số liệu đo được là kết luận, xem nhẹ vai trò của lý luận. Khuynh hướng thứ hai là bệnh giáo điều: tuyệt đối hóa lý luận, xuất phát từ những khuôn mẫu, mô hình hoặc quy tắc có sẵn để phán xét sự vật mà không qua phân tích hiện tượng cụ thể. Cả hai khuynh hướng đều là biểu hiện của phương pháp tư duy siêu hình: khuynh hướng thứ nhất đồng nhất bản chất với hiện tượng, khuynh hướng thứ hai tách rời bản chất khỏi hiện tượng.</w:t>
       </w:r>
     </w:p>
     <w:p>
@@ -5317,7 +5251,7 @@
         <w:rPr>
           <w:rFonts w:ascii="Times New Roman" w:hAnsi="Times New Roman" w:eastAsia="Times New Roman" w:cs="Times New Roman"/>
         </w:rPr>
-        <w:t>Lịch sử của một khoa học là bằng chứng thực tiễn cho những luận điểm của lý luận nhận thức. Theo nguyên tắc thống nhất giữa lôgíc và lịch sử, con đường mà nhận thức của nhân loại đã đi qua trong một lĩnh vực phản ánh, dưới dạng rút gọn, lôgíc của quá trình đi từ hiện tượng đến bản chất. Chương này phân tích năm trường hợp tiêu biểu của lịch sử hóa học, nhằm làm rõ các luận điểm đã trình bày ở Chương 1 và rút ra những bài học nhận thức luận làm cơ sở cho các chương sau.</w:t>
+        <w:t>Lịch sử của một khoa học là chất liệu thực tiễn để kiểm chứng và làm sáng tỏ những luận điểm của lý luận nhận thức. Theo nguyên tắc thống nhất giữa lôgíc và lịch sử, cái lôgíc là sự phản ánh cái lịch sử dưới hình thức khái quát, đã gạt bỏ những yếu tố ngẫu nhiên; vì vậy, con đường mà nhận thức của nhân loại đã đi qua trong một lĩnh vực cho phép làm rõ lôgíc của quá trình đi từ hiện tượng đến bản chất. Chương này phân tích năm trường hợp tiêu biểu của lịch sử hóa học, nhằm làm rõ các luận điểm đã trình bày ở Chương 1 và rút ra những bài học nhận thức luận làm cơ sở cho các chương sau.</w:t>
       </w:r>
     </w:p>
     <w:p>
@@ -5377,7 +5311,7 @@
         <w:rPr>
           <w:rFonts w:ascii="Times New Roman" w:hAnsi="Times New Roman" w:eastAsia="Times New Roman" w:cs="Times New Roman"/>
         </w:rPr>
-        <w:t xml:space="preserve">Xét dưới góc độ triết học, trường hợp này minh họa ba luận điểm. </w:t>
+        <w:t xml:space="preserve">Trường hợp này minh họa ba luận điểm của lý luận nhận thức. </w:t>
       </w:r>
       <w:r>
         <w:rPr>
@@ -5403,7 +5337,7 @@
         <w:rPr>
           <w:rFonts w:ascii="Times New Roman" w:hAnsi="Times New Roman" w:eastAsia="Times New Roman" w:cs="Times New Roman"/>
         </w:rPr>
-        <w:t xml:space="preserve">, Priestley và Scheele đã có trong tay hiện tượng mới, nhưng vẫn diễn giải nó bằng khuôn khổ lý thuyết cũ; đây là minh họa cho sự chi phối của hệ thống phạm trù đã có đối với việc tiếp nhận hiện tượng, và cho nguy cơ của chủ nghĩa giáo điều trong nhận thức khoa học. </w:t>
+        <w:t xml:space="preserve">, Priestley và Scheele đã có trong tay hiện tượng mới, nhưng vẫn diễn giải nó bằng khuôn khổ lý thuyết cũ; đây là minh họa cho sự chi phối của hệ thống phạm trù đã có đối với việc tiếp nhận hiện tượng, và cho nguy cơ của bệnh giáo điều trong nhận thức khoa học. </w:t>
       </w:r>
       <w:r>
         <w:rPr>
@@ -5416,7 +5350,7 @@
         <w:rPr>
           <w:rFonts w:ascii="Times New Roman" w:hAnsi="Times New Roman" w:eastAsia="Times New Roman" w:cs="Times New Roman"/>
         </w:rPr>
-        <w:t>, mâu thuẫn giữa lý thuyết đang thống trị và hiện tượng không phù hợp với nó là động lực của sự phát triển nhận thức; việc giải quyết mâu thuẫn đó đã dẫn đến một bước nhảy về chất trong hóa học.</w:t>
+        <w:t>, mâu thuẫn giữa lý thuyết đang giữ vai trò chủ đạo và hiện tượng không phù hợp với nó là động lực của sự phát triển nhận thức; việc giải quyết mâu thuẫn đó đã dẫn đến một bước nhảy về chất trong hóa học.</w:t>
       </w:r>
     </w:p>
     <w:p>
@@ -5463,7 +5397,7 @@
         <w:rPr>
           <w:rFonts w:ascii="Times New Roman" w:hAnsi="Times New Roman" w:eastAsia="Times New Roman" w:cs="Times New Roman"/>
         </w:rPr>
-        <w:t>Trường hợp này minh họa rõ luận điểm về các cấp độ của bản chất. Sự lặp lại của các tính chất là hiện tượng. Định luật tuần hoàn theo khối lượng nguyên tử là bản chất cấp một, đủ để dự báo những nguyên tố chưa biết. Quan hệ với điện tích hạt nhân là bản chất cấp hai, giải thích được các trường hợp đảo ngược. Cấu hình electron là bản chất cấp ba, giải thích vì sao có sự tuần hoàn. Mỗi cấp độ sau không bác bỏ mà bao hàm và giới hạn phạm vi đúng của cấp độ trước, đúng với tính chất phủ định biện chứng có kế thừa. Đáng chú ý là các “ngoại lệ”, tức những hiện tượng không khớp với bản chất cấp một, lại chính là đầu mối dẫn đến bản chất cấp hai. Đồng thời, định luật tuần hoàn theo điện tích hạt nhân là một minh họa của quy luật lượng – chất: sự thay đổi một đơn vị điện tích hạt nhân dẫn đến một nguyên tố mới, tức là một chất mới.</w:t>
+        <w:t>Trường hợp này minh họa rõ luận điểm về các cấp độ của bản chất. Sự lặp lại của các tính chất là hiện tượng. Định luật tuần hoàn theo khối lượng nguyên tử là bản chất cấp một, đủ để dự báo những nguyên tố chưa biết. Quan hệ với điện tích hạt nhân là bản chất cấp hai, giải thích được các trường hợp đảo ngược. Cấu hình electron là bản chất cấp ba, giải thích vì sao có sự tuần hoàn. Mỗi cấp độ sau không bác bỏ mà bao hàm và giới hạn phạm vi đúng của cấp độ trước, đúng với tính chất phủ định biện chứng có kế thừa. Đáng chú ý là các “ngoại lệ”, tức những hiện tượng không khớp với bản chất cấp một, lại chính là đầu mối dẫn đến bản chất cấp hai. Đồng thời, định luật tuần hoàn theo điện tích hạt nhân là một minh họa của quy luật chuyển hóa từ những thay đổi về lượng thành những thay đổi về chất: điện tích hạt nhân tăng thêm một đơn vị (thay đổi về lượng) làm xuất hiện một nguyên tố mới với những thuộc tính khác (thay đổi về chất).</w:t>
       </w:r>
     </w:p>
     <w:p>
@@ -5511,7 +5445,7 @@
         <w:rPr>
           <w:rFonts w:ascii="Times New Roman" w:hAnsi="Times New Roman" w:eastAsia="Times New Roman" w:cs="Times New Roman"/>
         </w:rPr>
-        <w:t>Ba thuyết này không phải là ba quan niệm loại trừ nhau, mà là ba cấp độ nhận thức bản chất của cùng một nhóm hiện tượng (Bảng 2.1). Thuyết sau bao hàm thuyết trước như một trường hợp riêng: mọi acid Arrhenius đều là acid Brønsted – Lowry, và mọi phản ứng trao đổi proton đều có thể được mô tả như tương tác cho – nhận cặp electron. Đây là biểu hiện của quy luật phủ định của phủ định trong sự phát triển của nhận thức: cái mới phủ định cái cũ nhưng giữ lại những yếu tố hợp lý của nó, và sự phát triển diễn ra theo hướng mở rộng phạm vi hiện tượng được giải thích. Tri thức ở mỗi cấp độ là chân lý tương đối, đúng trong những giới hạn xác định; việc sử dụng thuyết nào tùy thuộc vào điều kiện cụ thể của vấn đề, đúng với tính cụ thể của chân lý.</w:t>
+        <w:t>Ba thuyết này không phải là ba quan niệm loại trừ nhau, mà là ba cấp độ nhận thức bản chất của cùng một nhóm hiện tượng (Bảng 2.1). Thuyết sau bao hàm thuyết trước như một trường hợp riêng: mọi acid Arrhenius đều là acid Brønsted – Lowry, và mọi phản ứng trao đổi proton đều có thể được mô tả như tương tác cho – nhận cặp electron. Đây là biểu hiện của phủ định biện chứng trong sự phát triển của nhận thức: cái mới phủ định cái cũ nhưng kế thừa những yếu tố hợp lý của nó, và sự phát triển diễn ra theo hướng mở rộng phạm vi hiện tượng được giải thích. Tri thức ở mỗi cấp độ là chân lý tương đối, đúng trong những giới hạn xác định; việc sử dụng thuyết nào tùy thuộc vào điều kiện cụ thể của vấn đề, đúng với tính cụ thể của chân lý.</w:t>
       </w:r>
     </w:p>
     <w:p>
@@ -6013,7 +5947,7 @@
         <w:rPr>
           <w:rFonts w:ascii="Times New Roman" w:hAnsi="Times New Roman" w:eastAsia="Times New Roman" w:cs="Times New Roman"/>
         </w:rPr>
-        <w:t>Khái niệm acid Lewis còn cho thấy một bản chất có thể được nhận thức sâu hơn qua những lĩnh vực hiện tượng rất khác nhau. Chẳng hạn, captopril, một thuốc ức chế enzyme chuyển angiotensin, được thiết kế sao cho nhóm thiol của nó liên kết với ion kẽm ở tâm hoạt động của enzyme [18]; tương tác giữa ion kim loại (acid Lewis) và nhóm cho electron (base Lewis) ở đây là một mắt xích trong bản chất của tác dụng dược lý.</w:t>
+        <w:t>Khái niệm acid Lewis còn chứng tỏ rằng một bản chất có thể được nhận thức sâu hơn qua những lĩnh vực hiện tượng rất khác nhau. Chẳng hạn, captopril, một thuốc ức chế enzyme chuyển angiotensin, được thiết kế sao cho nhóm thiol của nó liên kết với ion kẽm ở tâm hoạt động của enzyme [18]; tương tác giữa ion kim loại (acid Lewis) và nhóm cho electron (base Lewis) ở đây là một mắt xích trong bản chất của tác dụng dược lý.</w:t>
       </w:r>
     </w:p>
     <w:p>
@@ -6048,7 +5982,7 @@
         <w:rPr>
           <w:rFonts w:ascii="Times New Roman" w:hAnsi="Times New Roman" w:eastAsia="Times New Roman" w:cs="Times New Roman"/>
         </w:rPr>
-        <w:t>Trường hợp thalidomide cho thấy ý nghĩa thực tiễn của việc dừng lại ở một cấp độ bản chất chưa đầy đủ. Thalidomide được đưa ra thị trường cuối thập niên 1950 như một thuốc an thần và gây dị tật cho hơn 10.000 trẻ em trước khi bị cấm vào năm 1961 [43]. Phân tử thalidomide có một carbon bất đối, và đồng phân S được xác định là đồng phân gây quái thai. Tuy nhiên, hai đồng phân chuyển hóa lẫn nhau nhanh chóng trong dịch cơ thể, nên việc chỉ sử dụng một đồng phân không loại bỏ được nguy cơ [43]. Năm 2010, cereblon được xác định là đích phân tử chính của tác dụng gây quái thai: thalidomide gắn vào cereblon và ức chế phức hợp ubiquitin ligase liên quan [26]. Ở đây, “đồng phân S gây quái thai” là một tri thức về bản chất ở cấp độ lập thể; nhưng nếu dừng lại ở đó, người ta sẽ rút ra kết luận thực tiễn sai lầm rằng chỉ cần tách đồng phân. Chỉ khi xét đến sự chuyển hóa trong cơ thể (điều kiện cụ thể) và đích phân tử (bản chất cấp sâu hơn), tri thức mới đủ để định hướng hành động. Trường hợp này minh họa một cách bi thảm yêu cầu “căn cứ vào bản chất chứ không căn cứ vào hiện tượng”, và tính cụ thể của chân lý.</w:t>
+        <w:t>Trường hợp thalidomide cho thấy ý nghĩa thực tiễn của việc dừng lại ở một cấp độ bản chất chưa đầy đủ. Thalidomide được đưa ra thị trường cuối thập niên 1950 như một thuốc an thần và gây dị tật cho hơn 10.000 trẻ em trước khi bị cấm vào năm 1961 [43]. Phân tử thalidomide có một carbon bất đối, và đồng phân S được xác định là đồng phân gây quái thai. Tuy nhiên, hai đồng phân chuyển hóa lẫn nhau nhanh chóng trong dịch cơ thể, nên việc chỉ sử dụng một đồng phân không loại bỏ được nguy cơ [43]. Năm 2010, cereblon được xác định là đích phân tử chính của tác dụng gây quái thai: thalidomide gắn vào cereblon và ức chế phức hợp ubiquitin ligase liên quan [26]. Ở đây, “đồng phân S gây quái thai” là một tri thức về bản chất ở cấp độ lập thể; nhưng nếu dừng lại ở đó, người ta sẽ rút ra kết luận thực tiễn sai lầm rằng chỉ cần tách đồng phân. Chỉ khi xét đến sự chuyển hóa trong cơ thể (điều kiện cụ thể) và đích phân tử (bản chất cấp sâu hơn), tri thức mới đủ để định hướng hành động. Với những hậu quả thực tiễn đã được ghi nhận, trường hợp này là minh chứng cho yêu cầu “căn cứ vào bản chất chứ không căn cứ vào hiện tượng” và cho tính cụ thể của chân lý.</w:t>
       </w:r>
     </w:p>
     <w:p>
@@ -6109,7 +6043,7 @@
         <w:rPr>
           <w:rFonts w:ascii="Times New Roman" w:hAnsi="Times New Roman" w:eastAsia="Times New Roman" w:cs="Times New Roman"/>
         </w:rPr>
-        <w:t xml:space="preserve"> được đo ngày nay thuộc về tầng hiện tượng nông nhất của nhận thức về tương tác enzyme – chất ức chế.</w:t>
+        <w:t xml:space="preserve"> được đo ngày nay mới thuộc về cấp độ hiện tượng, tức cấp độ ban đầu của nhận thức về tương tác enzyme – chất ức chế.</w:t>
       </w:r>
     </w:p>
     <w:p>
@@ -6132,7 +6066,7 @@
         <w:rPr>
           <w:rFonts w:ascii="Times New Roman" w:hAnsi="Times New Roman" w:eastAsia="Times New Roman" w:cs="Times New Roman"/>
         </w:rPr>
-        <w:t>Các trường hợp trên còn cho thấy vai trò của phương tiện nhận thức. Trong thế kỷ XIX, cấu tạo phân tử là một bản chất chỉ có thể được suy ra một cách gián tiếp từ thành phần nguyên tố, số lượng đồng phân và các phản ứng hóa học [13]. Trong thế kỷ XX, nhiễu xạ tia X và các phương pháp phổ, trong đó có phổ cộng hưởng từ hạt nhân, cho phép xác định cấu trúc một cách trực tiếp hơn; việc xác định cấu trúc không gian của lysozyme năm 1965 là một mốc của quá trình này đối với enzyme [12]. Cái từng là bản chất ẩn giấu đã trở thành đối tượng của phép đo, tức là trở thành hiện tượng ở một trình độ mới. Quá trình này minh họa luận điểm của V.I. Lênin rằng không có ranh giới về nguyên tắc giữa hiện tượng và vật tự nó, mà chỉ có ranh giới giữa cái đã biết và cái chưa biết [3].</w:t>
+        <w:t>Các trường hợp trên đồng thời làm rõ vai trò của phương tiện nhận thức. Trong thế kỷ XIX, cấu tạo phân tử là một bản chất chỉ có thể được suy ra một cách gián tiếp từ thành phần nguyên tố, số lượng đồng phân và các phản ứng hóa học [13]. Trong thế kỷ XX, nhiễu xạ tia X và các phương pháp phổ, trong đó có phổ cộng hưởng từ hạt nhân, cho phép xác định cấu trúc một cách trực tiếp hơn; việc xác định cấu trúc không gian của lysozyme năm 1965 là một mốc của quá trình này đối với enzyme [12]. Cái từng là bản chất ẩn giấu đã trở thành đối tượng của phép đo, tức là trở thành hiện tượng ở một trình độ mới. Quá trình này minh họa luận điểm của V.I. Lênin rằng không có sự khác nhau về nguyên tắc giữa hiện tượng và vật tự nó, mà chỉ có sự khác nhau giữa cái đã được nhận thức và cái chưa được nhận thức [3].</w:t>
       </w:r>
     </w:p>
     <w:p>
@@ -6144,7 +6078,7 @@
         <w:rPr>
           <w:rFonts w:ascii="Times New Roman" w:hAnsi="Times New Roman" w:eastAsia="Times New Roman" w:cs="Times New Roman"/>
         </w:rPr>
-        <w:t>Tuy nhiên, phương tiện nhận thức không phải là một “cửa sổ trong suốt” mở vào bản chất. Mỗi phương pháp đo dựa trên những giả định lý thuyết nhất định và có những giới hạn riêng, do đó có thể tạo ra những giả tượng đặc thù. Vì vậy, sự phát triển của phương tiện nhận thức vừa mở rộng khả năng tiếp cận bản chất, vừa đặt ra yêu cầu phải hiểu rõ bản chất của chính phương tiện ấy. Đây là một biểu hiện của tính biện chứng trong nhận thức: mỗi bước tiến giải quyết một mâu thuẫn cũ đồng thời làm nảy sinh những mâu thuẫn mới, và nhận thức phát triển thông qua việc giải quyết liên tục các mâu thuẫn đó.</w:t>
+        <w:t>Tuy nhiên, phương tiện nhận thức không phải là một khâu trung gian trung lập giữa chủ thể và khách thể. Mỗi phương pháp đo dựa trên những giả định lý thuyết nhất định và có những giới hạn riêng, do đó có thể tạo ra những giả tượng đặc thù. Vì vậy, sự phát triển của phương tiện nhận thức vừa mở rộng khả năng tiếp cận bản chất, vừa đặt ra yêu cầu phải hiểu rõ bản chất của chính phương tiện ấy. Đây là một biểu hiện của tính biện chứng trong nhận thức: mỗi bước tiến giải quyết một mâu thuẫn cũ đồng thời làm nảy sinh những mâu thuẫn mới, và nhận thức phát triển thông qua việc giải quyết liên tục các mâu thuẫn đó.</w:t>
       </w:r>
     </w:p>
     <w:p>
@@ -6205,7 +6139,7 @@
         <w:rPr>
           <w:rFonts w:ascii="Times New Roman" w:hAnsi="Times New Roman" w:eastAsia="Times New Roman" w:cs="Times New Roman"/>
         </w:rPr>
-        <w:t>, những hiện tượng không phù hợp với lý thuyết đang có, gồm cả những “ngoại lệ” và giả tượng, là đầu mối của nhận thức bản chất sâu hơn. Mâu thuẫn giữa lý thuyết và dữ kiện là động lực của sự phát triển nhận thức; bỏ qua hoặc giải thích gượng ép những mâu thuẫn đó, như cách Priestley diễn giải khí oxy bằng thuyết phlogiston, là biểu hiện của tư duy giáo điều.</w:t>
+        <w:t>, những hiện tượng không phù hợp với lý thuyết đang có, gồm cả những “ngoại lệ” và giả tượng, là đầu mối của nhận thức bản chất sâu hơn. Mâu thuẫn giữa lý thuyết và dữ kiện là động lực của sự phát triển nhận thức; bỏ qua hoặc giải thích gượng ép những mâu thuẫn đó, như cách Priestley diễn giải khí oxy bằng thuyết phlogiston, là biểu hiện của bệnh giáo điều.</w:t>
       </w:r>
     </w:p>
     <w:p>
@@ -6311,6 +6245,18 @@
           <w:rFonts w:ascii="Times New Roman" w:hAnsi="Times New Roman" w:eastAsia="Times New Roman" w:cs="Times New Roman"/>
         </w:rPr>
         <w:t>THỰC TRẠNG ĐÁNH GIÁ HOẠT TÍNH ỨC CHẾ ENZYME CỦA HỢP CHẤT THIÊN NHIÊN DƯỚI GÓC ĐỘ CẶP PHẠM TRÙ BẢN CHẤT VÀ HIỆN TƯỢNG</w:t>
+      </w:r>
+    </w:p>
+    <w:p>
+      <w:pPr>
+        <w:ind w:firstLine="567"/>
+        <w:jc w:val="both"/>
+      </w:pPr>
+      <w:r>
+        <w:rPr>
+          <w:rFonts w:ascii="Times New Roman" w:hAnsi="Times New Roman" w:eastAsia="Times New Roman" w:cs="Times New Roman"/>
+        </w:rPr>
+        <w:t>Chương này vận dụng các yêu cầu phương pháp luận ở Chương 1 và các bài học nhận thức luận ở Chương 2 để phân tích thực trạng, nguyên nhân và hệ quả của việc đồng nhất hiện tượng với bản chất trong lĩnh vực này.</w:t>
       </w:r>
     </w:p>
     <w:p>
@@ -7100,20 +7046,7 @@
         <w:rPr>
           <w:rFonts w:ascii="Times New Roman" w:hAnsi="Times New Roman" w:eastAsia="Times New Roman" w:cs="Times New Roman"/>
         </w:rPr>
-        <w:t xml:space="preserve"> đối với lipase tụy, các tác giả đã trình bày bằng chứng về tính chọn lọc (không ức chế phospholipase A</w:t>
-      </w:r>
-      <w:r>
-        <w:rPr>
-          <w:rFonts w:ascii="Times New Roman" w:hAnsi="Times New Roman" w:eastAsia="Times New Roman" w:cs="Times New Roman"/>
-          <w:vertAlign w:val="subscript"/>
-        </w:rPr>
-        <w:t>2</w:t>
-      </w:r>
-      <w:r>
-        <w:rPr>
-          <w:rFonts w:ascii="Times New Roman" w:hAnsi="Times New Roman" w:eastAsia="Times New Roman" w:cs="Times New Roman"/>
-        </w:rPr>
-        <w:t xml:space="preserve"> và trypsin ở nồng độ 200 μM), về cơ chế (cấu trúc β-lacton có thể là nguyên nhân của sự ức chế không thuận nghịch) và về tác dụng </w:t>
+        <w:t xml:space="preserve"> đối với lipase tụy, các tác giả đã trình bày bằng chứng về tính chọn lọc, về cơ chế ức chế không thuận nghịch gắn với cấu trúc β-lacton và về tác dụng </w:t>
       </w:r>
       <w:r>
         <w:rPr>
@@ -7126,7 +7059,7 @@
         <w:rPr>
           <w:rFonts w:ascii="Times New Roman" w:hAnsi="Times New Roman" w:eastAsia="Times New Roman" w:cs="Times New Roman"/>
         </w:rPr>
-        <w:t xml:space="preserve"> (ức chế hấp thu triolein ở chuột theo liều) [46]. Acarbose được đưa vào điều trị đái tháo đường type 2 từ năm 1990 sau một quá trình phát triển dài, bao gồm cả công nghệ lên men quy mô lớn [45]. Galantamine đi từ tri thức địa phương ở vùng Kavkaz đến sử dụng lâm sàng trong điều trị bệnh Alzheimer [23]. Sự phát triển các statin gắn liền với việc xác lập mối quan hệ nhân quả giữa cholesterol máu và bệnh mạch vành [20]. Captopril được thiết kế trên cơ sở hiểu biết về cơ chế xúc tác của enzyme đích [18]. Như vậy, trong thực tiễn phát triển thuốc, một hợp chất chỉ trở thành thuốc khi tri thức về nó đã đạt đến những cấp độ bản chất đủ sâu; khả năng chỉ chuyển thành hiện thực khi hội đủ các điều kiện cần thiết.</w:t>
+        <w:t xml:space="preserve"> trên chuột [46]. Acarbose được đưa vào điều trị đái tháo đường type 2 từ năm 1990 sau một quá trình phát triển dài, bao gồm cả công nghệ lên men quy mô lớn [45]. Galantamine đi từ tri thức địa phương ở vùng Kavkaz đến sử dụng lâm sàng trong điều trị bệnh Alzheimer [23]. Sự phát triển các statin gắn liền với việc xác lập mối quan hệ nhân quả giữa cholesterol máu và bệnh mạch vành [20]. Captopril được thiết kế trên cơ sở hiểu biết về cơ chế xúc tác của enzyme đích [18]. Như vậy, trong thực tiễn phát triển thuốc, một hợp chất chỉ trở thành thuốc khi tri thức về nó đã đạt đến những cấp độ bản chất đủ sâu; khả năng chỉ chuyển thành hiện thực khi hội đủ các điều kiện cần thiết.</w:t>
       </w:r>
     </w:p>
     <w:p>
@@ -7874,7 +7807,7 @@
         <w:rPr>
           <w:rFonts w:ascii="Times New Roman" w:hAnsi="Times New Roman" w:eastAsia="Times New Roman" w:cs="Times New Roman"/>
         </w:rPr>
-        <w:t>Xét theo cặp phạm trù bản chất và hiện tượng, quy trình này có cấu trúc nhiều tầng. Hiện tượng trực tiếp là tín hiệu quang học ghi nhận trên thiết bị; nó đã là sản phẩm của sự trung gian bởi thiết bị và bởi những giả định về phản ứng chỉ thị. IC</w:t>
+        <w:t>Xét theo cặp phạm trù bản chất và hiện tượng, quy trình này có cấu trúc nhiều tầng. Hiện tượng trực tiếp là tín hiệu quang học ghi nhận trên thiết bị; nó được tạo ra thông qua thiết bị đo và phụ thuộc vào những giả định về phản ứng chỉ thị. IC</w:t>
       </w:r>
       <w:r>
         <w:rPr>
@@ -7921,7 +7854,7 @@
         <w:rPr>
           <w:rFonts w:ascii="Times New Roman" w:hAnsi="Times New Roman" w:eastAsia="Times New Roman" w:cs="Times New Roman"/>
         </w:rPr>
-        <w:t>McGovern và cộng sự nghiên cứu 45 hợp chất được xác định là có hoạt tính trong các chiến dịch sàng lọc thông lượng cao và sàng lọc ảo, và cho thấy 35 hợp chất đồng thời ức chế nhiều enzyme mô hình không liên quan với nhau. Hoạt tính ức chế này giảm mạnh khi thêm albumin hoặc khi tăng nồng độ enzyme lên 10 lần; các hợp chất tạo thành những hạt có đường kính 30–400 nm, quan sát được bằng tán xạ ánh sáng và kính hiển vi điện tử. Trong số đó có quercetin, một flavonoid phổ biến trong thực vật [33]. Ở nồng độ micromol, các phân tử này tự kết tụ thành hạt keo, hấp phụ protein và gây ức chế không đặc hiệu [41]. Trong một chiến dịch sàng lọc 70.563 hợp chất, Feng và cộng sự ghi nhận 1.274 chất ức chế, trong đó 1.204 chất có hoạt tính nhạy với chất hoạt động bề mặt, tức khoảng 95% số chất có hoạt tính thuộc loại ức chế do kết tập [22]. Irwin và cộng sự ước tính 5,1% số phối tử được báo cáo có hoạt tính trong khoảng 0,1–10 μM trong tài liệu hóa dược có độ tương đồng cao với các chất kết tập đã biết [25].</w:t>
+        <w:t>McGovern và cộng sự nghiên cứu 45 hợp chất được xác định là có hoạt tính trong các chiến dịch sàng lọc thông lượng cao và sàng lọc ảo, và cho thấy 35 hợp chất đồng thời ức chế nhiều enzyme mô hình không liên quan với nhau. Hoạt tính ức chế này giảm mạnh khi thêm albumin hoặc khi tăng nồng độ enzyme lên 10 lần, và các hạt kết tập được phát hiện trực tiếp bằng tán xạ ánh sáng. Trong số đó có quercetin, một flavonoid phổ biến trong thực vật [33]. Ở nồng độ micromol, các phân tử này tự kết tụ thành hạt keo, hấp phụ protein và gây ức chế không đặc hiệu [41]. Trong một chiến dịch sàng lọc 70.563 hợp chất, Feng và cộng sự ghi nhận 1.274 chất ức chế, trong đó 1.204 chất có hoạt tính nhạy với chất hoạt động bề mặt, tức khoảng 95% số chất có hoạt tính thuộc loại ức chế do kết tập [22]. Irwin và cộng sự ước tính 5,1% số phối tử được báo cáo có hoạt tính trong khoảng 0,1–10 μM trong tài liệu hóa dược có độ tương đồng cao với các chất kết tập đã biết [25].</w:t>
       </w:r>
     </w:p>
     <w:p>
@@ -7933,7 +7866,7 @@
         <w:rPr>
           <w:rFonts w:ascii="Times New Roman" w:hAnsi="Times New Roman" w:eastAsia="Times New Roman" w:cs="Times New Roman"/>
         </w:rPr>
-        <w:t>Đây là giả tượng theo đúng nghĩa triết học của khái niệm: sự giảm tín hiệu là có thật và lặp lại được, nhưng nó biểu hiện xuyên tạc bản chất của quá trình. Bản chất ở đây là một hiện tượng hóa lý của hệ keo, không phải tương tác phân tử đặc hiệu mà người nghiên cứu mô tả. Giả tượng này cũng phát sinh từ điều kiện khách quan (nồng độ, lực ion, sự vắng mặt của chất hoạt động bề mặt), và do đó chỉ có thể bị vạch trần bằng cách thay đổi những điều kiện ấy, giống như việc chuyển từ hệ hở sang hệ kín trong thí nghiệm của Lavoisier.</w:t>
+        <w:t>Đây là giả tượng theo đúng nghĩa triết học của khái niệm: sự giảm tín hiệu là có thật và lặp lại được, nhưng nó biểu hiện xuyên tạc bản chất của quá trình. Bản chất của quá trình ở đây là sự hấp phụ enzyme lên hạt keo, một quá trình hóa lý của hệ phân tán, không phải tương tác phân tử đặc hiệu mà người nghiên cứu mô tả. Giả tượng này cũng phát sinh từ điều kiện khách quan (nồng độ, lực ion, sự vắng mặt của chất hoạt động bề mặt), và do đó chỉ có thể được nhận diện bằng cách thay đổi những điều kiện ấy, giống như việc chuyển từ hệ hở sang hệ kín trong thí nghiệm của Lavoisier.</w:t>
       </w:r>
     </w:p>
     <w:p>
@@ -7968,7 +7901,7 @@
         <w:rPr>
           <w:rFonts w:ascii="Times New Roman" w:hAnsi="Times New Roman" w:eastAsia="Times New Roman" w:cs="Times New Roman"/>
         </w:rPr>
-        <w:t>Đối với hợp chất thiên nhiên, Bisson và cộng sự khai thác dữ liệu hơn 80 năm của cơ sở dữ liệu NAPRALERT và chỉ ra rằng chỉ 39 hợp chất chiếm vị trí nổi bật nhất về tần suất xuất hiện và số lượng hoạt tính được báo cáo. Tất cả các hợp chất này đều được gán cho rất nhiều hoạt tính khác nhau, và hơn một nửa không thể giải thích bằng các cơ chế gây nhiễu đã biết đối với thư viện hợp chất tổng hợp; nhóm tác giả gọi chúng là các “thuốc vạn năng chuyển hóa không hợp lệ” (IMPs) [11]. Curcumin là trường hợp tiêu biểu: hợp chất này đã được nghiên cứu trong hơn 120 thử nghiệm lâm sàng, nhưng chưa có thử nghiệm mù đôi, có đối chứng giả dược nào thành công; phân tích hóa dược cho thấy curcumin kém bền, có khả năng phản ứng và hầu như không có sinh khả dụng [35].</w:t>
+        <w:t>Đối với hợp chất thiên nhiên, Bisson và cộng sự khai thác dữ liệu hơn 80 năm của cơ sở dữ liệu NAPRALERT và xác định 39 hợp chất nổi bật về tần suất xuất hiện và số lượng hoạt tính được báo cáo. Các hợp chất này đều được gán cho rất nhiều hoạt tính khác nhau, và hơn một nửa không thể giải thích bằng các cơ chế gây nhiễu đã biết đối với thư viện hợp chất tổng hợp; nhóm tác giả gọi chúng là các “thuốc vạn năng chuyển hóa không hợp lệ” (IMPs) [11]. Curcumin là trường hợp tiêu biểu: hợp chất này đã được nghiên cứu trong hơn 120 thử nghiệm lâm sàng, nhưng chưa có thử nghiệm mù đôi, có đối chứng giả dược nào thành công; phân tích hóa dược cho thấy curcumin kém bền, có khả năng phản ứng và hầu như không có sinh khả dụng [35].</w:t>
       </w:r>
     </w:p>
     <w:p>
@@ -7980,7 +7913,7 @@
         <w:rPr>
           <w:rFonts w:ascii="Times New Roman" w:hAnsi="Times New Roman" w:eastAsia="Times New Roman" w:cs="Times New Roman"/>
         </w:rPr>
-        <w:t>Xét dưới góc độ triết học, trường hợp IMPs cho thấy sự đảo lộn quan hệ giữa hiện tượng và bản chất. Phép biện chứng duy vật khẳng định hiện tượng phong phú hơn bản chất; nhưng ở đây, chính sự phong phú của hiện tượng (hoạt tính được ghi nhận trên hàng trăm mô hình) lại bị coi là bằng chứng cho chiều sâu của bản chất (tác dụng dược lý đặc hiệu). Trên thực tế, việc một chất “có tác dụng” với gần như mọi đích là dấu hiệu cho thấy cái được đo là một thuộc tính chung, không đặc hiệu của chất đó, chứ không phải những mối liên hệ tất nhiên với từng đích cụ thể.</w:t>
+        <w:t>Trường hợp IMPs là biểu hiện của sự đảo ngược quan hệ giữa hiện tượng và bản chất trong nhận thức. Phép biện chứng duy vật khẳng định hiện tượng phong phú hơn bản chất; nhưng ở đây, chính sự phong phú của hiện tượng (hoạt tính được ghi nhận trên hàng trăm mô hình) lại bị coi là bằng chứng cho chiều sâu của bản chất (tác dụng dược lý đặc hiệu). Trên thực tế, việc một chất “có tác dụng” với gần như mọi đích là dấu hiệu chứng tỏ cái được đo là một thuộc tính chung, không đặc hiệu của chất đó, chứ không phải những mối liên hệ tất nhiên với từng đích cụ thể.</w:t>
       </w:r>
     </w:p>
     <w:p>
@@ -8016,7 +7949,7 @@
         <w:rPr>
           <w:rFonts w:ascii="Times New Roman" w:hAnsi="Times New Roman" w:eastAsia="Times New Roman" w:cs="Times New Roman"/>
         </w:rPr>
-        <w:t xml:space="preserve"> = 0,13 mM) nhưng không làm chậm hoạt tính của enzyme động vật có vú. Phần lớn các mẫu thực phẩm được khảo sát ức chế enzyme nấm men nhưng không ức chế enzyme của chuột [37]. Tình trạng tương tự được ghi nhận với tyrosinase: khi sàng lọc 50.000 hợp chất trên tyrosinase người tái tổ hợp, Mann và cộng sự nhận thấy hydroquinon và arbutin chỉ ức chế yếu enzyme người, với IC</w:t>
+        <w:t xml:space="preserve"> = 0,13 mM) nhưng không làm chậm hoạt tính của enzyme động vật có vú [37]. Tình trạng tương tự được ghi nhận với tyrosinase: khi sàng lọc 50.000 hợp chất trên tyrosinase người tái tổ hợp, Mann và cộng sự nhận thấy hydroquinon và arbutin chỉ ức chế yếu enzyme người, với IC</w:t>
       </w:r>
       <w:r>
         <w:rPr>
@@ -8029,20 +7962,7 @@
         <w:rPr>
           <w:rFonts w:ascii="Times New Roman" w:hAnsi="Times New Roman" w:eastAsia="Times New Roman" w:cs="Times New Roman"/>
         </w:rPr>
-        <w:t xml:space="preserve"> ở mức milimol, acid kojic có IC</w:t>
-      </w:r>
-      <w:r>
-        <w:rPr>
-          <w:rFonts w:ascii="Times New Roman" w:hAnsi="Times New Roman" w:eastAsia="Times New Roman" w:cs="Times New Roman"/>
-          <w:vertAlign w:val="subscript"/>
-        </w:rPr>
-        <w:t>50</w:t>
-      </w:r>
-      <w:r>
-        <w:rPr>
-          <w:rFonts w:ascii="Times New Roman" w:hAnsi="Times New Roman" w:eastAsia="Times New Roman" w:cs="Times New Roman"/>
-        </w:rPr>
-        <w:t xml:space="preserve"> trên 500 μM; ngược lại, Thiamidol ức chế tyrosinase người với IC</w:t>
+        <w:t xml:space="preserve"> ở mức milimol; ngược lại, Thiamidol ức chế tyrosinase người với IC</w:t>
       </w:r>
       <w:r>
         <w:rPr>
@@ -8080,7 +8000,7 @@
         <w:rPr>
           <w:rFonts w:ascii="Times New Roman" w:hAnsi="Times New Roman" w:eastAsia="Times New Roman" w:cs="Times New Roman"/>
         </w:rPr>
-        <w:t>Những dữ kiện này cho thấy “hoạt tính ức chế α-glucosidase” hay “hoạt tính ức chế tyrosinase” được xác định trên enzyme của nấm men hoặc nấm là một hiện tượng gắn với một mô hình cụ thể. Sai lầm nhận thức luận ở đây là đồng nhất mô hình với đối tượng: mô hình vốn chỉ phản ánh một số mặt của đối tượng trong những giới hạn xác định, nhưng lại được coi như chính đối tượng. Tương tự, một mẫu thử có IC</w:t>
+        <w:t>Những dữ kiện này chứng tỏ “hoạt tính ức chế α-glucosidase” hay “hoạt tính ức chế tyrosinase” được xác định trên enzyme của nấm men hoặc nấm là một hiện tượng gắn với một mô hình cụ thể. Sai lầm nhận thức luận ở đây là đồng nhất mô hình với đối tượng: mô hình vốn chỉ phản ánh một số mặt của đối tượng trong những giới hạn xác định, nhưng lại được coi như chính đối tượng. Tương tự, một mẫu thử có IC</w:t>
       </w:r>
       <w:r>
         <w:rPr>
@@ -8093,7 +8013,7 @@
         <w:rPr>
           <w:rFonts w:ascii="Times New Roman" w:hAnsi="Times New Roman" w:eastAsia="Times New Roman" w:cs="Times New Roman"/>
         </w:rPr>
-        <w:t xml:space="preserve"> thấp hơn acarbose trên enzyme nấm men, hệ mà thuốc này chỉ ức chế yếu, chưa thể được kết luận là mạnh hơn thuốc điều trị. Đây là vi phạm nguyên tắc lịch sử – cụ thể: tri thức đúng trong điều kiện này bị chuyển sang điều kiện khác mà không kiểm chứng.</w:t>
+        <w:t xml:space="preserve"> thấp hơn acarbose trên enzyme nấm men, hệ mà thuốc này chỉ ức chế yếu, chưa thể được kết luận là mạnh hơn thuốc điều trị. Đây là vi phạm quan điểm lịch sử – cụ thể: tri thức đúng trong điều kiện này bị chuyển sang điều kiện khác mà không kiểm chứng.</w:t>
       </w:r>
     </w:p>
     <w:p>
@@ -8116,7 +8036,7 @@
         <w:rPr>
           <w:rFonts w:ascii="Times New Roman" w:hAnsi="Times New Roman" w:eastAsia="Times New Roman" w:cs="Times New Roman"/>
         </w:rPr>
-        <w:t>Một tiền đề ngầm của mọi kết luận về hoạt tính là đối tượng được thử chính là hợp chất đã được xác định cấu trúc. Tiền đề này không phải lúc nào cũng đúng. Hermann và cộng sự phát hiện rằng tạp chất vô cơ, cụ thể là ion kẽm, trong thư viện hợp chất có thể gây tín hiệu dương tính với nhiều đích và nhiều hệ đo khác nhau, và đề xuất dùng chất tạo phức TPEN làm phép thử đối chứng [24]. Pauli và cộng sự nhấn mạnh rằng mô tả đúng về một chất đòi hỏi cả cấu trúc lẫn độ tinh khiết, và cộng hưởng từ hạt nhân định lượng cung cấp một phương pháp đánh giá độ tinh khiết trực giao với sắc ký, có khả năng phát hiện những thành phần thường bị sắc ký bỏ sót [39]. Xét dưới góc độ triết học, khi tạp chất có hoạt tính, hiện tượng quan sát được thực chất là hiện tượng của một sự vật khác; mọi suy luận về bản chất của hợp chất chính khi đó đều mất cơ sở khách quan.</w:t>
+        <w:t>Một tiền đề ngầm của mọi kết luận về hoạt tính là đối tượng được thử chính là hợp chất đã được xác định cấu trúc. Tiền đề này không phải lúc nào cũng đúng. Hermann và cộng sự phát hiện rằng tạp chất vô cơ, cụ thể là ion kẽm, trong thư viện hợp chất có thể gây tín hiệu dương tính với nhiều đích và nhiều hệ đo khác nhau, và đề xuất dùng chất tạo phức TPEN làm phép thử đối chứng [24]. Pauli và cộng sự nhấn mạnh rằng mô tả đúng về một chất đòi hỏi cả cấu trúc lẫn độ tinh khiết, và độ tinh khiết cần được đánh giá bằng phương pháp trực giao với sắc ký như cộng hưởng từ hạt nhân định lượng [39]. Khi tạp chất có hoạt tính, hiện tượng quan sát được thực chất là biểu hiện của một sự vật khác; mọi kết luận về bản chất của hợp chất chính khi đó đều mất cơ sở khách quan, vì nguyên tắc khách quan đã bị vi phạm ngay ở khâu xác định đối tượng được xem xét.</w:t>
       </w:r>
     </w:p>
     <w:p>
@@ -8152,7 +8072,7 @@
         <w:rPr>
           <w:rFonts w:ascii="Times New Roman" w:hAnsi="Times New Roman" w:eastAsia="Times New Roman" w:cs="Times New Roman"/>
         </w:rPr>
-        <w:t xml:space="preserve"> (có thể là giả tượng) được “xác nhận” bằng một điểm số docking thuận lợi, hai hiện tượng thuộc hai hệ khác nhau được đặt cạnh nhau như thể cùng chứng minh một bản chất, trong khi mô hình docking đã mặc định trước rằng hợp chất gắn kết đặc hiệu vào tâm hoạt động, tức là giả định chính điều cần được chứng minh. Về mặt lôgíc, đây là lỗi lập luận vòng quanh; về mặt nhận thức luận, đây là việc coi một mô hình lý thuyết là sự kiểm nghiệm thực tiễn.</w:t>
+        <w:t xml:space="preserve"> (có thể là giả tượng) được “xác nhận” bằng một điểm số docking thuận lợi, hai hiện tượng thuộc hai hệ khác nhau được đặt cạnh nhau như thể cùng chứng minh một bản chất, trong khi mô hình docking đã mặc định trước rằng hợp chất gắn kết đặc hiệu vào tâm hoạt động, tức là giả định chính điều cần được chứng minh. Về mặt lôgíc học, đây là lỗi chứng minh vòng quanh, trong đó luận đề được dùng làm luận cứ cho chính nó; về mặt nhận thức luận, đây là việc coi một mô hình lý thuyết là sự kiểm nghiệm thực tiễn.</w:t>
       </w:r>
     </w:p>
     <w:p>
@@ -8187,7 +8107,7 @@
         <w:rPr>
           <w:rFonts w:ascii="Times New Roman" w:hAnsi="Times New Roman" w:eastAsia="Times New Roman" w:cs="Times New Roman"/>
         </w:rPr>
-        <w:t>Hiện tượng hoạt tính bị mất đi hoặc suy giảm khi phân đoạn, vốn thường gặp trong thực tiễn, cũng cần được xem xét theo quan điểm này. Nó có thể phản ánh bản chất hiệp đồng của tác dụng, sự phân hủy của thành phần hoạt tính trong quá trình phân lập, hoặc cho thấy hoạt tính ban đầu là giả tượng do những chất gây nhiễu tạo ra. Mỗi khả năng đòi hỏi một cách kiểm chứng khác nhau; việc mặc nhiên chọn một cách giải thích mà không kiểm chứng là vi phạm yêu cầu xem xét sự vật trong tổng thể các mối liên hệ của nó.</w:t>
+        <w:t>Hiện tượng hoạt tính bị mất đi hoặc suy giảm khi phân đoạn, vốn thường gặp trong thực tiễn, cũng cần được xem xét theo quan điểm này. Nó có thể phản ánh bản chất hiệp đồng của tác dụng, sự phân hủy của thành phần hoạt tính trong quá trình phân lập, hoặc cho thấy hoạt tính ban đầu là giả tượng do những chất gây nhiễu tạo ra. Mỗi khả năng đòi hỏi một cách kiểm chứng khác nhau; việc mặc nhiên chọn một cách giải thích mà không kiểm chứng là vi phạm quan điểm toàn diện, vốn đòi hỏi xem xét sự vật trong tổng thể các mối liên hệ của nó.</w:t>
       </w:r>
     </w:p>
     <w:p>
@@ -8222,7 +8142,7 @@
         <w:rPr>
           <w:rFonts w:ascii="Times New Roman" w:hAnsi="Times New Roman" w:eastAsia="Times New Roman" w:cs="Times New Roman"/>
         </w:rPr>
-        <w:t>Theo lý luận nhận thức, tính lặp lại là một dấu hiệu của cái tất nhiên, và do đó của bản chất. Một kết quả không lặp lại được khi điều kiện thay đổi nhỏ là dấu hiệu cho thấy nó gắn với những yếu tố ngẫu nhiên, cá biệt của một hệ thí nghiệm cụ thể, tức là thuộc về hiện tượng chứ chưa phải bản chất. Tỷ lệ tái lập thấp vì vậy không chỉ là vấn đề kỹ thuật, mà là biểu hiện ở quy mô lớn của việc đồng nhất hiện tượng với bản chất.</w:t>
+        <w:t>Theo phép biện chứng duy vật, bản chất gắn với cái tất nhiên, và quy luật là mối liên hệ bản chất, tất nhiên, lặp lại trong những điều kiện xác định; do đó, tính lặp lại là một dấu hiệu của bản chất. Một kết quả không lặp lại được khi kiểm chứng độc lập, hoặc mất đi khi điều kiện thay đổi không đáng kể, là dấu hiệu nó gắn với những yếu tố ngẫu nhiên, cá biệt của một hệ thí nghiệm cụ thể, tức là thuộc về hiện tượng chứ chưa phải bản chất. Tỷ lệ tái lập thấp vì vậy không chỉ là vấn đề kỹ thuật, mà là biểu hiện ở quy mô lớn của việc đồng nhất hiện tượng với bản chất.</w:t>
       </w:r>
     </w:p>
     <w:p>
@@ -8305,7 +8225,7 @@
         <w:rPr>
           <w:rFonts w:ascii="Times New Roman" w:hAnsi="Times New Roman" w:eastAsia="Times New Roman" w:cs="Times New Roman"/>
         </w:rPr>
-        <w:t xml:space="preserve">, với bản chất tác dụng của hợp chất; đây là biểu hiện của chủ nghĩa kinh nghiệm hẹp hòi. </w:t>
+        <w:t xml:space="preserve">, với bản chất tác dụng của hợp chất; đây là biểu hiện của bệnh kinh nghiệm. </w:t>
       </w:r>
       <w:r>
         <w:rPr>
@@ -8344,7 +8264,7 @@
         <w:rPr>
           <w:rFonts w:ascii="Times New Roman" w:hAnsi="Times New Roman" w:eastAsia="Times New Roman" w:cs="Times New Roman"/>
         </w:rPr>
-        <w:t>, theo chiều ngược lại, áp dụng máy móc các quy tắc hình thức, chẳng hạn loại bỏ một hợp chất chỉ vì nó mang một nhóm cấu trúc bị cảnh báo; đây là biểu hiện của chủ nghĩa giáo điều. Cả bốn dạng sai lầm đều vi phạm các yêu cầu phương pháp luận đã nêu ở mục 1.7 và đều bắt nguồn từ phương pháp tư duy siêu hình, tách rời bản chất khỏi hiện tượng.</w:t>
+        <w:t>, theo chiều ngược lại, áp dụng máy móc các quy tắc hình thức, chẳng hạn loại bỏ một hợp chất chỉ vì nó mang một nhóm cấu trúc bị cảnh báo; đây là biểu hiện của bệnh giáo điều. Cả bốn dạng sai lầm đều vi phạm các yêu cầu phương pháp luận đã nêu ở mục 1.7 và đều bắt nguồn từ phương pháp tư duy siêu hình, hoặc đồng nhất, hoặc tách rời bản chất và hiện tượng.</w:t>
       </w:r>
     </w:p>
     <w:p>
@@ -8431,7 +8351,7 @@
         <w:rPr>
           <w:rFonts w:ascii="Times New Roman" w:hAnsi="Times New Roman" w:eastAsia="Times New Roman" w:cs="Times New Roman"/>
         </w:rPr>
-        <w:t>Nhận thức khoa học là một hoạt động xã hội, chịu sự chi phối của những điều kiện xã hội cụ thể. Áp lực công bố và xu hướng ưu tiên kết quả dương tính khiến những kết quả chưa được kiểm chứng đầy đủ dễ được đưa vào tài liệu khoa học. Begley và Ellis đã kiến nghị nâng cao chuẩn mực đối với nghiên cứu tiền lâm sàng [10]. Biên tập viên nhiều tạp chí của Hiệp hội Hóa học Hoa Kỳ đã ra xã luận chung, yêu cầu tác giả phân tích khả năng gây nhiễu và, với hợp chất có nguy cơ này, chứng minh hoạt tính bằng ít nhất hai phép thử khác nhau [6]. Những biện pháp này cho thấy việc khắc phục sai lầm nhận thức không chỉ phụ thuộc vào năng lực của từng nhà nghiên cứu, mà còn phụ thuộc vào các chuẩn mực tập thể của cộng đồng khoa học.</w:t>
+        <w:t>Nhận thức khoa học là một hoạt động xã hội, chịu sự chi phối của những điều kiện xã hội cụ thể. Áp lực công bố và xu hướng ưu tiên kết quả dương tính khiến những kết quả chưa được kiểm chứng đầy đủ dễ được đưa vào tài liệu khoa học. Biên tập viên nhiều tạp chí của Hiệp hội Hóa học Hoa Kỳ đã ra xã luận chung, yêu cầu tác giả phân tích khả năng gây nhiễu và, với hợp chất có nguy cơ này, chứng minh hoạt tính bằng ít nhất hai phép thử khác nhau [6]. Những biện pháp này cho thấy việc khắc phục sai lầm nhận thức không chỉ phụ thuộc vào năng lực của từng nhà nghiên cứu, mà còn phụ thuộc vào các chuẩn mực tập thể của cộng đồng khoa học.</w:t>
       </w:r>
     </w:p>
     <w:p>
@@ -8454,7 +8374,7 @@
         <w:rPr>
           <w:rFonts w:ascii="Times New Roman" w:hAnsi="Times New Roman" w:eastAsia="Times New Roman" w:cs="Times New Roman"/>
         </w:rPr>
-        <w:t>Hệ quả của sự đồng nhất hiện tượng với bản chất thể hiện ở ba cấp độ. Ở cấp độ từng công trình, nguồn lực bị dùng cho những ứng viên không có tác dụng thực. Ở cấp độ tài liệu khoa học, dữ liệu không hợp lệ tích lũy dần: tỷ lệ hợp chất có đặc điểm giống chất kết tập trong tài liệu hóa dược đã tăng khoảng 9 lần kể từ năm 1995 [25]; những dữ liệu này lại trở thành tiền đề cho các nghiên cứu tiếp theo, làm cho sai lầm được tái sản xuất. Ở cấp độ phát triển thuốc, khoảng cách giữa kết quả tiền lâm sàng và tác dụng thực trên người làm tăng tỷ lệ thất bại lâm sàng [42]. Xét theo quan hệ giữa lý luận và thực tiễn, đây là trường hợp lý luận (tri thức về hoạt tính) không được thực tiễn kiểm nghiệm đầy đủ trước khi được dùng để định hướng thực tiễn.</w:t>
+        <w:t>Hệ quả của sự đồng nhất hiện tượng với bản chất thể hiện ở ba cấp độ. Ở cấp độ từng công trình, nguồn lực bị dùng cho những ứng viên không có tác dụng thực. Ở cấp độ tài liệu khoa học, dữ liệu không hợp lệ tích lũy dần: tỷ lệ hợp chất có đặc điểm giống chất kết tập trong tài liệu hóa dược đã tăng khoảng 9 lần kể từ năm 1995 [25]; những dữ liệu này lại trở thành tiền đề cho các nghiên cứu tiếp theo, làm cho sai lầm được lặp lại và tích lũy. Ở cấp độ phát triển thuốc, khoảng cách giữa kết quả tiền lâm sàng và tác dụng thực trên người làm tăng tỷ lệ thất bại lâm sàng [42]. Xét theo quan hệ giữa lý luận và thực tiễn, đây là trường hợp lý luận (tri thức về hoạt tính) không được thực tiễn kiểm nghiệm đầy đủ trước khi được dùng để định hướng thực tiễn.</w:t>
       </w:r>
     </w:p>
     <w:p>
@@ -8494,7 +8414,7 @@
         <w:rPr>
           <w:rFonts w:ascii="Times New Roman" w:hAnsi="Times New Roman" w:eastAsia="Times New Roman" w:cs="Times New Roman"/>
         </w:rPr>
-        <w:t xml:space="preserve"> và điểm số docking thuộc về hiện tượng, còn bản chất cần nhận thức là tương tác đặc hiệu giữa phân tử và đích sinh học cùng khả năng tương tác đó diễn ra trong cơ thể. Các dạng giả tượng phổ biến gồm ức chế do kết tập keo, hợp chất gây nhiễu đa phép thử, sự không tương đồng giữa enzyme mô hình và đích sinh học, tạp chất, và việc tuyệt đối hóa kết quả mô phỏng. Nguyên nhân chủ quan của các sai lệch này là phương pháp tư duy siêu hình, biểu hiện dưới hai dạng đối lập là chủ nghĩa kinh nghiệm hẹp hòi và chủ nghĩa giáo điều.</w:t>
+        <w:t xml:space="preserve"> và điểm số docking thuộc về hiện tượng, còn bản chất cần nhận thức là tương tác đặc hiệu giữa phân tử và đích sinh học cùng khả năng tương tác đó diễn ra trong cơ thể. Các giả tượng hoạt tính phát sinh từ điều kiện khách quan của phép thử và chỉ được nhận diện khi các điều kiện ấy được thay đổi có kiểm soát. Nguyên nhân chủ quan của việc đồng nhất hiện tượng với bản chất là phương pháp tư duy siêu hình, biểu hiện dưới hai dạng đối lập là bệnh kinh nghiệm và bệnh giáo điều.</w:t>
       </w:r>
     </w:p>
     <w:p>
@@ -8741,7 +8661,7 @@
         <w:rPr>
           <w:rFonts w:ascii="Times New Roman" w:hAnsi="Times New Roman" w:eastAsia="Times New Roman" w:cs="Times New Roman"/>
         </w:rPr>
-        <w:t>Nguyên tắc này là sự cụ thể hóa của nguyên tắc toàn diện: xem xét sự vật trong tổng thể các mối liên hệ của nó, bao gồm cả mối liên hệ với phương tiện đo và điều kiện đo. Giả tượng là hiện tượng có thật nhưng biểu hiện bản chất dưới dạng xuyên tạc; vì vậy, không thể loại bỏ nó bằng cách bác bỏ dữ liệu, mà phải xác định điều kiện khách quan đã sinh ra nó.</w:t>
+        <w:t>Nguyên tắc này là sự cụ thể hóa của quan điểm toàn diện: xem xét sự vật trong tổng thể các mối liên hệ của nó, bao gồm cả mối liên hệ với phương tiện đo và điều kiện đo. Giả tượng là hiện tượng có thật nhưng biểu hiện bản chất dưới dạng xuyên tạc; vì vậy, không thể loại bỏ nó bằng cách bác bỏ dữ liệu, mà phải xác định điều kiện khách quan đã sinh ra nó.</w:t>
       </w:r>
     </w:p>
     <w:p>
@@ -8765,7 +8685,7 @@
         <w:rPr>
           <w:rFonts w:ascii="Times New Roman" w:hAnsi="Times New Roman" w:eastAsia="Times New Roman" w:cs="Times New Roman"/>
         </w:rPr>
-        <w:t>Tuy nhiên, việc nhận diện giả tượng cũng không được thực hiện một cách máy móc. Các cảnh báo cấu trúc PAINS ban đầu được xây dựng từ sáu phép thử dùng cùng một công nghệ phát hiện; phân tích dữ liệu công khai của Capuzzi và cộng sự cho thấy 97% hợp chất mang cảnh báo PAINS thực tế hiếm khi cho kết quả dương tính trong loại phép thử đó, và 87 thuốc phân tử nhỏ đã được FDA phê duyệt có chứa các cảnh báo này [15]. Một cảnh báo cấu trúc tự nó cũng chỉ là một dấu hiệu thuộc về hình thức; dùng nó để kết luận thay cho thực nghiệm là lặp lại sai lầm đồng nhất hiện tượng với bản chất, chỉ theo chiều ngược lại, và là biểu hiện của chủ nghĩa giáo điều. Kết luận về tính hợp lệ của hoạt tính phải dựa trên các thí nghiệm trực giao [15].</w:t>
+        <w:t>Tuy nhiên, việc nhận diện giả tượng cũng không được thực hiện một cách máy móc. Các cảnh báo cấu trúc PAINS ban đầu được xây dựng từ sáu phép thử dùng cùng một công nghệ phát hiện; phân tích dữ liệu công khai của Capuzzi và cộng sự cho thấy 97% hợp chất mang cảnh báo PAINS thực tế hiếm khi cho kết quả dương tính trong loại phép thử đó, và 87 thuốc phân tử nhỏ đã được FDA phê duyệt có chứa các cảnh báo này [15]. Một cảnh báo cấu trúc tự nó chỉ là một dấu hiệu bên ngoài, có tính xác suất; dùng nó để kết luận thay cho thực nghiệm là lặp lại sai lầm đồng nhất hiện tượng với bản chất, chỉ theo chiều ngược lại, và là biểu hiện của bệnh giáo điều. Kết luận về tính hợp lệ của hoạt tính phải dựa trên các thí nghiệm trực giao [15].</w:t>
       </w:r>
     </w:p>
     <w:p>
@@ -8800,7 +8720,7 @@
         <w:rPr>
           <w:rFonts w:ascii="Times New Roman" w:hAnsi="Times New Roman" w:eastAsia="Times New Roman" w:cs="Times New Roman"/>
         </w:rPr>
-        <w:t>Nguyên tắc này là sự cụ thể hóa của nguyên tắc phát triển: nhận thức không dừng lại ở một trình độ đã đạt được mà không ngừng đi sâu. Trong đánh giá hoạt tính ức chế enzyme, có thể phân biệt các cấp độ bản chất tương ứng với những câu hỏi ngày càng sâu. Bản chất cấp một là sự tồn tại của một tác dụng ức chế đặc hiệu, lặp lại được, sau khi đã loại trừ các giả tượng. Bản chất cấp hai là cơ chế động học của sự ức chế: kiểu ức chế (cạnh tranh, không cạnh tranh, kháng cạnh tranh hay hỗn hợp), giá trị K</w:t>
+        <w:t>Nguyên tắc này là sự cụ thể hóa của quan điểm phát triển: nhận thức không dừng lại ở một trình độ đã đạt được mà không ngừng đi sâu. Trong đánh giá hoạt tính ức chế enzyme, có thể phân biệt các cấp độ bản chất tương ứng với những câu hỏi ngày càng sâu. Bản chất cấp một là sự tồn tại của một tác dụng ức chế đặc hiệu, lặp lại được, sau khi đã loại trừ các giả tượng. Bản chất cấp hai là cơ chế động học của sự ức chế: kiểu ức chế (cạnh tranh, không cạnh tranh, kháng cạnh tranh hay hỗn hợp), giá trị K</w:t>
       </w:r>
       <w:r>
         <w:rPr>
@@ -8850,7 +8770,7 @@
         <w:rPr>
           <w:rFonts w:ascii="Times New Roman" w:hAnsi="Times New Roman" w:eastAsia="Times New Roman" w:cs="Times New Roman"/>
         </w:rPr>
-        <w:t>Một phương tiện quan trọng để tiếp cận bản chất là quan hệ cấu trúc – hoạt tính (SAR). Khi một dãy hợp chất tương tự, thu được từ phân lập hoặc bán tổng hợp, có hoạt tính biến đổi một cách có thể giải thích theo những thay đổi cấu trúc xác định, đó là bằng chứng cho một tương tác đặc hiệu với vị trí gắn kết. Ngược lại, các hợp chất gây nhiễu thường có SAR “phẳng” hoặc không nhất quán [33], [41]; SAR chặt chẽ được xem là tiêu chí quan trọng nhất để phân biệt hợp chất gây nhiễu với phối tử thực [6]. Ở đây, theo quan hệ giữa cái chung và cái riêng, cái chung của một dãy hiện tượng (xu hướng SAR) cho phép nhận ra bản chất mà từng hiện tượng riêng lẻ (một giá trị IC</w:t>
+        <w:t>Một phương tiện quan trọng để tiếp cận bản chất là quan hệ cấu trúc – hoạt tính (SAR). Khi một dãy hợp chất tương tự, thu được từ phân lập hoặc bán tổng hợp, có hoạt tính biến đổi một cách có thể giải thích theo những thay đổi cấu trúc xác định, đó là bằng chứng cho một tương tác đặc hiệu với vị trí gắn kết. Ngược lại, các hợp chất gây nhiễu thường có SAR “phẳng” hoặc không nhất quán [33], [41]; SAR chặt chẽ được xem là tiêu chí quan trọng nhất để phân biệt hợp chất gây nhiễu với phối tử thực [6]. Ở đây, theo quan hệ giữa cái chung và cái riêng, cái chung chỉ tồn tại trong và thông qua cái riêng: xu hướng SAR chỉ bộc lộ qua từng giá trị hoạt tính riêng lẻ, nhưng cho phép nhận ra bản chất mà không giá trị IC</w:t>
       </w:r>
       <w:r>
         <w:rPr>
@@ -8863,7 +8783,7 @@
         <w:rPr>
           <w:rFonts w:ascii="Times New Roman" w:hAnsi="Times New Roman" w:eastAsia="Times New Roman" w:cs="Times New Roman"/>
         </w:rPr>
-        <w:t>) không thể chỉ ra. Cuối cùng, chứng minh sự gắn kết với đích trong môi trường tế bào, chẳng hạn bằng CETSA [27], là bước chuyển từ hệ tinh khiết sang hệ sinh học phức tạp hơn.</w:t>
+        <w:t xml:space="preserve"> riêng lẻ nào tự nó chỉ ra được. Cuối cùng, chứng minh sự gắn kết với đích trong môi trường tế bào, chẳng hạn bằng CETSA [27], là bước chuyển từ hệ tinh khiết sang hệ sinh học phức tạp hơn.</w:t>
       </w:r>
     </w:p>
     <w:p>
@@ -8886,7 +8806,7 @@
         <w:rPr>
           <w:rFonts w:ascii="Times New Roman" w:hAnsi="Times New Roman" w:eastAsia="Times New Roman" w:cs="Times New Roman"/>
         </w:rPr>
-        <w:t>Nguyên tắc này là sự cụ thể hóa của nguyên tắc lịch sử – cụ thể và nguyên tắc thống nhất giữa lý luận và thực tiễn. Hiện tượng luôn tồn tại trong những điều kiện cụ thể, và cách thức bản chất bộc lộ ra phụ thuộc vào các điều kiện đó. Trước hết, phải lựa chọn mô hình thử nghiệm tương ứng với đích sinh học mà kết luận hướng tới. Nếu mục tiêu là đánh giá khả năng kiểm soát đường huyết sau ăn, kết quả trên α-glucosidase nấm men chỉ có giá trị sàng lọc sơ bộ; kết luận cần được kiểm chứng trên α-glucosidase ruột non của động vật có vú hoặc enzyme người tái tổ hợp, với chất đối chứng dương được đo trong cùng hệ thử [37]. Tương tự, kết luận về khả năng làm giảm tăng sắc tố da cần được kiểm chứng trên tyrosinase người [32].</w:t>
+        <w:t>Nguyên tắc này là sự cụ thể hóa của quan điểm lịch sử – cụ thể và nguyên tắc thống nhất giữa lý luận và thực tiễn. Hiện tượng luôn tồn tại trong những điều kiện cụ thể, và cách thức bản chất bộc lộ ra phụ thuộc vào các điều kiện đó. Trước hết, phải lựa chọn mô hình thử nghiệm tương ứng với đích sinh học mà kết luận hướng tới. Nếu mục tiêu là đánh giá khả năng kiểm soát đường huyết sau ăn, kết quả trên α-glucosidase nấm men chỉ có giá trị sàng lọc sơ bộ; kết luận cần được kiểm chứng trên α-glucosidase ruột non của động vật có vú hoặc enzyme người tái tổ hợp, với chất đối chứng dương được đo trong cùng hệ thử [37]. Tương tự, kết luận về khả năng làm giảm tăng sắc tố da cần được kiểm chứng trên tyrosinase người [32].</w:t>
       </w:r>
     </w:p>
     <w:p>
@@ -8962,7 +8882,7 @@
         <w:rPr>
           <w:rFonts w:ascii="Times New Roman" w:hAnsi="Times New Roman" w:eastAsia="Times New Roman" w:cs="Times New Roman"/>
         </w:rPr>
-        <w:t xml:space="preserve">Bản thân tri thức về giả tượng hoạt tính cũng có tính lịch sử: ức chế do kết tập được mô tả có hệ thống năm 2002 [33], cảnh báo PAINS được đề xuất năm 2010 [8], khái niệm IMPs cho hợp chất thiên nhiên được đưa ra năm 2016 [11], và ngay sau đó giới hạn của cảnh báo PAINS lại được chỉ ra [15]. Tiến trình này tái hiện, trong phạm vi hẹp, quy luật phủ định của phủ định trong nhận thức: mỗi tiêu chí mới phủ định tiêu chí cũ nhưng kế thừa yếu tố hợp lý của nó. Nhận thức về bản chất của “hoạt tính” vì vậy là một quá trình đi sâu liên tục. Thực tiễn, bao gồm thực nghiệm </w:t>
+        <w:t xml:space="preserve">Bản thân tri thức về giả tượng hoạt tính cũng có tính lịch sử: ức chế do kết tập được mô tả có hệ thống năm 2002 [33], cảnh báo PAINS được đề xuất năm 2010 [8], khái niệm IMPs cho hợp chất thiên nhiên được đưa ra năm 2016 [11], và ngay sau đó giới hạn của cảnh báo PAINS lại được chỉ ra [15]. Tiến trình này mang hình thức của phủ định của phủ định: từ chỗ chấp nhận trực tiếp kết quả phép thử, nhận thức chuyển sang phủ định nó bằng các tiêu chí cấu trúc; đến lượt mình, việc áp dụng máy móc các tiêu chí cấu trúc bị phủ định khi giới hạn của chúng được chỉ ra, và nhận thức quay trở lại với kết quả thực nghiệm, nhưng ở trình độ cao hơn, tức là với hệ thống các thí nghiệm trực giao. Mỗi lần phủ định đều kế thừa yếu tố hợp lý của giai đoạn trước; nhận thức về bản chất của “hoạt tính” vì vậy là một quá trình đi sâu liên tục. Thực tiễn, bao gồm thực nghiệm </w:t>
       </w:r>
       <w:r>
         <w:rPr>
@@ -10172,7 +10092,7 @@
         <w:rPr>
           <w:rFonts w:ascii="Times New Roman" w:hAnsi="Times New Roman" w:eastAsia="Times New Roman" w:cs="Times New Roman"/>
         </w:rPr>
-        <w:t xml:space="preserve">Điểm quan trọng của tình huống này không nằm ở kịch bản nào sẽ xảy ra, mà ở chỗ trong cả ba kịch bản, kết luận cuối cùng đều khác với kết luận ban đầu. Ở kịch bản A, cái tưởng là bản chất hóa ra là giả tượng. Ở kịch bản B, hiện tượng là có thật nhưng chỉ đúng trong một điều kiện cụ thể, và việc mở rộng nó sang điều kiện khác là vi phạm tính cụ thể của chân lý. Ở kịch bản C, nhận thức đã tiến đến bản chất cấp hai – cấp ba, nhưng kết luận vẫn phải giới hạn ở phạm vi đã được kiểm chứng và để ngỏ bước kiểm nghiệm </w:t>
+        <w:t xml:space="preserve">Điểm quan trọng của tình huống này không nằm ở kịch bản nào sẽ xảy ra, mà ở chỗ trong cả ba kịch bản, kết luận cuối cùng đều khác với kết luận ban đầu. Ở kịch bản A, cái được coi là biểu hiện của bản chất thực chất là giả tượng. Ở kịch bản B, hiện tượng là có thật nhưng chỉ tồn tại trong một điều kiện cụ thể, và việc mở rộng tri thức về nó sang điều kiện khác là vi phạm tính cụ thể của chân lý. Ở kịch bản C, nhận thức đã tiến đến bản chất cấp hai – cấp ba, nhưng kết luận vẫn phải giới hạn ở phạm vi đã được kiểm chứng và để ngỏ bước kiểm nghiệm </w:t>
       </w:r>
       <w:r>
         <w:rPr>
@@ -10378,7 +10298,7 @@
         <w:rPr>
           <w:rFonts w:ascii="Times New Roman" w:hAnsi="Times New Roman" w:eastAsia="Times New Roman" w:cs="Times New Roman"/>
         </w:rPr>
-        <w:t>Chương 4 đã chuyển bốn yêu cầu phương pháp luận của cặp phạm trù bản chất và hiện tượng thành bốn nguyên tắc cho hoạt động đánh giá hoạt tính ức chế enzyme, gắn với các nguyên tắc khách quan, toàn diện, phát triển, lịch sử – cụ thể và thống nhất giữa lý luận và thực tiễn. Các nguyên tắc này được cụ thể hóa thành quy trình sáu cấp độ, với yêu cầu cốt lõi là mức độ khẳng định trong kết luận phải tương xứng với cấp độ bằng chứng đạt được. Tình huống minh họa cho thấy quy trình giúp tránh cả chủ nghĩa kinh nghiệm hẹp hòi lẫn chủ nghĩa giáo điều trong diễn giải kết quả.</w:t>
+        <w:t>Chương 4 đã chuyển bốn yêu cầu phương pháp luận của cặp phạm trù bản chất và hiện tượng thành bốn nguyên tắc cho hoạt động đánh giá hoạt tính ức chế enzyme, gắn với nguyên tắc khách quan, các quan điểm toàn diện, phát triển, lịch sử – cụ thể và nguyên tắc thống nhất giữa lý luận và thực tiễn. Các nguyên tắc này được cụ thể hóa thành quy trình sáu cấp độ, với yêu cầu cốt lõi là mức độ khẳng định trong kết luận phải tương xứng với cấp độ bằng chứng đạt được. Tình huống minh họa cho thấy quy trình giúp tránh cả bệnh kinh nghiệm lẫn bệnh giáo điều trong diễn giải kết quả.</w:t>
       </w:r>
     </w:p>
     <w:p>
@@ -10402,7 +10322,7 @@
         <w:rPr>
           <w:rFonts w:ascii="Times New Roman" w:hAnsi="Times New Roman" w:eastAsia="Times New Roman" w:cs="Times New Roman"/>
         </w:rPr>
-        <w:t>Cặp phạm trù bản chất và hiện tượng phản ánh mối quan hệ giữa mặt bên trong, tất nhiên, tương đối ổn định và mặt bên ngoài, biến đổi, có thể quan sát trực tiếp của sự vật. Lịch sử triết học cho thấy quan hệ này đã được giải quyết theo những lập trường khác nhau, từ sự phân biệt trực quan của triết học cổ đại, qua sự tách rời “hiện tượng” và “vật tự nó” của Cantơ, đến biện chứng duy tâm của Hêghen. Chủ nghĩa duy vật biện chứng khẳng định bản chất và hiện tượng đều tồn tại khách quan, thống nhất và đối lập với nhau; hiện tượng có thể biểu hiện bản chất dưới dạng xuyên tạc, tức là giả tượng; bản chất có nhiều cấp độ; và ranh giới giữa bản chất và hiện tượng là ranh giới lịch sử giữa cái đã biết và cái chưa biết, được dịch chuyển bằng thực tiễn. Từ đó, phép biện chứng duy vật đặt ra yêu cầu nhận thức phải xuất phát từ hiện tượng, phân biệt hiện tượng với giả tượng, không dừng lại ở hiện tượng mà không ngừng đi vào những cấp độ bản chất sâu hơn, và lấy thực tiễn làm tiêu chuẩn kiểm nghiệm. Cặp phạm trù này liên hệ hữu cơ với các cặp phạm trù khác và với ba quy luật cơ bản của phép biện chứng, nên chỉ có thể được vận dụng đúng khi được đặt trong toàn bộ hệ thống của phép biện chứng duy vật.</w:t>
+        <w:t>Cặp phạm trù bản chất và hiện tượng phản ánh mối quan hệ giữa mặt bên trong, tất nhiên, tương đối ổn định và mặt bên ngoài, biến đổi, có thể quan sát trực tiếp của sự vật. Lịch sử triết học cho thấy quan hệ này đã được giải quyết theo những lập trường khác nhau, từ sự phân biệt trực quan của triết học cổ đại, qua sự tách rời “hiện tượng” và “vật tự nó” của Cantơ, đến biện chứng duy tâm của Hêghen. Chủ nghĩa duy vật biện chứng khẳng định bản chất và hiện tượng đều tồn tại khách quan, thống nhất và đối lập với nhau; hiện tượng có thể biểu hiện bản chất dưới dạng xuyên tạc, tức là giả tượng; bản chất có nhiều cấp độ; và ranh giới giữa bản chất và hiện tượng là ranh giới lịch sử giữa cái đã biết và cái chưa biết, được dịch chuyển bằng thực tiễn. Từ đó, phép biện chứng duy vật đặt ra yêu cầu nhận thức phải xuất phát từ hiện tượng, phân biệt hiện tượng với giả tượng, không dừng lại ở hiện tượng mà không ngừng đi vào những cấp độ bản chất sâu hơn, và lấy thực tiễn làm tiêu chuẩn kiểm nghiệm. Cặp phạm trù này có mối liên hệ chặt chẽ với các cặp phạm trù khác và với ba quy luật cơ bản của phép biện chứng, nên chỉ có thể được vận dụng đúng khi được đặt trong toàn bộ hệ thống của phép biện chứng duy vật.</w:t>
       </w:r>
     </w:p>
     <w:p>
@@ -10414,7 +10334,7 @@
         <w:rPr>
           <w:rFonts w:ascii="Times New Roman" w:hAnsi="Times New Roman" w:eastAsia="Times New Roman" w:cs="Times New Roman"/>
         </w:rPr>
-        <w:t>Phân tích năm trường hợp của lịch sử hóa học (sự cháy, tính tuần hoàn của các nguyên tố, các thuyết acid – base, đồng phân và tính bất đối, động học enzyme) cho thấy nhận thức hóa học đã vận động đúng theo con đường mà phép biện chứng duy vật khái quát: từ hiện tượng đến bản chất, từ bản chất cấp thấp đến bản chất cấp cao; giả tượng được vượt qua bằng việc kiểm soát điều kiện biểu hiện; mâu thuẫn giữa lý thuyết và dữ kiện là động lực phát triển; và các lý thuyết sau phủ định các lý thuyết trước theo kiểu kế thừa. Trường hợp thalidomide cho thấy việc dừng lại ở một cấp độ bản chất chưa đầy đủ có thể dẫn đến những hậu quả thực tiễn nghiêm trọng.</w:t>
+        <w:t>Phân tích năm trường hợp của lịch sử hóa học (sự cháy, tính tuần hoàn của các nguyên tố, các thuyết acid – base, đồng phân và tính bất đối, động học enzyme) cho thấy nhận thức hóa học đã vận động phù hợp với con đường mà phép biện chứng duy vật khái quát: từ hiện tượng đến bản chất, từ bản chất cấp thấp đến bản chất cấp cao; giả tượng được vượt qua bằng việc kiểm soát điều kiện biểu hiện; mâu thuẫn giữa lý thuyết và dữ kiện là động lực phát triển; và các lý thuyết sau phủ định các lý thuyết trước theo lối phủ định biện chứng, có kế thừa. Trường hợp thalidomide cho thấy việc dừng lại ở một cấp độ bản chất chưa đầy đủ có thể dẫn đến những hậu quả thực tiễn nghiêm trọng.</w:t>
       </w:r>
     </w:p>
     <w:p>
@@ -10439,7 +10359,7 @@
         <w:rPr>
           <w:rFonts w:ascii="Times New Roman" w:hAnsi="Times New Roman" w:eastAsia="Times New Roman" w:cs="Times New Roman"/>
         </w:rPr>
-        <w:t xml:space="preserve"> và điểm số docking thuộc về hiện tượng, trong khi bản chất cần nhận thức là tương tác đặc hiệu giữa phân tử và đích sinh học cùng khả năng tương tác đó diễn ra trong cơ thể. Các dạng giả tượng phổ biến gồm ức chế do kết tập keo, hợp chất gây nhiễu đa phép thử, sự không tương đồng giữa enzyme mô hình và đích sinh học, tạp chất, và việc tuyệt đối hóa kết quả mô phỏng. Tỷ lệ tái lập thấp của dữ liệu tiền lâm sàng là biểu hiện ở quy mô lớn của việc đồng nhất hiện tượng với bản chất. Nguyên nhân chủ quan của các sai lệch này là phương pháp tư duy siêu hình, biểu hiện dưới hai dạng đối lập là chủ nghĩa kinh nghiệm hẹp hòi và chủ nghĩa giáo điều; bên cạnh đó là những điều kiện xã hội của hoạt động nghiên cứu.</w:t>
+        <w:t xml:space="preserve"> và điểm số docking thuộc về hiện tượng, trong khi bản chất cần nhận thức là tương tác đặc hiệu giữa phân tử và đích sinh học cùng khả năng tương tác đó diễn ra trong cơ thể. Các dạng giả tượng phổ biến gồm ức chế do kết tập keo, hợp chất gây nhiễu đa phép thử, sự không tương đồng giữa enzyme mô hình và đích sinh học, tạp chất, và việc tuyệt đối hóa kết quả mô phỏng. Tỷ lệ tái lập thấp của dữ liệu tiền lâm sàng là biểu hiện ở quy mô lớn của việc đồng nhất hiện tượng với bản chất. Nguyên nhân chủ quan của các sai lệch này là phương pháp tư duy siêu hình; xét theo quan hệ giữa lý luận và thực tiễn, nó biểu hiện dưới hai dạng đối lập là bệnh kinh nghiệm và bệnh giáo điều; bên cạnh đó là những điều kiện xã hội của hoạt động nghiên cứu.</w:t>
       </w:r>
     </w:p>
     <w:p>
@@ -10552,7 +10472,7 @@
         <w:rPr>
           <w:rFonts w:ascii="Times New Roman" w:hAnsi="Times New Roman" w:eastAsia="Times New Roman" w:cs="Times New Roman"/>
         </w:rPr>
-        <w:t>; các trường hợp lịch sử hóa học được chọn nhằm minh họa, chưa bao quát toàn bộ lịch sử của ngành; thực trạng công bố trong nước chưa được khảo sát định lượng. Việc mở rộng phân tích sang các phép thử trên tế bào, sang các cặp phạm trù khác như khả năng và hiện thực, và khảo sát có hệ thống các công bố về hoạt tính sinh học của hợp chất thiên nhiên ở Việt Nam là những hướng có thể tiếp tục. Ngoài ra, các nguyên tắc và quy trình được đề xuất cần được kiểm nghiệm thêm qua thực tiễn áp dụng trong các nhóm nghiên cứu, đúng với luận điểm thực tiễn là tiêu chuẩn của chân lý; bản thân quy trình này cũng là một tri thức tương đối, cần được bổ sung và điều chỉnh cùng với sự phát triển của nhận thức khoa học.</w:t>
+        <w:t>; các trường hợp lịch sử hóa học được chọn nhằm minh họa, chưa bao quát toàn bộ lịch sử của ngành; thực trạng công bố trong nước chưa được khảo sát định lượng. Việc mở rộng phân tích sang các phép thử trên tế bào, vận dụng sâu hơn các cặp phạm trù khác như nguyên nhân và kết quả, khả năng và hiện thực, và khảo sát có hệ thống các công bố về hoạt tính sinh học của hợp chất thiên nhiên ở Việt Nam là những hướng có thể tiếp tục. Ngoài ra, các nguyên tắc và quy trình được đề xuất cần được kiểm nghiệm thêm qua thực tiễn áp dụng trong các nhóm nghiên cứu, đúng với luận điểm thực tiễn là tiêu chuẩn của chân lý; bản thân quy trình này cũng là một tri thức tương đối, cần được bổ sung và điều chỉnh cùng với sự phát triển của nhận thức khoa học.</w:t>
       </w:r>
     </w:p>
     <w:p>

</xml_diff>